<commit_message>
Add: Point of Sale view now show items in product catalog according to items existing in Inventory Manager view. Update: MainDashBoardform now has responsiveness, clock, current shift and fixed alignments.
</commit_message>
<xml_diff>
--- a/reports/524H0015_524H0012_524H0134.docx
+++ b/reports/524H0015_524H0012_524H0134.docx
@@ -6401,15 +6401,6 @@
       </w:r>
       <w:bookmarkEnd w:id="2"/>
     </w:p>
-    <w:p>
-      <w:pPr>
-        <w:spacing w:after="200" w:line="276" w:lineRule="auto"/>
-        <w:rPr>
-          <w:sz w:val="26"/>
-          <w:szCs w:val="26"/>
-        </w:rPr>
-      </w:pPr>
-    </w:p>
     <w:tbl>
       <w:tblPr>
         <w:tblStyle w:val="TableGrid"/>
@@ -6446,7 +6437,7 @@
                 <w:sz w:val="26"/>
                 <w:szCs w:val="26"/>
               </w:rPr>
-              <w:t>AES</w:t>
+              <w:t>CRUD</w:t>
             </w:r>
           </w:p>
         </w:tc>
@@ -6467,7 +6458,7 @@
                 <w:sz w:val="26"/>
                 <w:szCs w:val="26"/>
               </w:rPr>
-              <w:t>Advanced Encryption Standard</w:t>
+              <w:t>Create, Read, Update, Delete</w:t>
             </w:r>
           </w:p>
         </w:tc>
@@ -6490,7 +6481,7 @@
                 <w:sz w:val="26"/>
                 <w:szCs w:val="26"/>
               </w:rPr>
-              <w:t>CPU</w:t>
+              <w:t>MVC</w:t>
             </w:r>
           </w:p>
         </w:tc>
@@ -6511,7 +6502,7 @@
                 <w:sz w:val="26"/>
                 <w:szCs w:val="26"/>
               </w:rPr>
-              <w:t>Central Processing Unit</w:t>
+              <w:t>Model-View-Controller</w:t>
             </w:r>
           </w:p>
         </w:tc>
@@ -6534,7 +6525,7 @@
                 <w:sz w:val="26"/>
                 <w:szCs w:val="26"/>
               </w:rPr>
-              <w:t>CS</w:t>
+              <w:t>POS</w:t>
             </w:r>
           </w:p>
         </w:tc>
@@ -6555,7 +6546,7 @@
                 <w:sz w:val="26"/>
                 <w:szCs w:val="26"/>
               </w:rPr>
-              <w:t>Computer Science</w:t>
+              <w:t>Point of Sale</w:t>
             </w:r>
           </w:p>
         </w:tc>
@@ -6578,7 +6569,7 @@
                 <w:sz w:val="26"/>
                 <w:szCs w:val="26"/>
               </w:rPr>
-              <w:t>DNF</w:t>
+              <w:t>UI/UX</w:t>
             </w:r>
           </w:p>
         </w:tc>
@@ -6600,365 +6591,7 @@
                 <w:sz w:val="26"/>
                 <w:szCs w:val="26"/>
               </w:rPr>
-              <w:t>Disjunctive Normal Form</w:t>
-            </w:r>
-          </w:p>
-        </w:tc>
-      </w:tr>
-      <w:tr>
-        <w:tc>
-          <w:tcPr>
-            <w:tcW w:w="2911" w:type="dxa"/>
-          </w:tcPr>
-          <w:p>
-            <w:pPr>
-              <w:spacing w:line="360" w:lineRule="auto"/>
-              <w:rPr>
-                <w:sz w:val="26"/>
-                <w:szCs w:val="26"/>
-              </w:rPr>
-            </w:pPr>
-            <w:r>
-              <w:rPr>
-                <w:sz w:val="26"/>
-                <w:szCs w:val="26"/>
-              </w:rPr>
-              <w:t>GIL</w:t>
-            </w:r>
-          </w:p>
-        </w:tc>
-        <w:tc>
-          <w:tcPr>
-            <w:tcW w:w="6092" w:type="dxa"/>
-          </w:tcPr>
-          <w:p>
-            <w:pPr>
-              <w:spacing w:line="360" w:lineRule="auto"/>
-              <w:rPr>
-                <w:sz w:val="26"/>
-                <w:szCs w:val="26"/>
-              </w:rPr>
-            </w:pPr>
-            <w:r>
-              <w:rPr>
-                <w:sz w:val="26"/>
-                <w:szCs w:val="26"/>
-              </w:rPr>
-              <w:t>Global Interpreter Lock</w:t>
-            </w:r>
-          </w:p>
-        </w:tc>
-      </w:tr>
-      <w:tr>
-        <w:tc>
-          <w:tcPr>
-            <w:tcW w:w="2911" w:type="dxa"/>
-          </w:tcPr>
-          <w:p>
-            <w:pPr>
-              <w:spacing w:line="360" w:lineRule="auto"/>
-              <w:rPr>
-                <w:sz w:val="26"/>
-                <w:szCs w:val="26"/>
-                <w:lang w:val="vi-VN"/>
-              </w:rPr>
-            </w:pPr>
-            <w:r>
-              <w:rPr>
-                <w:sz w:val="26"/>
-                <w:szCs w:val="26"/>
-              </w:rPr>
-              <w:t>HTTPS</w:t>
-            </w:r>
-          </w:p>
-        </w:tc>
-        <w:tc>
-          <w:tcPr>
-            <w:tcW w:w="6092" w:type="dxa"/>
-          </w:tcPr>
-          <w:p>
-            <w:pPr>
-              <w:spacing w:line="360" w:lineRule="auto"/>
-              <w:rPr>
-                <w:sz w:val="26"/>
-                <w:szCs w:val="26"/>
-                <w:lang w:val="vi-VN"/>
-              </w:rPr>
-            </w:pPr>
-            <w:r>
-              <w:rPr>
-                <w:sz w:val="26"/>
-                <w:szCs w:val="26"/>
-              </w:rPr>
-              <w:t>Hypertext Transfer Protocol Secure</w:t>
-            </w:r>
-          </w:p>
-        </w:tc>
-      </w:tr>
-      <w:tr>
-        <w:tc>
-          <w:tcPr>
-            <w:tcW w:w="2911" w:type="dxa"/>
-          </w:tcPr>
-          <w:p>
-            <w:pPr>
-              <w:spacing w:line="360" w:lineRule="auto"/>
-              <w:rPr>
-                <w:sz w:val="26"/>
-                <w:szCs w:val="26"/>
-                <w:lang w:val="vi-VN"/>
-              </w:rPr>
-            </w:pPr>
-            <w:r>
-              <w:rPr>
-                <w:sz w:val="26"/>
-                <w:szCs w:val="26"/>
-              </w:rPr>
-              <w:t>LIFO</w:t>
-            </w:r>
-          </w:p>
-        </w:tc>
-        <w:tc>
-          <w:tcPr>
-            <w:tcW w:w="6092" w:type="dxa"/>
-          </w:tcPr>
-          <w:p>
-            <w:pPr>
-              <w:spacing w:line="360" w:lineRule="auto"/>
-              <w:rPr>
-                <w:sz w:val="26"/>
-                <w:szCs w:val="26"/>
-                <w:lang w:val="vi-VN"/>
-              </w:rPr>
-            </w:pPr>
-            <w:r>
-              <w:rPr>
-                <w:sz w:val="26"/>
-                <w:szCs w:val="26"/>
-              </w:rPr>
-              <w:t>Last-In-First-Out</w:t>
-            </w:r>
-          </w:p>
-        </w:tc>
-      </w:tr>
-      <w:tr>
-        <w:tc>
-          <w:tcPr>
-            <w:tcW w:w="2911" w:type="dxa"/>
-          </w:tcPr>
-          <w:p>
-            <w:pPr>
-              <w:spacing w:line="360" w:lineRule="auto"/>
-              <w:rPr>
-                <w:sz w:val="26"/>
-                <w:szCs w:val="26"/>
-              </w:rPr>
-            </w:pPr>
-            <w:proofErr w:type="spellStart"/>
-            <w:r>
-              <w:rPr>
-                <w:sz w:val="26"/>
-                <w:szCs w:val="26"/>
-              </w:rPr>
-              <w:t>NaN</w:t>
-            </w:r>
-            <w:proofErr w:type="spellEnd"/>
-          </w:p>
-        </w:tc>
-        <w:tc>
-          <w:tcPr>
-            <w:tcW w:w="6092" w:type="dxa"/>
-          </w:tcPr>
-          <w:p>
-            <w:pPr>
-              <w:spacing w:line="360" w:lineRule="auto"/>
-              <w:rPr>
-                <w:sz w:val="26"/>
-                <w:szCs w:val="26"/>
-              </w:rPr>
-            </w:pPr>
-            <w:r>
-              <w:rPr>
-                <w:sz w:val="26"/>
-                <w:szCs w:val="26"/>
-              </w:rPr>
-              <w:t>Not a Number</w:t>
-            </w:r>
-          </w:p>
-        </w:tc>
-      </w:tr>
-      <w:tr>
-        <w:tc>
-          <w:tcPr>
-            <w:tcW w:w="2911" w:type="dxa"/>
-          </w:tcPr>
-          <w:p>
-            <w:pPr>
-              <w:spacing w:line="360" w:lineRule="auto"/>
-              <w:rPr>
-                <w:sz w:val="26"/>
-                <w:szCs w:val="26"/>
-              </w:rPr>
-            </w:pPr>
-            <w:r>
-              <w:rPr>
-                <w:sz w:val="26"/>
-                <w:szCs w:val="26"/>
-              </w:rPr>
-              <w:t>OAEP</w:t>
-            </w:r>
-          </w:p>
-        </w:tc>
-        <w:tc>
-          <w:tcPr>
-            <w:tcW w:w="6092" w:type="dxa"/>
-          </w:tcPr>
-          <w:p>
-            <w:pPr>
-              <w:spacing w:line="360" w:lineRule="auto"/>
-              <w:rPr>
-                <w:sz w:val="26"/>
-                <w:szCs w:val="26"/>
-              </w:rPr>
-            </w:pPr>
-            <w:r>
-              <w:rPr>
-                <w:sz w:val="26"/>
-                <w:szCs w:val="26"/>
-              </w:rPr>
-              <w:t>Optimal Asymmetric Encryption Padding</w:t>
-            </w:r>
-          </w:p>
-        </w:tc>
-      </w:tr>
-      <w:tr>
-        <w:tc>
-          <w:tcPr>
-            <w:tcW w:w="2911" w:type="dxa"/>
-          </w:tcPr>
-          <w:p>
-            <w:pPr>
-              <w:spacing w:line="360" w:lineRule="auto"/>
-              <w:rPr>
-                <w:sz w:val="26"/>
-                <w:szCs w:val="26"/>
-              </w:rPr>
-            </w:pPr>
-            <w:r>
-              <w:rPr>
-                <w:sz w:val="26"/>
-                <w:szCs w:val="26"/>
-              </w:rPr>
-              <w:t>RPN</w:t>
-            </w:r>
-          </w:p>
-        </w:tc>
-        <w:tc>
-          <w:tcPr>
-            <w:tcW w:w="6092" w:type="dxa"/>
-          </w:tcPr>
-          <w:p>
-            <w:pPr>
-              <w:spacing w:line="360" w:lineRule="auto"/>
-              <w:rPr>
-                <w:sz w:val="26"/>
-                <w:szCs w:val="26"/>
-              </w:rPr>
-            </w:pPr>
-            <w:r>
-              <w:rPr>
-                <w:sz w:val="26"/>
-                <w:szCs w:val="26"/>
-              </w:rPr>
-              <w:t>Reverse Polish Notation</w:t>
-            </w:r>
-          </w:p>
-        </w:tc>
-      </w:tr>
-      <w:tr>
-        <w:tc>
-          <w:tcPr>
-            <w:tcW w:w="2911" w:type="dxa"/>
-          </w:tcPr>
-          <w:p>
-            <w:pPr>
-              <w:spacing w:line="360" w:lineRule="auto"/>
-              <w:rPr>
-                <w:sz w:val="26"/>
-                <w:szCs w:val="26"/>
-              </w:rPr>
-            </w:pPr>
-            <w:r>
-              <w:rPr>
-                <w:sz w:val="26"/>
-                <w:szCs w:val="26"/>
-              </w:rPr>
-              <w:t>RSA</w:t>
-            </w:r>
-          </w:p>
-        </w:tc>
-        <w:tc>
-          <w:tcPr>
-            <w:tcW w:w="6092" w:type="dxa"/>
-          </w:tcPr>
-          <w:p>
-            <w:pPr>
-              <w:spacing w:line="360" w:lineRule="auto"/>
-              <w:rPr>
-                <w:sz w:val="26"/>
-                <w:szCs w:val="26"/>
-              </w:rPr>
-            </w:pPr>
-            <w:r>
-              <w:rPr>
-                <w:sz w:val="26"/>
-                <w:szCs w:val="26"/>
-              </w:rPr>
-              <w:t>Rivest-Shamir-Adleman</w:t>
-            </w:r>
-          </w:p>
-        </w:tc>
-      </w:tr>
-      <w:tr>
-        <w:tc>
-          <w:tcPr>
-            <w:tcW w:w="2911" w:type="dxa"/>
-          </w:tcPr>
-          <w:p>
-            <w:pPr>
-              <w:spacing w:line="360" w:lineRule="auto"/>
-              <w:rPr>
-                <w:sz w:val="26"/>
-                <w:szCs w:val="26"/>
-              </w:rPr>
-            </w:pPr>
-            <w:r>
-              <w:rPr>
-                <w:sz w:val="26"/>
-                <w:szCs w:val="26"/>
-              </w:rPr>
-              <w:t>TLS</w:t>
-            </w:r>
-          </w:p>
-        </w:tc>
-        <w:tc>
-          <w:tcPr>
-            <w:tcW w:w="6092" w:type="dxa"/>
-          </w:tcPr>
-          <w:p>
-            <w:pPr>
-              <w:spacing w:line="360" w:lineRule="auto"/>
-              <w:rPr>
-                <w:sz w:val="26"/>
-                <w:szCs w:val="26"/>
-              </w:rPr>
-            </w:pPr>
-            <w:r>
-              <w:rPr>
-                <w:sz w:val="26"/>
-                <w:szCs w:val="26"/>
-              </w:rPr>
-              <w:t>Transport Layer Security</w:t>
+              <w:t>User Interface / User Experience</w:t>
             </w:r>
           </w:p>
         </w:tc>
@@ -7207,49 +6840,51 @@
     </w:p>
     <w:p>
       <w:pPr>
+        <w:spacing w:before="100" w:beforeAutospacing="1" w:after="100" w:afterAutospacing="1"/>
+        <w:rPr>
+          <w:rFonts w:eastAsia="Times New Roman" w:cs="Times New Roman"/>
+          <w:lang w:eastAsia="ko-KR"/>
+        </w:rPr>
+      </w:pPr>
+      <w:r>
+        <w:br w:type="page"/>
+      </w:r>
+    </w:p>
+    <w:p>
+      <w:pPr>
+        <w:pStyle w:val="Heading1"/>
+        <w:rPr>
+          <w:lang w:val="en-US"/>
+        </w:rPr>
+      </w:pPr>
+      <w:bookmarkStart w:id="7" w:name="_Toc229052389"/>
+      <w:r>
+        <w:rPr>
+          <w:lang w:val="en-US"/>
+        </w:rPr>
+        <w:lastRenderedPageBreak/>
+        <w:t>PROJECT MANAGEMENT PLAN</w:t>
+      </w:r>
+      <w:bookmarkEnd w:id="7"/>
+    </w:p>
+    <w:p>
+      <w:pPr>
         <w:pStyle w:val="Heading2"/>
-        <w:rPr>
-          <w:caps/>
-          <w:sz w:val="32"/>
-          <w:szCs w:val="32"/>
-        </w:rPr>
-      </w:pPr>
-      <w:bookmarkStart w:id="7" w:name="_Toc229052388"/>
+      </w:pPr>
+      <w:bookmarkStart w:id="8" w:name="_Toc229052390"/>
       <w:r>
         <w:rPr>
           <w:lang w:val="en-US"/>
         </w:rPr>
-        <w:t>T</w:t>
-      </w:r>
-      <w:r>
-        <w:t xml:space="preserve">erms, </w:t>
-      </w:r>
-      <w:r>
-        <w:rPr>
-          <w:lang w:val="en-US"/>
-        </w:rPr>
-        <w:t>A</w:t>
-      </w:r>
-      <w:r>
-        <w:t xml:space="preserve">cronyms, and </w:t>
-      </w:r>
-      <w:r>
-        <w:rPr>
-          <w:lang w:val="en-US"/>
-        </w:rPr>
-        <w:t>A</w:t>
-      </w:r>
-      <w:r>
-        <w:t>bbreviations</w:t>
-      </w:r>
-      <w:bookmarkEnd w:id="7"/>
-    </w:p>
-    <w:p>
-      <w:pPr>
-        <w:spacing w:before="100" w:beforeAutospacing="1" w:after="100" w:afterAutospacing="1"/>
-        <w:ind w:left="720"/>
-        <w:rPr>
-          <w:rFonts w:eastAsia="Times New Roman" w:cs="Times New Roman"/>
+        <w:t>Project Organization</w:t>
+      </w:r>
+      <w:bookmarkEnd w:id="8"/>
+    </w:p>
+    <w:p>
+      <w:pPr>
+        <w:pStyle w:val="ListParagraph"/>
+        <w:spacing w:line="360" w:lineRule="auto"/>
+        <w:rPr>
           <w:sz w:val="26"/>
           <w:szCs w:val="26"/>
           <w:lang w:eastAsia="ko-KR"/>
@@ -7257,243 +6892,198 @@
       </w:pPr>
       <w:r>
         <w:rPr>
-          <w:rFonts w:eastAsia="Times New Roman" w:hAnsi="Symbol" w:cs="Times New Roman"/>
-          <w:sz w:val="26"/>
-          <w:szCs w:val="26"/>
-          <w:lang w:eastAsia="ko-KR"/>
-        </w:rPr>
-        <w:t></w:t>
-      </w:r>
-      <w:r>
-        <w:rPr>
-          <w:rFonts w:eastAsia="Times New Roman" w:cs="Times New Roman"/>
-          <w:sz w:val="26"/>
-          <w:szCs w:val="26"/>
-          <w:lang w:eastAsia="ko-KR"/>
-        </w:rPr>
-        <w:t xml:space="preserve">  </w:t>
-      </w:r>
-      <w:r>
-        <w:rPr>
-          <w:rFonts w:eastAsia="Times New Roman" w:cs="Times New Roman"/>
           <w:b/>
           <w:bCs/>
           <w:sz w:val="26"/>
           <w:szCs w:val="26"/>
           <w:lang w:eastAsia="ko-KR"/>
         </w:rPr>
-        <w:t>CRUD:</w:t>
-      </w:r>
-      <w:r>
-        <w:rPr>
-          <w:rFonts w:eastAsia="Times New Roman" w:cs="Times New Roman"/>
+        <w:t>Project Manager:</w:t>
+      </w:r>
+      <w:r>
+        <w:rPr>
           <w:sz w:val="26"/>
           <w:szCs w:val="26"/>
           <w:lang w:eastAsia="ko-KR"/>
         </w:rPr>
-        <w:t xml:space="preserve"> Create, Read, Update, Delete.</w:t>
-      </w:r>
-    </w:p>
-    <w:p>
-      <w:pPr>
-        <w:spacing w:before="100" w:beforeAutospacing="1" w:after="100" w:afterAutospacing="1"/>
-        <w:ind w:left="720"/>
-        <w:rPr>
-          <w:rFonts w:eastAsia="Times New Roman" w:cs="Times New Roman"/>
+        <w:t xml:space="preserve"> </w:t>
+      </w:r>
+      <w:proofErr w:type="spellStart"/>
+      <w:r>
+        <w:rPr>
           <w:sz w:val="26"/>
           <w:szCs w:val="26"/>
           <w:lang w:eastAsia="ko-KR"/>
         </w:rPr>
-      </w:pPr>
-      <w:r>
-        <w:rPr>
-          <w:rFonts w:eastAsia="Times New Roman" w:hAnsi="Symbol" w:cs="Times New Roman"/>
+        <w:t>Trần</w:t>
+      </w:r>
+      <w:proofErr w:type="spellEnd"/>
+      <w:r>
+        <w:rPr>
           <w:sz w:val="26"/>
           <w:szCs w:val="26"/>
           <w:lang w:eastAsia="ko-KR"/>
         </w:rPr>
-        <w:t></w:t>
-      </w:r>
-      <w:r>
-        <w:rPr>
-          <w:rFonts w:eastAsia="Times New Roman" w:cs="Times New Roman"/>
+        <w:t xml:space="preserve"> Quang Duy – Responsible for overall project coordination and database design. </w:t>
+      </w:r>
+    </w:p>
+    <w:p>
+      <w:pPr>
+        <w:pStyle w:val="ListParagraph"/>
+        <w:spacing w:line="360" w:lineRule="auto"/>
+        <w:rPr>
           <w:sz w:val="26"/>
           <w:szCs w:val="26"/>
           <w:lang w:eastAsia="ko-KR"/>
         </w:rPr>
-        <w:t xml:space="preserve">  </w:t>
-      </w:r>
-      <w:r>
-        <w:rPr>
-          <w:rFonts w:eastAsia="Times New Roman" w:cs="Times New Roman"/>
+      </w:pPr>
+      <w:r>
+        <w:rPr>
           <w:b/>
           <w:bCs/>
           <w:sz w:val="26"/>
           <w:szCs w:val="26"/>
           <w:lang w:eastAsia="ko-KR"/>
         </w:rPr>
-        <w:t>MVC:</w:t>
-      </w:r>
-      <w:r>
-        <w:rPr>
-          <w:rFonts w:eastAsia="Times New Roman" w:cs="Times New Roman"/>
+        <w:t>Developer 1:</w:t>
+      </w:r>
+      <w:r>
+        <w:rPr>
           <w:sz w:val="26"/>
           <w:szCs w:val="26"/>
           <w:lang w:eastAsia="ko-KR"/>
         </w:rPr>
-        <w:t xml:space="preserve"> Model-View-Controller.</w:t>
-      </w:r>
-    </w:p>
-    <w:p>
-      <w:pPr>
-        <w:spacing w:before="100" w:beforeAutospacing="1" w:after="100" w:afterAutospacing="1"/>
-        <w:ind w:left="720"/>
-        <w:rPr>
-          <w:rFonts w:eastAsia="Times New Roman" w:cs="Times New Roman"/>
+        <w:t xml:space="preserve"> Lý </w:t>
+      </w:r>
+      <w:proofErr w:type="spellStart"/>
+      <w:r>
+        <w:rPr>
           <w:sz w:val="26"/>
           <w:szCs w:val="26"/>
           <w:lang w:eastAsia="ko-KR"/>
         </w:rPr>
-      </w:pPr>
-      <w:r>
-        <w:rPr>
-          <w:rFonts w:eastAsia="Times New Roman" w:hAnsi="Symbol" w:cs="Times New Roman"/>
+        <w:t>Tín</w:t>
+      </w:r>
+      <w:proofErr w:type="spellEnd"/>
+      <w:r>
+        <w:rPr>
           <w:sz w:val="26"/>
           <w:szCs w:val="26"/>
           <w:lang w:eastAsia="ko-KR"/>
         </w:rPr>
-        <w:t></w:t>
-      </w:r>
-      <w:r>
-        <w:rPr>
-          <w:rFonts w:eastAsia="Times New Roman" w:cs="Times New Roman"/>
+        <w:t xml:space="preserve"> </w:t>
+      </w:r>
+      <w:proofErr w:type="spellStart"/>
+      <w:r>
+        <w:rPr>
           <w:sz w:val="26"/>
           <w:szCs w:val="26"/>
           <w:lang w:eastAsia="ko-KR"/>
         </w:rPr>
-        <w:t xml:space="preserve">  </w:t>
-      </w:r>
-      <w:r>
-        <w:rPr>
-          <w:rFonts w:eastAsia="Times New Roman" w:cs="Times New Roman"/>
+        <w:t>Hòa</w:t>
+      </w:r>
+      <w:proofErr w:type="spellEnd"/>
+      <w:r>
+        <w:rPr>
+          <w:sz w:val="26"/>
+          <w:szCs w:val="26"/>
+          <w:lang w:eastAsia="ko-KR"/>
+        </w:rPr>
+        <w:t xml:space="preserve"> – Focused on controller logic and implementing business rules. </w:t>
+      </w:r>
+    </w:p>
+    <w:p>
+      <w:pPr>
+        <w:pStyle w:val="ListParagraph"/>
+        <w:spacing w:line="360" w:lineRule="auto"/>
+        <w:rPr>
+          <w:sz w:val="26"/>
+          <w:szCs w:val="26"/>
+          <w:lang w:eastAsia="ko-KR"/>
+        </w:rPr>
+      </w:pPr>
+      <w:r>
+        <w:rPr>
           <w:b/>
           <w:bCs/>
           <w:sz w:val="26"/>
           <w:szCs w:val="26"/>
           <w:lang w:eastAsia="ko-KR"/>
         </w:rPr>
-        <w:t>POS:</w:t>
-      </w:r>
-      <w:r>
-        <w:rPr>
-          <w:rFonts w:eastAsia="Times New Roman" w:cs="Times New Roman"/>
+        <w:t>Developer 2:</w:t>
+      </w:r>
+      <w:r>
+        <w:rPr>
           <w:sz w:val="26"/>
           <w:szCs w:val="26"/>
           <w:lang w:eastAsia="ko-KR"/>
         </w:rPr>
-        <w:t xml:space="preserve"> Point of Sale.</w:t>
-      </w:r>
-    </w:p>
-    <w:p>
-      <w:pPr>
-        <w:spacing w:before="100" w:beforeAutospacing="1" w:after="100" w:afterAutospacing="1"/>
-        <w:ind w:left="720"/>
-        <w:rPr>
-          <w:rFonts w:eastAsia="Times New Roman" w:cs="Times New Roman"/>
-          <w:lang w:eastAsia="ko-KR"/>
-        </w:rPr>
-      </w:pPr>
-      <w:r>
-        <w:rPr>
-          <w:rFonts w:eastAsia="Times New Roman" w:hAnsi="Symbol" w:cs="Times New Roman"/>
+        <w:t xml:space="preserve"> Hà </w:t>
+      </w:r>
+      <w:proofErr w:type="spellStart"/>
+      <w:r>
+        <w:rPr>
           <w:sz w:val="26"/>
           <w:szCs w:val="26"/>
           <w:lang w:eastAsia="ko-KR"/>
         </w:rPr>
-        <w:t></w:t>
-      </w:r>
-      <w:r>
-        <w:rPr>
-          <w:rFonts w:eastAsia="Times New Roman" w:cs="Times New Roman"/>
+        <w:t>Dư</w:t>
+      </w:r>
+      <w:proofErr w:type="spellEnd"/>
+      <w:r>
+        <w:rPr>
           <w:sz w:val="26"/>
           <w:szCs w:val="26"/>
           <w:lang w:eastAsia="ko-KR"/>
         </w:rPr>
-        <w:t xml:space="preserve">  </w:t>
-      </w:r>
-      <w:r>
-        <w:rPr>
-          <w:rFonts w:eastAsia="Times New Roman" w:cs="Times New Roman"/>
+        <w:t xml:space="preserve"> Tuấn – Focused on UI/UX design and frontend implementation. </w:t>
+      </w:r>
+    </w:p>
+    <w:p>
+      <w:pPr>
+        <w:pStyle w:val="ListParagraph"/>
+        <w:spacing w:line="360" w:lineRule="auto"/>
+        <w:rPr>
+          <w:sz w:val="26"/>
+          <w:szCs w:val="26"/>
+          <w:lang w:eastAsia="ko-KR"/>
+        </w:rPr>
+      </w:pPr>
+      <w:r>
+        <w:rPr>
           <w:b/>
           <w:bCs/>
           <w:sz w:val="26"/>
           <w:szCs w:val="26"/>
           <w:lang w:eastAsia="ko-KR"/>
         </w:rPr>
-        <w:t>UI/UX:</w:t>
-      </w:r>
-      <w:r>
-        <w:rPr>
-          <w:rFonts w:eastAsia="Times New Roman" w:cs="Times New Roman"/>
+        <w:t>Tester:</w:t>
+      </w:r>
+      <w:r>
+        <w:rPr>
           <w:sz w:val="26"/>
           <w:szCs w:val="26"/>
           <w:lang w:eastAsia="ko-KR"/>
         </w:rPr>
-        <w:t xml:space="preserve"> User Interface / User Experience.</w:t>
-      </w:r>
-      <w:r>
-        <w:br w:type="page"/>
-      </w:r>
-    </w:p>
-    <w:p>
-      <w:pPr>
-        <w:pStyle w:val="Heading1"/>
-        <w:rPr>
-          <w:lang w:val="en-US"/>
-        </w:rPr>
-      </w:pPr>
-      <w:bookmarkStart w:id="8" w:name="_Toc229052389"/>
-      <w:r>
-        <w:rPr>
-          <w:lang w:val="en-US"/>
-        </w:rPr>
-        <w:lastRenderedPageBreak/>
-        <w:t>PROJECT MANAGEMENT PLAN</w:t>
-      </w:r>
-      <w:bookmarkEnd w:id="8"/>
-    </w:p>
-    <w:p>
-      <w:pPr>
-        <w:pStyle w:val="Heading2"/>
-      </w:pPr>
-      <w:bookmarkStart w:id="9" w:name="_Toc229052390"/>
-      <w:r>
-        <w:rPr>
-          <w:lang w:val="en-US"/>
-        </w:rPr>
-        <w:t>Project Organization</w:t>
-      </w:r>
-      <w:bookmarkEnd w:id="9"/>
-    </w:p>
-    <w:p>
-      <w:pPr>
-        <w:pStyle w:val="ListParagraph"/>
-        <w:spacing w:line="360" w:lineRule="auto"/>
+        <w:t xml:space="preserve"> </w:t>
+      </w:r>
+      <w:proofErr w:type="spellStart"/>
+      <w:r>
         <w:rPr>
           <w:sz w:val="26"/>
           <w:szCs w:val="26"/>
           <w:lang w:eastAsia="ko-KR"/>
         </w:rPr>
-      </w:pPr>
-      <w:r>
-        <w:rPr>
-          <w:b/>
-          <w:bCs/>
+        <w:t>Trần</w:t>
+      </w:r>
+      <w:proofErr w:type="spellEnd"/>
+      <w:r>
+        <w:rPr>
           <w:sz w:val="26"/>
           <w:szCs w:val="26"/>
           <w:lang w:eastAsia="ko-KR"/>
         </w:rPr>
-        <w:t>Project Manager:</w:t>
+        <w:t xml:space="preserve"> Quang Duy</w:t>
       </w:r>
       <w:r>
         <w:rPr>
@@ -7501,191 +7091,6 @@
           <w:szCs w:val="26"/>
           <w:lang w:eastAsia="ko-KR"/>
         </w:rPr>
-        <w:t xml:space="preserve"> </w:t>
-      </w:r>
-      <w:proofErr w:type="spellStart"/>
-      <w:r>
-        <w:rPr>
-          <w:sz w:val="26"/>
-          <w:szCs w:val="26"/>
-          <w:lang w:eastAsia="ko-KR"/>
-        </w:rPr>
-        <w:t>Trần</w:t>
-      </w:r>
-      <w:proofErr w:type="spellEnd"/>
-      <w:r>
-        <w:rPr>
-          <w:sz w:val="26"/>
-          <w:szCs w:val="26"/>
-          <w:lang w:eastAsia="ko-KR"/>
-        </w:rPr>
-        <w:t xml:space="preserve"> Quang Duy – Responsible for overall project coordination and database design. </w:t>
-      </w:r>
-    </w:p>
-    <w:p>
-      <w:pPr>
-        <w:pStyle w:val="ListParagraph"/>
-        <w:spacing w:line="360" w:lineRule="auto"/>
-        <w:rPr>
-          <w:sz w:val="26"/>
-          <w:szCs w:val="26"/>
-          <w:lang w:eastAsia="ko-KR"/>
-        </w:rPr>
-      </w:pPr>
-      <w:r>
-        <w:rPr>
-          <w:b/>
-          <w:bCs/>
-          <w:sz w:val="26"/>
-          <w:szCs w:val="26"/>
-          <w:lang w:eastAsia="ko-KR"/>
-        </w:rPr>
-        <w:t>Developer 1:</w:t>
-      </w:r>
-      <w:r>
-        <w:rPr>
-          <w:sz w:val="26"/>
-          <w:szCs w:val="26"/>
-          <w:lang w:eastAsia="ko-KR"/>
-        </w:rPr>
-        <w:t xml:space="preserve"> Lý </w:t>
-      </w:r>
-      <w:proofErr w:type="spellStart"/>
-      <w:r>
-        <w:rPr>
-          <w:sz w:val="26"/>
-          <w:szCs w:val="26"/>
-          <w:lang w:eastAsia="ko-KR"/>
-        </w:rPr>
-        <w:t>Tín</w:t>
-      </w:r>
-      <w:proofErr w:type="spellEnd"/>
-      <w:r>
-        <w:rPr>
-          <w:sz w:val="26"/>
-          <w:szCs w:val="26"/>
-          <w:lang w:eastAsia="ko-KR"/>
-        </w:rPr>
-        <w:t xml:space="preserve"> </w:t>
-      </w:r>
-      <w:proofErr w:type="spellStart"/>
-      <w:r>
-        <w:rPr>
-          <w:sz w:val="26"/>
-          <w:szCs w:val="26"/>
-          <w:lang w:eastAsia="ko-KR"/>
-        </w:rPr>
-        <w:t>Hòa</w:t>
-      </w:r>
-      <w:proofErr w:type="spellEnd"/>
-      <w:r>
-        <w:rPr>
-          <w:sz w:val="26"/>
-          <w:szCs w:val="26"/>
-          <w:lang w:eastAsia="ko-KR"/>
-        </w:rPr>
-        <w:t xml:space="preserve"> – Focused on controller logic and implementing business rules. </w:t>
-      </w:r>
-    </w:p>
-    <w:p>
-      <w:pPr>
-        <w:pStyle w:val="ListParagraph"/>
-        <w:spacing w:line="360" w:lineRule="auto"/>
-        <w:rPr>
-          <w:sz w:val="26"/>
-          <w:szCs w:val="26"/>
-          <w:lang w:eastAsia="ko-KR"/>
-        </w:rPr>
-      </w:pPr>
-      <w:r>
-        <w:rPr>
-          <w:b/>
-          <w:bCs/>
-          <w:sz w:val="26"/>
-          <w:szCs w:val="26"/>
-          <w:lang w:eastAsia="ko-KR"/>
-        </w:rPr>
-        <w:t>Developer 2:</w:t>
-      </w:r>
-      <w:r>
-        <w:rPr>
-          <w:sz w:val="26"/>
-          <w:szCs w:val="26"/>
-          <w:lang w:eastAsia="ko-KR"/>
-        </w:rPr>
-        <w:t xml:space="preserve"> Hà </w:t>
-      </w:r>
-      <w:proofErr w:type="spellStart"/>
-      <w:r>
-        <w:rPr>
-          <w:sz w:val="26"/>
-          <w:szCs w:val="26"/>
-          <w:lang w:eastAsia="ko-KR"/>
-        </w:rPr>
-        <w:t>Dư</w:t>
-      </w:r>
-      <w:proofErr w:type="spellEnd"/>
-      <w:r>
-        <w:rPr>
-          <w:sz w:val="26"/>
-          <w:szCs w:val="26"/>
-          <w:lang w:eastAsia="ko-KR"/>
-        </w:rPr>
-        <w:t xml:space="preserve"> Tuấn – Focused on UI/UX design and frontend implementation. </w:t>
-      </w:r>
-    </w:p>
-    <w:p>
-      <w:pPr>
-        <w:pStyle w:val="ListParagraph"/>
-        <w:spacing w:line="360" w:lineRule="auto"/>
-        <w:rPr>
-          <w:sz w:val="26"/>
-          <w:szCs w:val="26"/>
-          <w:lang w:eastAsia="ko-KR"/>
-        </w:rPr>
-      </w:pPr>
-      <w:r>
-        <w:rPr>
-          <w:b/>
-          <w:bCs/>
-          <w:sz w:val="26"/>
-          <w:szCs w:val="26"/>
-          <w:lang w:eastAsia="ko-KR"/>
-        </w:rPr>
-        <w:t>Tester:</w:t>
-      </w:r>
-      <w:r>
-        <w:rPr>
-          <w:sz w:val="26"/>
-          <w:szCs w:val="26"/>
-          <w:lang w:eastAsia="ko-KR"/>
-        </w:rPr>
-        <w:t xml:space="preserve"> </w:t>
-      </w:r>
-      <w:proofErr w:type="spellStart"/>
-      <w:r>
-        <w:rPr>
-          <w:sz w:val="26"/>
-          <w:szCs w:val="26"/>
-          <w:lang w:eastAsia="ko-KR"/>
-        </w:rPr>
-        <w:t>Trần</w:t>
-      </w:r>
-      <w:proofErr w:type="spellEnd"/>
-      <w:r>
-        <w:rPr>
-          <w:sz w:val="26"/>
-          <w:szCs w:val="26"/>
-          <w:lang w:eastAsia="ko-KR"/>
-        </w:rPr>
-        <w:t xml:space="preserve"> Quang Duy</w:t>
-      </w:r>
-      <w:r>
-        <w:rPr>
-          <w:sz w:val="26"/>
-          <w:szCs w:val="26"/>
-          <w:lang w:eastAsia="ko-KR"/>
-        </w:rPr>
         <w:t xml:space="preserve"> – Responsible for test case creation and unit testing.</w:t>
       </w:r>
     </w:p>
@@ -7702,43 +7107,43 @@
           <w:lang w:val="en-US"/>
         </w:rPr>
       </w:pPr>
-      <w:bookmarkStart w:id="10" w:name="_Toc229052391"/>
+      <w:bookmarkStart w:id="9" w:name="_Toc229052391"/>
       <w:r>
         <w:rPr>
           <w:lang w:val="en-US"/>
         </w:rPr>
         <w:t>Lifecycle Model Used</w:t>
       </w:r>
+      <w:bookmarkEnd w:id="9"/>
+    </w:p>
+    <w:p>
+      <w:pPr>
+        <w:pStyle w:val="Nidungvnbn"/>
+      </w:pPr>
+      <w:r>
+        <w:t>The team strictly follows the Waterfall model. This approach ensures that each phase of the software development lifecycle—from initial requirements gathering to final testing—is thoroughly completed and documented before the team transitions to the next phase.</w:t>
+      </w:r>
+    </w:p>
+    <w:p>
+      <w:pPr>
+        <w:pStyle w:val="Nidungvnbn"/>
+      </w:pPr>
+    </w:p>
+    <w:p>
+      <w:pPr>
+        <w:pStyle w:val="Heading2"/>
+        <w:rPr>
+          <w:lang w:val="en-US"/>
+        </w:rPr>
+      </w:pPr>
+      <w:bookmarkStart w:id="10" w:name="_Toc229052392"/>
+      <w:r>
+        <w:rPr>
+          <w:lang w:val="en-US"/>
+        </w:rPr>
+        <w:t>Risk Analysis</w:t>
+      </w:r>
       <w:bookmarkEnd w:id="10"/>
-    </w:p>
-    <w:p>
-      <w:pPr>
-        <w:pStyle w:val="Nidungvnbn"/>
-      </w:pPr>
-      <w:r>
-        <w:t>The team strictly follows the Waterfall model. This approach ensures that each phase of the software development lifecycle—from initial requirements gathering to final testing—is thoroughly completed and documented before the team transitions to the next phase.</w:t>
-      </w:r>
-    </w:p>
-    <w:p>
-      <w:pPr>
-        <w:pStyle w:val="Nidungvnbn"/>
-      </w:pPr>
-    </w:p>
-    <w:p>
-      <w:pPr>
-        <w:pStyle w:val="Heading2"/>
-        <w:rPr>
-          <w:lang w:val="en-US"/>
-        </w:rPr>
-      </w:pPr>
-      <w:bookmarkStart w:id="11" w:name="_Toc229052392"/>
-      <w:r>
-        <w:rPr>
-          <w:lang w:val="en-US"/>
-        </w:rPr>
-        <w:t>Risk Analysis</w:t>
-      </w:r>
-      <w:bookmarkEnd w:id="11"/>
     </w:p>
     <w:p>
       <w:pPr>
@@ -7889,7 +7294,7 @@
           <w:lang w:val="en-US"/>
         </w:rPr>
       </w:pPr>
-      <w:bookmarkStart w:id="12" w:name="_Toc229052393"/>
+      <w:bookmarkStart w:id="11" w:name="_Toc229052393"/>
       <w:r>
         <w:rPr>
           <w:lang w:val="en-US"/>
@@ -7897,7 +7302,7 @@
         <w:lastRenderedPageBreak/>
         <w:t>Hardware and Software  Resource Requirements</w:t>
       </w:r>
-      <w:bookmarkEnd w:id="12"/>
+      <w:bookmarkEnd w:id="11"/>
     </w:p>
     <w:p>
       <w:pPr>
@@ -8060,14 +7465,14 @@
           <w:szCs w:val="32"/>
         </w:rPr>
       </w:pPr>
-      <w:bookmarkStart w:id="13" w:name="_Toc229052394"/>
+      <w:bookmarkStart w:id="12" w:name="_Toc229052394"/>
       <w:r>
         <w:rPr>
           <w:lang w:val="en-US"/>
         </w:rPr>
         <w:t>Deliverables and Schedule</w:t>
       </w:r>
-      <w:bookmarkEnd w:id="13"/>
+      <w:bookmarkEnd w:id="12"/>
     </w:p>
     <w:p>
       <w:pPr>
@@ -8101,11 +7506,11 @@
       <w:pPr>
         <w:pStyle w:val="Heading2"/>
       </w:pPr>
-      <w:bookmarkStart w:id="14" w:name="_Toc229052395"/>
+      <w:bookmarkStart w:id="13" w:name="_Toc229052395"/>
       <w:r>
         <w:t>Monitoring, Reporting, and Controlling Mechanisms</w:t>
       </w:r>
-      <w:bookmarkEnd w:id="14"/>
+      <w:bookmarkEnd w:id="13"/>
     </w:p>
     <w:p>
       <w:pPr>
@@ -8137,14 +7542,14 @@
           <w:szCs w:val="32"/>
         </w:rPr>
       </w:pPr>
-      <w:bookmarkStart w:id="15" w:name="_Toc229052396"/>
+      <w:bookmarkStart w:id="14" w:name="_Toc229052396"/>
       <w:r>
         <w:rPr>
           <w:lang w:val="en-US"/>
         </w:rPr>
         <w:t>Professional Standards</w:t>
       </w:r>
-      <w:bookmarkEnd w:id="15"/>
+      <w:bookmarkEnd w:id="14"/>
     </w:p>
     <w:p>
       <w:pPr>
@@ -8178,11 +7583,11 @@
       <w:r>
         <w:t xml:space="preserve"> </w:t>
       </w:r>
-      <w:bookmarkStart w:id="16" w:name="_Toc229052397"/>
+      <w:bookmarkStart w:id="15" w:name="_Toc229052397"/>
       <w:r>
         <w:t>Evidence of Configuration Management</w:t>
       </w:r>
-      <w:bookmarkEnd w:id="16"/>
+      <w:bookmarkEnd w:id="15"/>
       <w:r>
         <w:rPr>
           <w:lang w:val="en-US"/>
@@ -8216,11 +7621,11 @@
       <w:pPr>
         <w:pStyle w:val="Heading2"/>
       </w:pPr>
-      <w:bookmarkStart w:id="17" w:name="_Toc229052398"/>
+      <w:bookmarkStart w:id="16" w:name="_Toc229052398"/>
       <w:r>
         <w:t>Impact of the project on individuals and organizations</w:t>
       </w:r>
-      <w:bookmarkEnd w:id="17"/>
+      <w:bookmarkEnd w:id="16"/>
     </w:p>
     <w:p>
       <w:pPr>
@@ -8246,7 +7651,7 @@
       <w:pPr>
         <w:pStyle w:val="Heading1"/>
       </w:pPr>
-      <w:bookmarkStart w:id="18" w:name="_Toc229052399"/>
+      <w:bookmarkStart w:id="17" w:name="_Toc229052399"/>
       <w:r>
         <w:rPr>
           <w:lang w:val="en-US"/>
@@ -8254,26 +7659,26 @@
         <w:lastRenderedPageBreak/>
         <w:t>REQUIREMENT SPECIFICATION</w:t>
       </w:r>
+      <w:bookmarkEnd w:id="17"/>
+    </w:p>
+    <w:p>
+      <w:pPr>
+        <w:pStyle w:val="Heading2"/>
+      </w:pPr>
+      <w:bookmarkStart w:id="18" w:name="_Toc229052400"/>
+      <w:r>
+        <w:t xml:space="preserve">Stakeholders for the </w:t>
+      </w:r>
+      <w:r>
+        <w:rPr>
+          <w:lang w:val="en-US"/>
+        </w:rPr>
+        <w:t>S</w:t>
+      </w:r>
+      <w:r>
+        <w:t>ystem</w:t>
+      </w:r>
       <w:bookmarkEnd w:id="18"/>
-    </w:p>
-    <w:p>
-      <w:pPr>
-        <w:pStyle w:val="Heading2"/>
-      </w:pPr>
-      <w:bookmarkStart w:id="19" w:name="_Toc229052400"/>
-      <w:r>
-        <w:t xml:space="preserve">Stakeholders for the </w:t>
-      </w:r>
-      <w:r>
-        <w:rPr>
-          <w:lang w:val="en-US"/>
-        </w:rPr>
-        <w:t>S</w:t>
-      </w:r>
-      <w:r>
-        <w:t>ystem</w:t>
-      </w:r>
-      <w:bookmarkEnd w:id="19"/>
     </w:p>
     <w:p>
       <w:pPr>
@@ -8376,24 +7781,24 @@
           <w:lang w:val="en-US"/>
         </w:rPr>
       </w:pPr>
-      <w:bookmarkStart w:id="20" w:name="_Toc229052401"/>
+      <w:bookmarkStart w:id="19" w:name="_Toc229052401"/>
       <w:r>
         <w:rPr>
           <w:lang w:val="en-US"/>
         </w:rPr>
         <w:t>Use Case Modelling</w:t>
       </w:r>
+      <w:bookmarkEnd w:id="19"/>
+    </w:p>
+    <w:p>
+      <w:pPr>
+        <w:pStyle w:val="Heading3"/>
+      </w:pPr>
+      <w:bookmarkStart w:id="20" w:name="_Toc229052402"/>
+      <w:r>
+        <w:t>Graphical Use Case Modelling</w:t>
+      </w:r>
       <w:bookmarkEnd w:id="20"/>
-    </w:p>
-    <w:p>
-      <w:pPr>
-        <w:pStyle w:val="Heading3"/>
-      </w:pPr>
-      <w:bookmarkStart w:id="21" w:name="_Toc229052402"/>
-      <w:r>
-        <w:t>Graphical Use Case Modelling</w:t>
-      </w:r>
-      <w:bookmarkEnd w:id="21"/>
     </w:p>
     <w:p>
       <w:pPr>
@@ -8459,7 +7864,7 @@
       <w:pPr>
         <w:pStyle w:val="Caption"/>
       </w:pPr>
-      <w:bookmarkStart w:id="22" w:name="_Toc228885755"/>
+      <w:bookmarkStart w:id="21" w:name="_Toc228885755"/>
       <w:r>
         <w:t xml:space="preserve">Figure </w:t>
       </w:r>
@@ -8485,22 +7890,22 @@
       <w:r>
         <w:t>. Use Case Diagram</w:t>
       </w:r>
+      <w:bookmarkEnd w:id="21"/>
+    </w:p>
+    <w:p>
+      <w:pPr>
+        <w:pStyle w:val="Nidungvnbn"/>
+      </w:pPr>
+    </w:p>
+    <w:p>
+      <w:pPr>
+        <w:pStyle w:val="Heading3"/>
+      </w:pPr>
+      <w:bookmarkStart w:id="22" w:name="_Toc229052403"/>
+      <w:r>
+        <w:t>Textual Description for each Use Case</w:t>
+      </w:r>
       <w:bookmarkEnd w:id="22"/>
-    </w:p>
-    <w:p>
-      <w:pPr>
-        <w:pStyle w:val="Nidungvnbn"/>
-      </w:pPr>
-    </w:p>
-    <w:p>
-      <w:pPr>
-        <w:pStyle w:val="Heading3"/>
-      </w:pPr>
-      <w:bookmarkStart w:id="23" w:name="_Toc229052403"/>
-      <w:r>
-        <w:t>Textual Description for each Use Case</w:t>
-      </w:r>
-      <w:bookmarkEnd w:id="23"/>
     </w:p>
     <w:p>
       <w:pPr>
@@ -9350,14 +8755,14 @@
       <w:pPr>
         <w:pStyle w:val="Heading2"/>
       </w:pPr>
-      <w:bookmarkStart w:id="24" w:name="_Toc229052404"/>
+      <w:bookmarkStart w:id="23" w:name="_Toc229052404"/>
       <w:r>
         <w:rPr>
           <w:lang w:val="en-US"/>
         </w:rPr>
         <w:t>Functional Requirements</w:t>
       </w:r>
-      <w:bookmarkEnd w:id="24"/>
+      <w:bookmarkEnd w:id="23"/>
     </w:p>
     <w:p>
       <w:pPr>
@@ -9563,7 +8968,7 @@
       <w:pPr>
         <w:pStyle w:val="Heading2"/>
       </w:pPr>
-      <w:bookmarkStart w:id="25" w:name="_Toc229052405"/>
+      <w:bookmarkStart w:id="24" w:name="_Toc229052405"/>
       <w:r>
         <w:rPr>
           <w:lang w:val="en-US"/>
@@ -9576,7 +8981,7 @@
         </w:rPr>
         <w:t>on-functional Requirements</w:t>
       </w:r>
-      <w:bookmarkEnd w:id="25"/>
+      <w:bookmarkEnd w:id="24"/>
     </w:p>
     <w:p>
       <w:pPr>
@@ -9710,42 +9115,42 @@
       <w:pPr>
         <w:pStyle w:val="Heading1"/>
       </w:pPr>
-      <w:bookmarkStart w:id="26" w:name="_Toc229052406"/>
+      <w:bookmarkStart w:id="25" w:name="_Toc229052406"/>
       <w:r>
         <w:rPr>
           <w:lang w:val="en-US"/>
         </w:rPr>
         <w:t>ARCHITECTURE</w:t>
       </w:r>
+      <w:bookmarkEnd w:id="25"/>
+    </w:p>
+    <w:p>
+      <w:pPr>
+        <w:pStyle w:val="Heading2"/>
+      </w:pPr>
+      <w:bookmarkStart w:id="26" w:name="_Toc229052407"/>
+      <w:r>
+        <w:t xml:space="preserve">Architectural </w:t>
+      </w:r>
+      <w:r>
+        <w:rPr>
+          <w:lang w:val="en-US"/>
+        </w:rPr>
+        <w:t>S</w:t>
+      </w:r>
+      <w:r>
+        <w:t xml:space="preserve">tyle(s) </w:t>
+      </w:r>
+      <w:r>
+        <w:rPr>
+          <w:lang w:val="en-US"/>
+        </w:rPr>
+        <w:t>U</w:t>
+      </w:r>
+      <w:r>
+        <w:t>sed</w:t>
+      </w:r>
       <w:bookmarkEnd w:id="26"/>
-    </w:p>
-    <w:p>
-      <w:pPr>
-        <w:pStyle w:val="Heading2"/>
-      </w:pPr>
-      <w:bookmarkStart w:id="27" w:name="_Toc229052407"/>
-      <w:r>
-        <w:t xml:space="preserve">Architectural </w:t>
-      </w:r>
-      <w:r>
-        <w:rPr>
-          <w:lang w:val="en-US"/>
-        </w:rPr>
-        <w:t>S</w:t>
-      </w:r>
-      <w:r>
-        <w:t xml:space="preserve">tyle(s) </w:t>
-      </w:r>
-      <w:r>
-        <w:rPr>
-          <w:lang w:val="en-US"/>
-        </w:rPr>
-        <w:t>U</w:t>
-      </w:r>
-      <w:r>
-        <w:t>sed</w:t>
-      </w:r>
-      <w:bookmarkEnd w:id="27"/>
     </w:p>
     <w:p>
       <w:pPr>
@@ -9765,7 +9170,7 @@
       <w:pPr>
         <w:pStyle w:val="Heading2"/>
       </w:pPr>
-      <w:bookmarkStart w:id="28" w:name="_Toc229052408"/>
+      <w:bookmarkStart w:id="27" w:name="_Toc229052408"/>
       <w:r>
         <w:t xml:space="preserve">Architectural </w:t>
       </w:r>
@@ -9778,7 +9183,7 @@
       <w:r>
         <w:t>odel</w:t>
       </w:r>
-      <w:bookmarkEnd w:id="28"/>
+      <w:bookmarkEnd w:id="27"/>
     </w:p>
     <w:p>
       <w:pPr>
@@ -9960,7 +9365,7 @@
           <w:noProof/>
         </w:rPr>
       </w:pPr>
-      <w:bookmarkStart w:id="29" w:name="_Toc228885756"/>
+      <w:bookmarkStart w:id="28" w:name="_Toc228885756"/>
       <w:r>
         <w:t xml:space="preserve">Figure </w:t>
       </w:r>
@@ -10004,49 +9409,49 @@
         </w:rPr>
         <w:t>del</w:t>
       </w:r>
+      <w:bookmarkEnd w:id="28"/>
+    </w:p>
+    <w:p>
+      <w:pPr>
+        <w:pStyle w:val="Nidungvnbn"/>
+      </w:pPr>
+    </w:p>
+    <w:p>
+      <w:pPr>
+        <w:pStyle w:val="Heading2"/>
+      </w:pPr>
+      <w:bookmarkStart w:id="29" w:name="_Toc229052409"/>
+      <w:r>
+        <w:t xml:space="preserve">Technology, </w:t>
+      </w:r>
+      <w:r>
+        <w:rPr>
+          <w:lang w:val="en-US"/>
+        </w:rPr>
+        <w:t>S</w:t>
+      </w:r>
+      <w:r>
+        <w:t xml:space="preserve">oftware, and </w:t>
+      </w:r>
+      <w:r>
+        <w:rPr>
+          <w:lang w:val="en-US"/>
+        </w:rPr>
+        <w:t>H</w:t>
+      </w:r>
+      <w:r>
+        <w:t xml:space="preserve">ardware </w:t>
+      </w:r>
+      <w:r>
+        <w:rPr>
+          <w:lang w:val="en-US"/>
+        </w:rPr>
+        <w:t>U</w:t>
+      </w:r>
+      <w:r>
+        <w:t>sed</w:t>
+      </w:r>
       <w:bookmarkEnd w:id="29"/>
-    </w:p>
-    <w:p>
-      <w:pPr>
-        <w:pStyle w:val="Nidungvnbn"/>
-      </w:pPr>
-    </w:p>
-    <w:p>
-      <w:pPr>
-        <w:pStyle w:val="Heading2"/>
-      </w:pPr>
-      <w:bookmarkStart w:id="30" w:name="_Toc229052409"/>
-      <w:r>
-        <w:t xml:space="preserve">Technology, </w:t>
-      </w:r>
-      <w:r>
-        <w:rPr>
-          <w:lang w:val="en-US"/>
-        </w:rPr>
-        <w:t>S</w:t>
-      </w:r>
-      <w:r>
-        <w:t xml:space="preserve">oftware, and </w:t>
-      </w:r>
-      <w:r>
-        <w:rPr>
-          <w:lang w:val="en-US"/>
-        </w:rPr>
-        <w:t>H</w:t>
-      </w:r>
-      <w:r>
-        <w:t xml:space="preserve">ardware </w:t>
-      </w:r>
-      <w:r>
-        <w:rPr>
-          <w:lang w:val="en-US"/>
-        </w:rPr>
-        <w:t>U</w:t>
-      </w:r>
-      <w:r>
-        <w:t>sed</w:t>
-      </w:r>
-      <w:bookmarkEnd w:id="30"/>
     </w:p>
     <w:p>
       <w:pPr>
@@ -10245,7 +9650,7 @@
       <w:pPr>
         <w:pStyle w:val="Heading2"/>
       </w:pPr>
-      <w:bookmarkStart w:id="31" w:name="_Toc229052410"/>
+      <w:bookmarkStart w:id="30" w:name="_Toc229052410"/>
       <w:r>
         <w:t xml:space="preserve">Rationale for </w:t>
       </w:r>
@@ -10276,7 +9681,7 @@
       <w:r>
         <w:t>odel</w:t>
       </w:r>
-      <w:bookmarkEnd w:id="31"/>
+      <w:bookmarkEnd w:id="30"/>
     </w:p>
     <w:p>
       <w:pPr>
@@ -10444,33 +9849,33 @@
       <w:pPr>
         <w:pStyle w:val="Heading1"/>
       </w:pPr>
-      <w:bookmarkStart w:id="32" w:name="_Toc229052411"/>
+      <w:bookmarkStart w:id="31" w:name="_Toc229052411"/>
       <w:r>
         <w:rPr>
           <w:lang w:val="en-US"/>
         </w:rPr>
         <w:t>DESIGN</w:t>
       </w:r>
+      <w:bookmarkEnd w:id="31"/>
+    </w:p>
+    <w:p>
+      <w:pPr>
+        <w:pStyle w:val="Heading2"/>
+      </w:pPr>
+      <w:bookmarkStart w:id="32" w:name="_Toc229052412"/>
+      <w:r>
+        <w:t xml:space="preserve">Database </w:t>
+      </w:r>
+      <w:r>
+        <w:rPr>
+          <w:lang w:val="en-US"/>
+        </w:rPr>
+        <w:t>D</w:t>
+      </w:r>
+      <w:r>
+        <w:t>esign</w:t>
+      </w:r>
       <w:bookmarkEnd w:id="32"/>
-    </w:p>
-    <w:p>
-      <w:pPr>
-        <w:pStyle w:val="Heading2"/>
-      </w:pPr>
-      <w:bookmarkStart w:id="33" w:name="_Toc229052412"/>
-      <w:r>
-        <w:t xml:space="preserve">Database </w:t>
-      </w:r>
-      <w:r>
-        <w:rPr>
-          <w:lang w:val="en-US"/>
-        </w:rPr>
-        <w:t>D</w:t>
-      </w:r>
-      <w:r>
-        <w:t>esign</w:t>
-      </w:r>
-      <w:bookmarkEnd w:id="33"/>
     </w:p>
     <w:p>
       <w:pPr>
@@ -10712,7 +10117,7 @@
       <w:pPr>
         <w:pStyle w:val="Heading2"/>
       </w:pPr>
-      <w:bookmarkStart w:id="34" w:name="_Toc229052413"/>
+      <w:bookmarkStart w:id="33" w:name="_Toc229052413"/>
       <w:r>
         <w:t xml:space="preserve">Static model - </w:t>
       </w:r>
@@ -10734,7 +10139,7 @@
       <w:r>
         <w:t>iagrams</w:t>
       </w:r>
-      <w:bookmarkEnd w:id="34"/>
+      <w:bookmarkEnd w:id="33"/>
       <w:r>
         <w:t xml:space="preserve"> </w:t>
       </w:r>
@@ -11395,7 +10800,7 @@
       <w:pPr>
         <w:pStyle w:val="Heading2"/>
       </w:pPr>
-      <w:bookmarkStart w:id="35" w:name="_Toc229052414"/>
+      <w:bookmarkStart w:id="34" w:name="_Toc229052414"/>
       <w:r>
         <w:t xml:space="preserve">Dynamic </w:t>
       </w:r>
@@ -11426,7 +10831,7 @@
       <w:r>
         <w:t>iagrams</w:t>
       </w:r>
-      <w:bookmarkEnd w:id="35"/>
+      <w:bookmarkEnd w:id="34"/>
     </w:p>
     <w:p>
       <w:pPr>
@@ -11587,7 +10992,7 @@
       <w:pPr>
         <w:pStyle w:val="Heading2"/>
       </w:pPr>
-      <w:bookmarkStart w:id="36" w:name="_Toc229052415"/>
+      <w:bookmarkStart w:id="35" w:name="_Toc229052415"/>
       <w:r>
         <w:t>Rationale for</w:t>
       </w:r>
@@ -11618,7 +11023,7 @@
       <w:r>
         <w:t>odel</w:t>
       </w:r>
-      <w:bookmarkEnd w:id="36"/>
+      <w:bookmarkEnd w:id="35"/>
     </w:p>
     <w:p>
       <w:pPr>
@@ -11744,7 +11149,7 @@
       <w:pPr>
         <w:pStyle w:val="Heading2"/>
       </w:pPr>
-      <w:bookmarkStart w:id="37" w:name="_Toc229052416"/>
+      <w:bookmarkStart w:id="36" w:name="_Toc229052416"/>
       <w:r>
         <w:t xml:space="preserve">Traceability from </w:t>
       </w:r>
@@ -11784,7 +11189,7 @@
       <w:r>
         <w:t>odel</w:t>
       </w:r>
-      <w:bookmarkEnd w:id="37"/>
+      <w:bookmarkEnd w:id="36"/>
     </w:p>
     <w:p>
       <w:pPr>
@@ -12129,20 +11534,20 @@
       <w:pPr>
         <w:pStyle w:val="Heading1"/>
       </w:pPr>
-      <w:bookmarkStart w:id="38" w:name="_Toc229052417"/>
+      <w:bookmarkStart w:id="37" w:name="_Toc229052417"/>
       <w:r>
         <w:rPr>
           <w:lang w:val="en-US"/>
         </w:rPr>
         <w:t>TEST PLAN</w:t>
       </w:r>
-      <w:bookmarkEnd w:id="38"/>
+      <w:bookmarkEnd w:id="37"/>
     </w:p>
     <w:p>
       <w:pPr>
         <w:pStyle w:val="Heading2"/>
       </w:pPr>
-      <w:bookmarkStart w:id="39" w:name="_Toc229052418"/>
+      <w:bookmarkStart w:id="38" w:name="_Toc229052418"/>
       <w:r>
         <w:lastRenderedPageBreak/>
         <w:t>Requirements/</w:t>
@@ -12201,7 +11606,7 @@
       <w:r>
         <w:t>ases</w:t>
       </w:r>
-      <w:bookmarkEnd w:id="39"/>
+      <w:bookmarkEnd w:id="38"/>
     </w:p>
     <w:p>
       <w:pPr>
@@ -14787,7 +14192,7 @@
       <w:pPr>
         <w:pStyle w:val="Heading2"/>
       </w:pPr>
-      <w:bookmarkStart w:id="40" w:name="_Toc229052419"/>
+      <w:bookmarkStart w:id="39" w:name="_Toc229052419"/>
       <w:r>
         <w:t xml:space="preserve">Traceability of </w:t>
       </w:r>
@@ -14827,7 +14232,7 @@
       <w:r>
         <w:t>ases</w:t>
       </w:r>
-      <w:bookmarkEnd w:id="40"/>
+      <w:bookmarkEnd w:id="39"/>
     </w:p>
     <w:p>
       <w:pPr>
@@ -14867,7 +14272,7 @@
         </w:rPr>
         <w:t xml:space="preserve">Login / Logout </w:t>
       </w:r>
-      <w:bookmarkStart w:id="41" w:name="_Hlk228895176"/>
+      <w:bookmarkStart w:id="40" w:name="_Hlk228895176"/>
       <m:oMath>
         <m:r>
           <m:rPr>
@@ -14879,7 +14284,7 @@
           <m:t>→</m:t>
         </m:r>
       </m:oMath>
-      <w:bookmarkEnd w:id="41"/>
+      <w:bookmarkEnd w:id="40"/>
       <w:r>
         <w:rPr>
           <w:b w:val="0"/>
@@ -15271,7 +14676,7 @@
       <w:pPr>
         <w:pStyle w:val="Heading2"/>
       </w:pPr>
-      <w:bookmarkStart w:id="42" w:name="_Toc229052420"/>
+      <w:bookmarkStart w:id="41" w:name="_Toc229052420"/>
       <w:r>
         <w:t xml:space="preserve">Techniques </w:t>
       </w:r>
@@ -15302,7 +14707,7 @@
       <w:r>
         <w:t>eneration</w:t>
       </w:r>
-      <w:bookmarkEnd w:id="42"/>
+      <w:bookmarkEnd w:id="41"/>
     </w:p>
     <w:p>
       <w:pPr>
@@ -15522,7 +14927,7 @@
       <w:pPr>
         <w:pStyle w:val="Heading2"/>
       </w:pPr>
-      <w:bookmarkStart w:id="43" w:name="_Toc229052421"/>
+      <w:bookmarkStart w:id="42" w:name="_Toc229052421"/>
       <w:r>
         <w:t xml:space="preserve">Assessment of </w:t>
       </w:r>
@@ -15553,7 +14958,7 @@
       <w:r>
         <w:t>estsuite</w:t>
       </w:r>
-      <w:bookmarkEnd w:id="43"/>
+      <w:bookmarkEnd w:id="42"/>
     </w:p>
     <w:p>
       <w:pPr>
@@ -15658,6 +15063,213 @@
         </w:rPr>
         <w:t xml:space="preserve"> </w:t>
       </w:r>
+    </w:p>
+    <w:p>
+      <w:pPr>
+        <w:spacing w:before="0" w:after="200" w:line="276" w:lineRule="auto"/>
+        <w:rPr>
+          <w:i/>
+          <w:iCs/>
+        </w:rPr>
+      </w:pPr>
+    </w:p>
+    <w:p>
+      <w:pPr>
+        <w:spacing w:before="0" w:after="200" w:line="276" w:lineRule="auto"/>
+        <w:rPr>
+          <w:i/>
+          <w:iCs/>
+        </w:rPr>
+      </w:pPr>
+    </w:p>
+    <w:p>
+      <w:pPr>
+        <w:spacing w:before="0" w:after="200" w:line="276" w:lineRule="auto"/>
+        <w:rPr>
+          <w:i/>
+          <w:iCs/>
+        </w:rPr>
+      </w:pPr>
+    </w:p>
+    <w:p>
+      <w:pPr>
+        <w:spacing w:before="0" w:after="200" w:line="276" w:lineRule="auto"/>
+        <w:rPr>
+          <w:i/>
+          <w:iCs/>
+        </w:rPr>
+      </w:pPr>
+    </w:p>
+    <w:p>
+      <w:pPr>
+        <w:spacing w:before="0" w:after="200" w:line="276" w:lineRule="auto"/>
+        <w:rPr>
+          <w:i/>
+          <w:iCs/>
+        </w:rPr>
+      </w:pPr>
+    </w:p>
+    <w:p>
+      <w:pPr>
+        <w:spacing w:before="0" w:after="200" w:line="276" w:lineRule="auto"/>
+        <w:rPr>
+          <w:i/>
+          <w:iCs/>
+        </w:rPr>
+      </w:pPr>
+    </w:p>
+    <w:p>
+      <w:pPr>
+        <w:spacing w:before="0" w:after="200" w:line="276" w:lineRule="auto"/>
+        <w:rPr>
+          <w:i/>
+          <w:iCs/>
+        </w:rPr>
+      </w:pPr>
+    </w:p>
+    <w:p>
+      <w:pPr>
+        <w:spacing w:before="0" w:after="200" w:line="276" w:lineRule="auto"/>
+        <w:rPr>
+          <w:i/>
+          <w:iCs/>
+        </w:rPr>
+      </w:pPr>
+    </w:p>
+    <w:p>
+      <w:pPr>
+        <w:spacing w:before="0" w:after="200" w:line="276" w:lineRule="auto"/>
+        <w:rPr>
+          <w:i/>
+          <w:iCs/>
+        </w:rPr>
+      </w:pPr>
+    </w:p>
+    <w:p>
+      <w:pPr>
+        <w:spacing w:before="0" w:after="200" w:line="276" w:lineRule="auto"/>
+        <w:rPr>
+          <w:i/>
+          <w:iCs/>
+        </w:rPr>
+      </w:pPr>
+    </w:p>
+    <w:p>
+      <w:pPr>
+        <w:spacing w:before="0" w:after="200" w:line="276" w:lineRule="auto"/>
+        <w:rPr>
+          <w:i/>
+          <w:iCs/>
+        </w:rPr>
+      </w:pPr>
+    </w:p>
+    <w:p>
+      <w:pPr>
+        <w:spacing w:before="0" w:after="200" w:line="276" w:lineRule="auto"/>
+        <w:rPr>
+          <w:i/>
+          <w:iCs/>
+        </w:rPr>
+      </w:pPr>
+    </w:p>
+    <w:p>
+      <w:pPr>
+        <w:spacing w:before="0" w:after="200" w:line="276" w:lineRule="auto"/>
+        <w:rPr>
+          <w:i/>
+          <w:iCs/>
+        </w:rPr>
+      </w:pPr>
+    </w:p>
+    <w:p>
+      <w:pPr>
+        <w:spacing w:before="0" w:after="200" w:line="276" w:lineRule="auto"/>
+        <w:rPr>
+          <w:i/>
+          <w:iCs/>
+        </w:rPr>
+      </w:pPr>
+    </w:p>
+    <w:p>
+      <w:pPr>
+        <w:spacing w:before="0" w:after="200" w:line="276" w:lineRule="auto"/>
+        <w:rPr>
+          <w:i/>
+          <w:iCs/>
+        </w:rPr>
+      </w:pPr>
+    </w:p>
+    <w:p>
+      <w:pPr>
+        <w:spacing w:before="0" w:after="200" w:line="276" w:lineRule="auto"/>
+        <w:rPr>
+          <w:i/>
+          <w:iCs/>
+        </w:rPr>
+      </w:pPr>
+    </w:p>
+    <w:p>
+      <w:pPr>
+        <w:spacing w:before="0" w:after="200" w:line="276" w:lineRule="auto"/>
+        <w:rPr>
+          <w:i/>
+          <w:iCs/>
+        </w:rPr>
+      </w:pPr>
+    </w:p>
+    <w:p>
+      <w:pPr>
+        <w:spacing w:before="0" w:after="200" w:line="276" w:lineRule="auto"/>
+        <w:rPr>
+          <w:i/>
+          <w:iCs/>
+        </w:rPr>
+      </w:pPr>
+    </w:p>
+    <w:p>
+      <w:pPr>
+        <w:spacing w:before="0" w:after="200" w:line="276" w:lineRule="auto"/>
+        <w:rPr>
+          <w:i/>
+          <w:iCs/>
+        </w:rPr>
+      </w:pPr>
+    </w:p>
+    <w:p>
+      <w:pPr>
+        <w:spacing w:before="0" w:after="200" w:line="276" w:lineRule="auto"/>
+        <w:rPr>
+          <w:i/>
+          <w:iCs/>
+        </w:rPr>
+      </w:pPr>
+    </w:p>
+    <w:p>
+      <w:pPr>
+        <w:spacing w:before="0" w:after="200" w:line="276" w:lineRule="auto"/>
+        <w:rPr>
+          <w:i/>
+          <w:iCs/>
+        </w:rPr>
+      </w:pPr>
+    </w:p>
+    <w:p>
+      <w:pPr>
+        <w:spacing w:before="0" w:after="200" w:line="276" w:lineRule="auto"/>
+        <w:rPr>
+          <w:i/>
+          <w:iCs/>
+        </w:rPr>
+      </w:pPr>
+    </w:p>
+    <w:p>
+      <w:pPr>
+        <w:spacing w:before="0" w:after="200" w:line="276" w:lineRule="auto"/>
+        <w:rPr>
+          <w:i/>
+          <w:iCs/>
+        </w:rPr>
+      </w:pPr>
     </w:p>
     <w:p>
       <w:pPr>
@@ -15678,34 +15290,46 @@
           <w:lang w:eastAsia="ko-KR"/>
         </w:rPr>
       </w:pPr>
-      <w:bookmarkStart w:id="44" w:name="_Toc229052422"/>
+      <w:bookmarkStart w:id="43" w:name="_Toc229052422"/>
       <w:r>
         <w:rPr>
           <w:lang w:val="en-US"/>
         </w:rPr>
+        <w:lastRenderedPageBreak/>
         <w:t>t</w:t>
       </w:r>
-      <w:bookmarkEnd w:id="44"/>
+      <w:bookmarkEnd w:id="43"/>
+    </w:p>
+    <w:p>
+      <w:pPr>
+        <w:pStyle w:val="Heading1"/>
+        <w:rPr>
+          <w:rFonts w:hAnsi="Symbol"/>
+          <w:sz w:val="26"/>
+          <w:szCs w:val="26"/>
+          <w:lang w:eastAsia="ko-KR"/>
+        </w:rPr>
+      </w:pPr>
       <w:r>
         <w:br w:type="page"/>
       </w:r>
     </w:p>
-    <w:bookmarkStart w:id="45" w:name="_Toc229052423" w:displacedByCustomXml="next"/>
+    <w:bookmarkStart w:id="44" w:name="_Toc229052423" w:displacedByCustomXml="next"/>
     <w:sdt>
       <w:sdtPr>
+        <w:id w:val="-573587230"/>
+        <w:bibliography/>
+      </w:sdtPr>
+      <w:sdtEndPr>
         <w:rPr>
           <w:b w:val="0"/>
           <w:sz w:val="24"/>
           <w:szCs w:val="24"/>
           <w:lang w:val="en-US"/>
         </w:rPr>
-        <w:id w:val="-750733138"/>
-        <w:docPartObj>
-          <w:docPartGallery w:val="Bibliographies"/>
-          <w:docPartUnique/>
-        </w:docPartObj>
-      </w:sdtPr>
+      </w:sdtEndPr>
       <w:sdtContent>
+        <w:bookmarkEnd w:id="44" w:displacedByCustomXml="prev"/>
         <w:p>
           <w:pPr>
             <w:pStyle w:val="Heading1"/>
@@ -15714,259 +15338,18 @@
               <w:numId w:val="0"/>
             </w:numPr>
             <w:tabs>
-              <w:tab w:val="left" w:pos="2073"/>
+              <w:tab w:val="left" w:pos="1102"/>
             </w:tabs>
-            <w:jc w:val="center"/>
-            <w:rPr>
-              <w:lang w:val="en-US"/>
-            </w:rPr>
           </w:pPr>
-          <w:r>
-            <w:t>R</w:t>
-          </w:r>
-          <w:r>
-            <w:rPr>
-              <w:lang w:val="en-US"/>
-            </w:rPr>
-            <w:t>EFERENCES</w:t>
-          </w:r>
-          <w:bookmarkEnd w:id="45"/>
         </w:p>
         <w:p>
           <w:pPr>
-            <w:pStyle w:val="Heading1"/>
-            <w:numPr>
-              <w:ilvl w:val="0"/>
-              <w:numId w:val="0"/>
-            </w:numPr>
-            <w:tabs>
-              <w:tab w:val="left" w:pos="2073"/>
-            </w:tabs>
-            <w:jc w:val="center"/>
-            <w:rPr>
-              <w:lang w:val="en-US"/>
-            </w:rPr>
+            <w:pStyle w:val="Bibliography"/>
+            <w:spacing w:line="360" w:lineRule="auto"/>
+            <w:ind w:left="0" w:firstLine="0"/>
+            <w:jc w:val="both"/>
           </w:pPr>
         </w:p>
-        <w:sdt>
-          <w:sdtPr>
-            <w:id w:val="-573587230"/>
-            <w:bibliography/>
-          </w:sdtPr>
-          <w:sdtContent>
-            <w:p>
-              <w:pPr>
-                <w:pStyle w:val="Bibliography"/>
-                <w:spacing w:line="360" w:lineRule="auto"/>
-                <w:ind w:hanging="360"/>
-                <w:jc w:val="both"/>
-                <w:rPr>
-                  <w:i/>
-                  <w:iCs/>
-                  <w:noProof/>
-                </w:rPr>
-              </w:pPr>
-              <w:r>
-                <w:fldChar w:fldCharType="begin"/>
-              </w:r>
-              <w:r>
-                <w:instrText xml:space="preserve"> BIBLIOGRAPHY </w:instrText>
-              </w:r>
-              <w:r>
-                <w:fldChar w:fldCharType="separate"/>
-              </w:r>
-              <w:r>
-                <w:rPr>
-                  <w:i/>
-                  <w:iCs/>
-                  <w:noProof/>
-                </w:rPr>
-                <w:t xml:space="preserve"> </w:t>
-              </w:r>
-              <w:r>
-                <w:rPr>
-                  <w:b/>
-                  <w:bCs/>
-                  <w:i/>
-                  <w:iCs/>
-                  <w:noProof/>
-                </w:rPr>
-                <w:t>English References:</w:t>
-              </w:r>
-            </w:p>
-            <w:p>
-              <w:pPr>
-                <w:pStyle w:val="Bibliography"/>
-                <w:numPr>
-                  <w:ilvl w:val="0"/>
-                  <w:numId w:val="3"/>
-                </w:numPr>
-                <w:spacing w:line="360" w:lineRule="auto"/>
-                <w:jc w:val="both"/>
-                <w:rPr>
-                  <w:i/>
-                  <w:iCs/>
-                  <w:noProof/>
-                </w:rPr>
-              </w:pPr>
-              <w:r>
-                <w:rPr>
-                  <w:i/>
-                  <w:iCs/>
-                  <w:noProof/>
-                </w:rPr>
-                <w:t>Rosen, K. H. (2019). Discrete Mathematics and Its Applications (8th ed.). McGraw-Hill Education.</w:t>
-              </w:r>
-            </w:p>
-            <w:p>
-              <w:pPr>
-                <w:pStyle w:val="Bibliography"/>
-                <w:numPr>
-                  <w:ilvl w:val="0"/>
-                  <w:numId w:val="3"/>
-                </w:numPr>
-                <w:spacing w:line="360" w:lineRule="auto"/>
-                <w:jc w:val="both"/>
-                <w:rPr>
-                  <w:i/>
-                  <w:iCs/>
-                  <w:noProof/>
-                </w:rPr>
-              </w:pPr>
-              <w:r>
-                <w:rPr>
-                  <w:i/>
-                  <w:iCs/>
-                  <w:noProof/>
-                </w:rPr>
-                <w:t>Stallings, W. (2020). Cryptography and Network Security: Principles and Practice (8th ed.). Pearson.</w:t>
-              </w:r>
-            </w:p>
-            <w:p>
-              <w:pPr>
-                <w:pStyle w:val="Bibliography"/>
-                <w:spacing w:line="360" w:lineRule="auto"/>
-                <w:ind w:hanging="360"/>
-                <w:jc w:val="both"/>
-                <w:rPr>
-                  <w:i/>
-                  <w:iCs/>
-                  <w:noProof/>
-                </w:rPr>
-              </w:pPr>
-              <w:r>
-                <w:rPr>
-                  <w:b/>
-                  <w:bCs/>
-                  <w:i/>
-                  <w:iCs/>
-                  <w:noProof/>
-                </w:rPr>
-                <w:t>Vietnamese References:</w:t>
-              </w:r>
-            </w:p>
-            <w:p>
-              <w:pPr>
-                <w:pStyle w:val="ListParagraph"/>
-                <w:numPr>
-                  <w:ilvl w:val="0"/>
-                  <w:numId w:val="4"/>
-                </w:numPr>
-                <w:spacing w:after="0" w:line="360" w:lineRule="auto"/>
-                <w:contextualSpacing w:val="0"/>
-                <w:jc w:val="both"/>
-                <w:rPr>
-                  <w:i/>
-                  <w:iCs/>
-                  <w:noProof/>
-                  <w:vanish/>
-                </w:rPr>
-              </w:pPr>
-            </w:p>
-            <w:p>
-              <w:pPr>
-                <w:pStyle w:val="ListParagraph"/>
-                <w:numPr>
-                  <w:ilvl w:val="0"/>
-                  <w:numId w:val="4"/>
-                </w:numPr>
-                <w:spacing w:after="0" w:line="360" w:lineRule="auto"/>
-                <w:contextualSpacing w:val="0"/>
-                <w:jc w:val="both"/>
-                <w:rPr>
-                  <w:i/>
-                  <w:iCs/>
-                  <w:noProof/>
-                  <w:vanish/>
-                </w:rPr>
-              </w:pPr>
-            </w:p>
-            <w:p>
-              <w:pPr>
-                <w:pStyle w:val="Bibliography"/>
-                <w:numPr>
-                  <w:ilvl w:val="0"/>
-                  <w:numId w:val="4"/>
-                </w:numPr>
-                <w:spacing w:line="360" w:lineRule="auto"/>
-                <w:jc w:val="both"/>
-                <w:rPr>
-                  <w:i/>
-                  <w:iCs/>
-                  <w:noProof/>
-                </w:rPr>
-              </w:pPr>
-              <w:r>
-                <w:rPr>
-                  <w:i/>
-                  <w:iCs/>
-                  <w:noProof/>
-                </w:rPr>
-                <w:t>Nguyễn Đức Nghĩa, &amp; Nguyễn Tô Thành. (2011). Toán rời rạc. Nhà xuất bản Đại học Quốc gia Hà Nội.</w:t>
-              </w:r>
-            </w:p>
-            <w:p>
-              <w:pPr>
-                <w:pStyle w:val="Bibliography"/>
-                <w:numPr>
-                  <w:ilvl w:val="0"/>
-                  <w:numId w:val="4"/>
-                </w:numPr>
-                <w:spacing w:line="360" w:lineRule="auto"/>
-                <w:jc w:val="both"/>
-                <w:rPr>
-                  <w:i/>
-                  <w:iCs/>
-                  <w:noProof/>
-                </w:rPr>
-              </w:pPr>
-              <w:r>
-                <w:rPr>
-                  <w:i/>
-                  <w:iCs/>
-                  <w:noProof/>
-                </w:rPr>
-                <w:t>Trần Đan Thư, &amp; Nguyễn Thanh Phương. (2015). Toán rời rạc và Ứng dụng trong Tin học. Nhà xuất bản Đại học Quốc gia TP.HCM.</w:t>
-              </w:r>
-            </w:p>
-            <w:p>
-              <w:pPr>
-                <w:pStyle w:val="Bibliography"/>
-                <w:spacing w:line="360" w:lineRule="auto"/>
-                <w:ind w:left="0" w:firstLine="0"/>
-                <w:jc w:val="both"/>
-              </w:pPr>
-              <w:r>
-                <w:rPr>
-                  <w:b/>
-                  <w:bCs/>
-                  <w:noProof/>
-                </w:rPr>
-                <w:fldChar w:fldCharType="end"/>
-              </w:r>
-            </w:p>
-          </w:sdtContent>
-        </w:sdt>
       </w:sdtContent>
     </w:sdt>
     <w:p>

</xml_diff>

<commit_message>
Update: database initial data.
</commit_message>
<xml_diff>
--- a/reports/524H0015_524H0012_524H0134.docx
+++ b/reports/524H0015_524H0012_524H0134.docx
@@ -14,28 +14,12 @@
         </w:rPr>
       </w:pPr>
       <w:bookmarkStart w:id="0" w:name="_Hlk36280688"/>
-      <w:proofErr w:type="spellStart"/>
       <w:r>
         <w:rPr>
           <w:sz w:val="28"/>
           <w:szCs w:val="28"/>
         </w:rPr>
-        <w:t>re</w:t>
-      </w:r>
-      <w:r>
-        <w:rPr>
-          <w:sz w:val="28"/>
-          <w:szCs w:val="28"/>
-        </w:rPr>
-        <w:t>VIETNAM</w:t>
-      </w:r>
-      <w:proofErr w:type="spellEnd"/>
-      <w:r>
-        <w:rPr>
-          <w:sz w:val="28"/>
-          <w:szCs w:val="28"/>
-        </w:rPr>
-        <w:t xml:space="preserve"> GENERAL CONFEDERATION OF LABOR</w:t>
+        <w:t>VIETNAM GENERAL CONFEDERATION OF LABOR</w:t>
       </w:r>
     </w:p>
     <w:p>
@@ -15317,17 +15301,15 @@
     <w:bookmarkStart w:id="44" w:name="_Toc229052423" w:displacedByCustomXml="next"/>
     <w:sdt>
       <w:sdtPr>
-        <w:id w:val="-573587230"/>
-        <w:bibliography/>
-      </w:sdtPr>
-      <w:sdtEndPr>
         <w:rPr>
           <w:b w:val="0"/>
           <w:sz w:val="24"/>
           <w:szCs w:val="24"/>
           <w:lang w:val="en-US"/>
         </w:rPr>
-      </w:sdtEndPr>
+        <w:id w:val="-573587230"/>
+        <w:bibliography/>
+      </w:sdtPr>
       <w:sdtContent>
         <w:bookmarkEnd w:id="44" w:displacedByCustomXml="prev"/>
         <w:p>

</xml_diff>

<commit_message>
Add: Product specs now shows when mouse hover above it
</commit_message>
<xml_diff>
--- a/reports/524H0015_524H0012_524H0134.docx
+++ b/reports/524H0015_524H0012_524H0134.docx
@@ -3141,7 +3141,7 @@
         </w:rPr>
         <w:fldChar w:fldCharType="separate"/>
       </w:r>
-      <w:hyperlink w:anchor="_Toc229052382" w:history="1">
+      <w:hyperlink w:anchor="_Toc229660458" w:history="1">
         <w:r>
           <w:rPr>
             <w:rStyle w:val="Hyperlink"/>
@@ -3168,7 +3168,7 @@
             <w:noProof/>
             <w:webHidden/>
           </w:rPr>
-          <w:instrText xml:space="preserve"> PAGEREF _Toc229052382 \h </w:instrText>
+          <w:instrText xml:space="preserve"> PAGEREF _Toc229660458 \h </w:instrText>
         </w:r>
         <w:r>
           <w:rPr>
@@ -3213,7 +3213,7 @@
           <w14:ligatures w14:val="standardContextual"/>
         </w:rPr>
       </w:pPr>
-      <w:hyperlink w:anchor="_Toc229052383" w:history="1">
+      <w:hyperlink w:anchor="_Toc229660459" w:history="1">
         <w:r>
           <w:rPr>
             <w:rStyle w:val="Hyperlink"/>
@@ -3240,7 +3240,7 @@
             <w:noProof/>
             <w:webHidden/>
           </w:rPr>
-          <w:instrText xml:space="preserve"> PAGEREF _Toc229052383 \h </w:instrText>
+          <w:instrText xml:space="preserve"> PAGEREF _Toc229660459 \h </w:instrText>
         </w:r>
         <w:r>
           <w:rPr>
@@ -3285,7 +3285,7 @@
           <w14:ligatures w14:val="standardContextual"/>
         </w:rPr>
       </w:pPr>
-      <w:hyperlink w:anchor="_Toc229052384" w:history="1">
+      <w:hyperlink w:anchor="_Toc229660460" w:history="1">
         <w:r>
           <w:rPr>
             <w:rStyle w:val="Hyperlink"/>
@@ -3320,7 +3320,7 @@
             <w:noProof/>
             <w:webHidden/>
           </w:rPr>
-          <w:instrText xml:space="preserve"> PAGEREF _Toc229052384 \h </w:instrText>
+          <w:instrText xml:space="preserve"> PAGEREF _Toc229660460 \h </w:instrText>
         </w:r>
         <w:r>
           <w:rPr>
@@ -3364,7 +3364,7 @@
           <w14:ligatures w14:val="standardContextual"/>
         </w:rPr>
       </w:pPr>
-      <w:hyperlink w:anchor="_Toc229052385" w:history="1">
+      <w:hyperlink w:anchor="_Toc229660461" w:history="1">
         <w:r>
           <w:rPr>
             <w:rStyle w:val="Hyperlink"/>
@@ -3391,7 +3391,7 @@
             <w:noProof/>
             <w:webHidden/>
           </w:rPr>
-          <w:instrText xml:space="preserve"> PAGEREF _Toc229052385 \h </w:instrText>
+          <w:instrText xml:space="preserve"> PAGEREF _Toc229660461 \h </w:instrText>
         </w:r>
         <w:r>
           <w:rPr>
@@ -3435,7 +3435,7 @@
           <w14:ligatures w14:val="standardContextual"/>
         </w:rPr>
       </w:pPr>
-      <w:hyperlink w:anchor="_Toc229052386" w:history="1">
+      <w:hyperlink w:anchor="_Toc229660462" w:history="1">
         <w:r>
           <w:rPr>
             <w:rStyle w:val="Hyperlink"/>
@@ -3470,7 +3470,7 @@
             <w:noProof/>
             <w:webHidden/>
           </w:rPr>
-          <w:instrText xml:space="preserve"> PAGEREF _Toc229052386 \h </w:instrText>
+          <w:instrText xml:space="preserve"> PAGEREF _Toc229660462 \h </w:instrText>
         </w:r>
         <w:r>
           <w:rPr>
@@ -3514,7 +3514,7 @@
           <w14:ligatures w14:val="standardContextual"/>
         </w:rPr>
       </w:pPr>
-      <w:hyperlink w:anchor="_Toc229052387" w:history="1">
+      <w:hyperlink w:anchor="_Toc229660463" w:history="1">
         <w:r>
           <w:rPr>
             <w:rStyle w:val="Hyperlink"/>
@@ -3541,86 +3541,7 @@
             <w:noProof/>
             <w:webHidden/>
           </w:rPr>
-          <w:instrText xml:space="preserve"> PAGEREF _Toc229052387 \h </w:instrText>
-        </w:r>
-        <w:r>
-          <w:rPr>
-            <w:noProof/>
-            <w:webHidden/>
-          </w:rPr>
-        </w:r>
-        <w:r>
-          <w:rPr>
-            <w:noProof/>
-            <w:webHidden/>
-          </w:rPr>
-          <w:fldChar w:fldCharType="separate"/>
-        </w:r>
-        <w:r>
-          <w:rPr>
-            <w:noProof/>
-            <w:webHidden/>
-          </w:rPr>
-          <w:t>2</w:t>
-        </w:r>
-        <w:r>
-          <w:rPr>
-            <w:noProof/>
-            <w:webHidden/>
-          </w:rPr>
-          <w:fldChar w:fldCharType="end"/>
-        </w:r>
-      </w:hyperlink>
-    </w:p>
-    <w:p>
-      <w:pPr>
-        <w:pStyle w:val="TOC2"/>
-        <w:rPr>
-          <w:rFonts w:asciiTheme="minorHAnsi" w:eastAsiaTheme="minorEastAsia" w:hAnsiTheme="minorHAnsi"/>
-          <w:noProof/>
-          <w:kern w:val="2"/>
-          <w:sz w:val="22"/>
-          <w:szCs w:val="22"/>
-          <w:lang w:eastAsia="ko-KR"/>
-          <w14:ligatures w14:val="standardContextual"/>
-        </w:rPr>
-      </w:pPr>
-      <w:hyperlink w:anchor="_Toc229052388" w:history="1">
-        <w:r>
-          <w:rPr>
-            <w:rStyle w:val="Hyperlink"/>
-            <w:caps/>
-            <w:noProof/>
-          </w:rPr>
-          <w:t>1.4</w:t>
-        </w:r>
-        <w:r>
-          <w:rPr>
-            <w:rStyle w:val="Hyperlink"/>
-            <w:noProof/>
-          </w:rPr>
-          <w:t xml:space="preserve"> Terms, Acronyms, and Abbreviations</w:t>
-        </w:r>
-        <w:r>
-          <w:rPr>
-            <w:noProof/>
-            <w:webHidden/>
-          </w:rPr>
-          <w:tab/>
-        </w:r>
-        <w:r>
-          <w:rPr>
-            <w:noProof/>
-            <w:webHidden/>
-          </w:rPr>
-          <w:fldChar w:fldCharType="begin"/>
-        </w:r>
-        <w:r>
-          <w:rPr>
-            <w:noProof/>
-            <w:webHidden/>
-          </w:rPr>
-          <w:instrText xml:space="preserve"> PAGEREF _Toc229052388 \h </w:instrText>
+          <w:instrText xml:space="preserve"> PAGEREF _Toc229660463 \h </w:instrText>
         </w:r>
         <w:r>
           <w:rPr>
@@ -3665,7 +3586,7 @@
           <w14:ligatures w14:val="standardContextual"/>
         </w:rPr>
       </w:pPr>
-      <w:hyperlink w:anchor="_Toc229052389" w:history="1">
+      <w:hyperlink w:anchor="_Toc229660464" w:history="1">
         <w:r>
           <w:rPr>
             <w:rStyle w:val="Hyperlink"/>
@@ -3692,7 +3613,7 @@
             <w:noProof/>
             <w:webHidden/>
           </w:rPr>
-          <w:instrText xml:space="preserve"> PAGEREF _Toc229052389 \h </w:instrText>
+          <w:instrText xml:space="preserve"> PAGEREF _Toc229660464 \h </w:instrText>
         </w:r>
         <w:r>
           <w:rPr>
@@ -3736,7 +3657,7 @@
           <w14:ligatures w14:val="standardContextual"/>
         </w:rPr>
       </w:pPr>
-      <w:hyperlink w:anchor="_Toc229052390" w:history="1">
+      <w:hyperlink w:anchor="_Toc229660465" w:history="1">
         <w:r>
           <w:rPr>
             <w:rStyle w:val="Hyperlink"/>
@@ -3763,7 +3684,7 @@
             <w:noProof/>
             <w:webHidden/>
           </w:rPr>
-          <w:instrText xml:space="preserve"> PAGEREF _Toc229052390 \h </w:instrText>
+          <w:instrText xml:space="preserve"> PAGEREF _Toc229660465 \h </w:instrText>
         </w:r>
         <w:r>
           <w:rPr>
@@ -3807,7 +3728,7 @@
           <w14:ligatures w14:val="standardContextual"/>
         </w:rPr>
       </w:pPr>
-      <w:hyperlink w:anchor="_Toc229052391" w:history="1">
+      <w:hyperlink w:anchor="_Toc229660466" w:history="1">
         <w:r>
           <w:rPr>
             <w:rStyle w:val="Hyperlink"/>
@@ -3834,7 +3755,7 @@
             <w:noProof/>
             <w:webHidden/>
           </w:rPr>
-          <w:instrText xml:space="preserve"> PAGEREF _Toc229052391 \h </w:instrText>
+          <w:instrText xml:space="preserve"> PAGEREF _Toc229660466 \h </w:instrText>
         </w:r>
         <w:r>
           <w:rPr>
@@ -3878,7 +3799,7 @@
           <w14:ligatures w14:val="standardContextual"/>
         </w:rPr>
       </w:pPr>
-      <w:hyperlink w:anchor="_Toc229052392" w:history="1">
+      <w:hyperlink w:anchor="_Toc229660467" w:history="1">
         <w:r>
           <w:rPr>
             <w:rStyle w:val="Hyperlink"/>
@@ -3905,7 +3826,7 @@
             <w:noProof/>
             <w:webHidden/>
           </w:rPr>
-          <w:instrText xml:space="preserve"> PAGEREF _Toc229052392 \h </w:instrText>
+          <w:instrText xml:space="preserve"> PAGEREF _Toc229660467 \h </w:instrText>
         </w:r>
         <w:r>
           <w:rPr>
@@ -3949,7 +3870,7 @@
           <w14:ligatures w14:val="standardContextual"/>
         </w:rPr>
       </w:pPr>
-      <w:hyperlink w:anchor="_Toc229052393" w:history="1">
+      <w:hyperlink w:anchor="_Toc229660468" w:history="1">
         <w:r>
           <w:rPr>
             <w:rStyle w:val="Hyperlink"/>
@@ -3976,7 +3897,7 @@
             <w:noProof/>
             <w:webHidden/>
           </w:rPr>
-          <w:instrText xml:space="preserve"> PAGEREF _Toc229052393 \h </w:instrText>
+          <w:instrText xml:space="preserve"> PAGEREF _Toc229660468 \h </w:instrText>
         </w:r>
         <w:r>
           <w:rPr>
@@ -4020,7 +3941,7 @@
           <w14:ligatures w14:val="standardContextual"/>
         </w:rPr>
       </w:pPr>
-      <w:hyperlink w:anchor="_Toc229052394" w:history="1">
+      <w:hyperlink w:anchor="_Toc229660469" w:history="1">
         <w:r>
           <w:rPr>
             <w:rStyle w:val="Hyperlink"/>
@@ -4047,7 +3968,7 @@
             <w:noProof/>
             <w:webHidden/>
           </w:rPr>
-          <w:instrText xml:space="preserve"> PAGEREF _Toc229052394 \h </w:instrText>
+          <w:instrText xml:space="preserve"> PAGEREF _Toc229660469 \h </w:instrText>
         </w:r>
         <w:r>
           <w:rPr>
@@ -4091,7 +4012,7 @@
           <w14:ligatures w14:val="standardContextual"/>
         </w:rPr>
       </w:pPr>
-      <w:hyperlink w:anchor="_Toc229052395" w:history="1">
+      <w:hyperlink w:anchor="_Toc229660470" w:history="1">
         <w:r>
           <w:rPr>
             <w:rStyle w:val="Hyperlink"/>
@@ -4118,7 +4039,7 @@
             <w:noProof/>
             <w:webHidden/>
           </w:rPr>
-          <w:instrText xml:space="preserve"> PAGEREF _Toc229052395 \h </w:instrText>
+          <w:instrText xml:space="preserve"> PAGEREF _Toc229660470 \h </w:instrText>
         </w:r>
         <w:r>
           <w:rPr>
@@ -4162,7 +4083,7 @@
           <w14:ligatures w14:val="standardContextual"/>
         </w:rPr>
       </w:pPr>
-      <w:hyperlink w:anchor="_Toc229052396" w:history="1">
+      <w:hyperlink w:anchor="_Toc229660471" w:history="1">
         <w:r>
           <w:rPr>
             <w:rStyle w:val="Hyperlink"/>
@@ -4189,7 +4110,7 @@
             <w:noProof/>
             <w:webHidden/>
           </w:rPr>
-          <w:instrText xml:space="preserve"> PAGEREF _Toc229052396 \h </w:instrText>
+          <w:instrText xml:space="preserve"> PAGEREF _Toc229660471 \h </w:instrText>
         </w:r>
         <w:r>
           <w:rPr>
@@ -4233,7 +4154,7 @@
           <w14:ligatures w14:val="standardContextual"/>
         </w:rPr>
       </w:pPr>
-      <w:hyperlink w:anchor="_Toc229052397" w:history="1">
+      <w:hyperlink w:anchor="_Toc229660472" w:history="1">
         <w:r>
           <w:rPr>
             <w:rStyle w:val="Hyperlink"/>
@@ -4260,7 +4181,7 @@
             <w:noProof/>
             <w:webHidden/>
           </w:rPr>
-          <w:instrText xml:space="preserve"> PAGEREF _Toc229052397 \h </w:instrText>
+          <w:instrText xml:space="preserve"> PAGEREF _Toc229660472 \h </w:instrText>
         </w:r>
         <w:r>
           <w:rPr>
@@ -4304,7 +4225,7 @@
           <w14:ligatures w14:val="standardContextual"/>
         </w:rPr>
       </w:pPr>
-      <w:hyperlink w:anchor="_Toc229052398" w:history="1">
+      <w:hyperlink w:anchor="_Toc229660473" w:history="1">
         <w:r>
           <w:rPr>
             <w:rStyle w:val="Hyperlink"/>
@@ -4331,7 +4252,7 @@
             <w:noProof/>
             <w:webHidden/>
           </w:rPr>
-          <w:instrText xml:space="preserve"> PAGEREF _Toc229052398 \h </w:instrText>
+          <w:instrText xml:space="preserve"> PAGEREF _Toc229660473 \h </w:instrText>
         </w:r>
         <w:r>
           <w:rPr>
@@ -4376,7 +4297,7 @@
           <w14:ligatures w14:val="standardContextual"/>
         </w:rPr>
       </w:pPr>
-      <w:hyperlink w:anchor="_Toc229052399" w:history="1">
+      <w:hyperlink w:anchor="_Toc229660474" w:history="1">
         <w:r>
           <w:rPr>
             <w:rStyle w:val="Hyperlink"/>
@@ -4403,7 +4324,7 @@
             <w:noProof/>
             <w:webHidden/>
           </w:rPr>
-          <w:instrText xml:space="preserve"> PAGEREF _Toc229052399 \h </w:instrText>
+          <w:instrText xml:space="preserve"> PAGEREF _Toc229660474 \h </w:instrText>
         </w:r>
         <w:r>
           <w:rPr>
@@ -4447,7 +4368,7 @@
           <w14:ligatures w14:val="standardContextual"/>
         </w:rPr>
       </w:pPr>
-      <w:hyperlink w:anchor="_Toc229052400" w:history="1">
+      <w:hyperlink w:anchor="_Toc229660475" w:history="1">
         <w:r>
           <w:rPr>
             <w:rStyle w:val="Hyperlink"/>
@@ -4474,7 +4395,7 @@
             <w:noProof/>
             <w:webHidden/>
           </w:rPr>
-          <w:instrText xml:space="preserve"> PAGEREF _Toc229052400 \h </w:instrText>
+          <w:instrText xml:space="preserve"> PAGEREF _Toc229660475 \h </w:instrText>
         </w:r>
         <w:r>
           <w:rPr>
@@ -4518,7 +4439,7 @@
           <w14:ligatures w14:val="standardContextual"/>
         </w:rPr>
       </w:pPr>
-      <w:hyperlink w:anchor="_Toc229052401" w:history="1">
+      <w:hyperlink w:anchor="_Toc229660476" w:history="1">
         <w:r>
           <w:rPr>
             <w:rStyle w:val="Hyperlink"/>
@@ -4545,7 +4466,7 @@
             <w:noProof/>
             <w:webHidden/>
           </w:rPr>
-          <w:instrText xml:space="preserve"> PAGEREF _Toc229052401 \h </w:instrText>
+          <w:instrText xml:space="preserve"> PAGEREF _Toc229660476 \h </w:instrText>
         </w:r>
         <w:r>
           <w:rPr>
@@ -4590,7 +4511,7 @@
           <w14:ligatures w14:val="standardContextual"/>
         </w:rPr>
       </w:pPr>
-      <w:hyperlink w:anchor="_Toc229052402" w:history="1">
+      <w:hyperlink w:anchor="_Toc229660477" w:history="1">
         <w:r>
           <w:rPr>
             <w:rStyle w:val="Hyperlink"/>
@@ -4617,7 +4538,7 @@
             <w:noProof/>
             <w:webHidden/>
           </w:rPr>
-          <w:instrText xml:space="preserve"> PAGEREF _Toc229052402 \h </w:instrText>
+          <w:instrText xml:space="preserve"> PAGEREF _Toc229660477 \h </w:instrText>
         </w:r>
         <w:r>
           <w:rPr>
@@ -4662,7 +4583,7 @@
           <w14:ligatures w14:val="standardContextual"/>
         </w:rPr>
       </w:pPr>
-      <w:hyperlink w:anchor="_Toc229052403" w:history="1">
+      <w:hyperlink w:anchor="_Toc229660478" w:history="1">
         <w:r>
           <w:rPr>
             <w:rStyle w:val="Hyperlink"/>
@@ -4689,7 +4610,7 @@
             <w:noProof/>
             <w:webHidden/>
           </w:rPr>
-          <w:instrText xml:space="preserve"> PAGEREF _Toc229052403 \h </w:instrText>
+          <w:instrText xml:space="preserve"> PAGEREF _Toc229660478 \h </w:instrText>
         </w:r>
         <w:r>
           <w:rPr>
@@ -4733,7 +4654,7 @@
           <w14:ligatures w14:val="standardContextual"/>
         </w:rPr>
       </w:pPr>
-      <w:hyperlink w:anchor="_Toc229052404" w:history="1">
+      <w:hyperlink w:anchor="_Toc229660479" w:history="1">
         <w:r>
           <w:rPr>
             <w:rStyle w:val="Hyperlink"/>
@@ -4760,7 +4681,7 @@
             <w:noProof/>
             <w:webHidden/>
           </w:rPr>
-          <w:instrText xml:space="preserve"> PAGEREF _Toc229052404 \h </w:instrText>
+          <w:instrText xml:space="preserve"> PAGEREF _Toc229660479 \h </w:instrText>
         </w:r>
         <w:r>
           <w:rPr>
@@ -4804,7 +4725,7 @@
           <w14:ligatures w14:val="standardContextual"/>
         </w:rPr>
       </w:pPr>
-      <w:hyperlink w:anchor="_Toc229052405" w:history="1">
+      <w:hyperlink w:anchor="_Toc229660480" w:history="1">
         <w:r>
           <w:rPr>
             <w:rStyle w:val="Hyperlink"/>
@@ -4831,7 +4752,7 @@
             <w:noProof/>
             <w:webHidden/>
           </w:rPr>
-          <w:instrText xml:space="preserve"> PAGEREF _Toc229052405 \h </w:instrText>
+          <w:instrText xml:space="preserve"> PAGEREF _Toc229660480 \h </w:instrText>
         </w:r>
         <w:r>
           <w:rPr>
@@ -4876,7 +4797,7 @@
           <w14:ligatures w14:val="standardContextual"/>
         </w:rPr>
       </w:pPr>
-      <w:hyperlink w:anchor="_Toc229052406" w:history="1">
+      <w:hyperlink w:anchor="_Toc229660481" w:history="1">
         <w:r>
           <w:rPr>
             <w:rStyle w:val="Hyperlink"/>
@@ -4903,7 +4824,7 @@
             <w:noProof/>
             <w:webHidden/>
           </w:rPr>
-          <w:instrText xml:space="preserve"> PAGEREF _Toc229052406 \h </w:instrText>
+          <w:instrText xml:space="preserve"> PAGEREF _Toc229660481 \h </w:instrText>
         </w:r>
         <w:r>
           <w:rPr>
@@ -4947,7 +4868,7 @@
           <w14:ligatures w14:val="standardContextual"/>
         </w:rPr>
       </w:pPr>
-      <w:hyperlink w:anchor="_Toc229052407" w:history="1">
+      <w:hyperlink w:anchor="_Toc229660482" w:history="1">
         <w:r>
           <w:rPr>
             <w:rStyle w:val="Hyperlink"/>
@@ -4974,7 +4895,7 @@
             <w:noProof/>
             <w:webHidden/>
           </w:rPr>
-          <w:instrText xml:space="preserve"> PAGEREF _Toc229052407 \h </w:instrText>
+          <w:instrText xml:space="preserve"> PAGEREF _Toc229660482 \h </w:instrText>
         </w:r>
         <w:r>
           <w:rPr>
@@ -5018,7 +4939,7 @@
           <w14:ligatures w14:val="standardContextual"/>
         </w:rPr>
       </w:pPr>
-      <w:hyperlink w:anchor="_Toc229052408" w:history="1">
+      <w:hyperlink w:anchor="_Toc229660483" w:history="1">
         <w:r>
           <w:rPr>
             <w:rStyle w:val="Hyperlink"/>
@@ -5045,7 +4966,7 @@
             <w:noProof/>
             <w:webHidden/>
           </w:rPr>
-          <w:instrText xml:space="preserve"> PAGEREF _Toc229052408 \h </w:instrText>
+          <w:instrText xml:space="preserve"> PAGEREF _Toc229660483 \h </w:instrText>
         </w:r>
         <w:r>
           <w:rPr>
@@ -5089,7 +5010,7 @@
           <w14:ligatures w14:val="standardContextual"/>
         </w:rPr>
       </w:pPr>
-      <w:hyperlink w:anchor="_Toc229052409" w:history="1">
+      <w:hyperlink w:anchor="_Toc229660484" w:history="1">
         <w:r>
           <w:rPr>
             <w:rStyle w:val="Hyperlink"/>
@@ -5116,7 +5037,7 @@
             <w:noProof/>
             <w:webHidden/>
           </w:rPr>
-          <w:instrText xml:space="preserve"> PAGEREF _Toc229052409 \h </w:instrText>
+          <w:instrText xml:space="preserve"> PAGEREF _Toc229660484 \h </w:instrText>
         </w:r>
         <w:r>
           <w:rPr>
@@ -5160,7 +5081,7 @@
           <w14:ligatures w14:val="standardContextual"/>
         </w:rPr>
       </w:pPr>
-      <w:hyperlink w:anchor="_Toc229052410" w:history="1">
+      <w:hyperlink w:anchor="_Toc229660485" w:history="1">
         <w:r>
           <w:rPr>
             <w:rStyle w:val="Hyperlink"/>
@@ -5187,7 +5108,7 @@
             <w:noProof/>
             <w:webHidden/>
           </w:rPr>
-          <w:instrText xml:space="preserve"> PAGEREF _Toc229052410 \h </w:instrText>
+          <w:instrText xml:space="preserve"> PAGEREF _Toc229660485 \h </w:instrText>
         </w:r>
         <w:r>
           <w:rPr>
@@ -5232,7 +5153,7 @@
           <w14:ligatures w14:val="standardContextual"/>
         </w:rPr>
       </w:pPr>
-      <w:hyperlink w:anchor="_Toc229052411" w:history="1">
+      <w:hyperlink w:anchor="_Toc229660486" w:history="1">
         <w:r>
           <w:rPr>
             <w:rStyle w:val="Hyperlink"/>
@@ -5259,7 +5180,7 @@
             <w:noProof/>
             <w:webHidden/>
           </w:rPr>
-          <w:instrText xml:space="preserve"> PAGEREF _Toc229052411 \h </w:instrText>
+          <w:instrText xml:space="preserve"> PAGEREF _Toc229660486 \h </w:instrText>
         </w:r>
         <w:r>
           <w:rPr>
@@ -5303,7 +5224,7 @@
           <w14:ligatures w14:val="standardContextual"/>
         </w:rPr>
       </w:pPr>
-      <w:hyperlink w:anchor="_Toc229052412" w:history="1">
+      <w:hyperlink w:anchor="_Toc229660487" w:history="1">
         <w:r>
           <w:rPr>
             <w:rStyle w:val="Hyperlink"/>
@@ -5330,7 +5251,7 @@
             <w:noProof/>
             <w:webHidden/>
           </w:rPr>
-          <w:instrText xml:space="preserve"> PAGEREF _Toc229052412 \h </w:instrText>
+          <w:instrText xml:space="preserve"> PAGEREF _Toc229660487 \h </w:instrText>
         </w:r>
         <w:r>
           <w:rPr>
@@ -5374,7 +5295,7 @@
           <w14:ligatures w14:val="standardContextual"/>
         </w:rPr>
       </w:pPr>
-      <w:hyperlink w:anchor="_Toc229052413" w:history="1">
+      <w:hyperlink w:anchor="_Toc229660488" w:history="1">
         <w:r>
           <w:rPr>
             <w:rStyle w:val="Hyperlink"/>
@@ -5401,7 +5322,7 @@
             <w:noProof/>
             <w:webHidden/>
           </w:rPr>
-          <w:instrText xml:space="preserve"> PAGEREF _Toc229052413 \h </w:instrText>
+          <w:instrText xml:space="preserve"> PAGEREF _Toc229660488 \h </w:instrText>
         </w:r>
         <w:r>
           <w:rPr>
@@ -5445,7 +5366,7 @@
           <w14:ligatures w14:val="standardContextual"/>
         </w:rPr>
       </w:pPr>
-      <w:hyperlink w:anchor="_Toc229052414" w:history="1">
+      <w:hyperlink w:anchor="_Toc229660489" w:history="1">
         <w:r>
           <w:rPr>
             <w:rStyle w:val="Hyperlink"/>
@@ -5472,7 +5393,7 @@
             <w:noProof/>
             <w:webHidden/>
           </w:rPr>
-          <w:instrText xml:space="preserve"> PAGEREF _Toc229052414 \h </w:instrText>
+          <w:instrText xml:space="preserve"> PAGEREF _Toc229660489 \h </w:instrText>
         </w:r>
         <w:r>
           <w:rPr>
@@ -5516,7 +5437,7 @@
           <w14:ligatures w14:val="standardContextual"/>
         </w:rPr>
       </w:pPr>
-      <w:hyperlink w:anchor="_Toc229052415" w:history="1">
+      <w:hyperlink w:anchor="_Toc229660490" w:history="1">
         <w:r>
           <w:rPr>
             <w:rStyle w:val="Hyperlink"/>
@@ -5543,7 +5464,7 @@
             <w:noProof/>
             <w:webHidden/>
           </w:rPr>
-          <w:instrText xml:space="preserve"> PAGEREF _Toc229052415 \h </w:instrText>
+          <w:instrText xml:space="preserve"> PAGEREF _Toc229660490 \h </w:instrText>
         </w:r>
         <w:r>
           <w:rPr>
@@ -5587,7 +5508,7 @@
           <w14:ligatures w14:val="standardContextual"/>
         </w:rPr>
       </w:pPr>
-      <w:hyperlink w:anchor="_Toc229052416" w:history="1">
+      <w:hyperlink w:anchor="_Toc229660491" w:history="1">
         <w:r>
           <w:rPr>
             <w:rStyle w:val="Hyperlink"/>
@@ -5614,7 +5535,7 @@
             <w:noProof/>
             <w:webHidden/>
           </w:rPr>
-          <w:instrText xml:space="preserve"> PAGEREF _Toc229052416 \h </w:instrText>
+          <w:instrText xml:space="preserve"> PAGEREF _Toc229660491 \h </w:instrText>
         </w:r>
         <w:r>
           <w:rPr>
@@ -5659,7 +5580,7 @@
           <w14:ligatures w14:val="standardContextual"/>
         </w:rPr>
       </w:pPr>
-      <w:hyperlink w:anchor="_Toc229052417" w:history="1">
+      <w:hyperlink w:anchor="_Toc229660492" w:history="1">
         <w:r>
           <w:rPr>
             <w:rStyle w:val="Hyperlink"/>
@@ -5686,7 +5607,7 @@
             <w:noProof/>
             <w:webHidden/>
           </w:rPr>
-          <w:instrText xml:space="preserve"> PAGEREF _Toc229052417 \h </w:instrText>
+          <w:instrText xml:space="preserve"> PAGEREF _Toc229660492 \h </w:instrText>
         </w:r>
         <w:r>
           <w:rPr>
@@ -5730,7 +5651,7 @@
           <w14:ligatures w14:val="standardContextual"/>
         </w:rPr>
       </w:pPr>
-      <w:hyperlink w:anchor="_Toc229052418" w:history="1">
+      <w:hyperlink w:anchor="_Toc229660493" w:history="1">
         <w:r>
           <w:rPr>
             <w:rStyle w:val="Hyperlink"/>
@@ -5757,7 +5678,7 @@
             <w:noProof/>
             <w:webHidden/>
           </w:rPr>
-          <w:instrText xml:space="preserve"> PAGEREF _Toc229052418 \h </w:instrText>
+          <w:instrText xml:space="preserve"> PAGEREF _Toc229660493 \h </w:instrText>
         </w:r>
         <w:r>
           <w:rPr>
@@ -5801,7 +5722,7 @@
           <w14:ligatures w14:val="standardContextual"/>
         </w:rPr>
       </w:pPr>
-      <w:hyperlink w:anchor="_Toc229052419" w:history="1">
+      <w:hyperlink w:anchor="_Toc229660494" w:history="1">
         <w:r>
           <w:rPr>
             <w:rStyle w:val="Hyperlink"/>
@@ -5828,7 +5749,7 @@
             <w:noProof/>
             <w:webHidden/>
           </w:rPr>
-          <w:instrText xml:space="preserve"> PAGEREF _Toc229052419 \h </w:instrText>
+          <w:instrText xml:space="preserve"> PAGEREF _Toc229660494 \h </w:instrText>
         </w:r>
         <w:r>
           <w:rPr>
@@ -5872,7 +5793,7 @@
           <w14:ligatures w14:val="standardContextual"/>
         </w:rPr>
       </w:pPr>
-      <w:hyperlink w:anchor="_Toc229052420" w:history="1">
+      <w:hyperlink w:anchor="_Toc229660495" w:history="1">
         <w:r>
           <w:rPr>
             <w:rStyle w:val="Hyperlink"/>
@@ -5899,7 +5820,7 @@
             <w:noProof/>
             <w:webHidden/>
           </w:rPr>
-          <w:instrText xml:space="preserve"> PAGEREF _Toc229052420 \h </w:instrText>
+          <w:instrText xml:space="preserve"> PAGEREF _Toc229660495 \h </w:instrText>
         </w:r>
         <w:r>
           <w:rPr>
@@ -5943,7 +5864,7 @@
           <w14:ligatures w14:val="standardContextual"/>
         </w:rPr>
       </w:pPr>
-      <w:hyperlink w:anchor="_Toc229052421" w:history="1">
+      <w:hyperlink w:anchor="_Toc229660496" w:history="1">
         <w:r>
           <w:rPr>
             <w:rStyle w:val="Hyperlink"/>
@@ -5970,7 +5891,7 @@
             <w:noProof/>
             <w:webHidden/>
           </w:rPr>
-          <w:instrText xml:space="preserve"> PAGEREF _Toc229052421 \h </w:instrText>
+          <w:instrText xml:space="preserve"> PAGEREF _Toc229660496 \h </w:instrText>
         </w:r>
         <w:r>
           <w:rPr>
@@ -6015,7 +5936,7 @@
           <w14:ligatures w14:val="standardContextual"/>
         </w:rPr>
       </w:pPr>
-      <w:hyperlink w:anchor="_Toc229052422" w:history="1">
+      <w:hyperlink w:anchor="_Toc229660497" w:history="1">
         <w:r>
           <w:rPr>
             <w:rStyle w:val="Hyperlink"/>
@@ -6030,7 +5951,7 @@
             <w:rStyle w:val="Hyperlink"/>
             <w:noProof/>
           </w:rPr>
-          <w:t xml:space="preserve"> t</w:t>
+          <w:t xml:space="preserve"> DEMO</w:t>
         </w:r>
         <w:r>
           <w:rPr>
@@ -6051,7 +5972,7 @@
             <w:noProof/>
             <w:webHidden/>
           </w:rPr>
-          <w:instrText xml:space="preserve"> PAGEREF _Toc229052422 \h </w:instrText>
+          <w:instrText xml:space="preserve"> PAGEREF _Toc229660497 \h </w:instrText>
         </w:r>
         <w:r>
           <w:rPr>
@@ -6071,7 +5992,7 @@
             <w:noProof/>
             <w:webHidden/>
           </w:rPr>
-          <w:t>22</w:t>
+          <w:t>23</w:t>
         </w:r>
         <w:r>
           <w:rPr>
@@ -6084,10 +6005,9 @@
     </w:p>
     <w:p>
       <w:pPr>
-        <w:pStyle w:val="TOC1"/>
+        <w:pStyle w:val="TOC2"/>
         <w:rPr>
           <w:rFonts w:asciiTheme="minorHAnsi" w:eastAsiaTheme="minorEastAsia" w:hAnsiTheme="minorHAnsi"/>
-          <w:b w:val="0"/>
           <w:noProof/>
           <w:kern w:val="2"/>
           <w:sz w:val="22"/>
@@ -6096,13 +6016,22 @@
           <w14:ligatures w14:val="standardContextual"/>
         </w:rPr>
       </w:pPr>
-      <w:hyperlink w:anchor="_Toc229052423" w:history="1">
+      <w:hyperlink w:anchor="_Toc229660498" w:history="1">
         <w:r>
           <w:rPr>
             <w:rStyle w:val="Hyperlink"/>
-            <w:noProof/>
-          </w:rPr>
-          <w:t>REFERENCES</w:t>
+            <w:rFonts w:hAnsi="Symbol"/>
+            <w:noProof/>
+            <w:lang w:eastAsia="ko-KR"/>
+          </w:rPr>
+          <w:t>7.1</w:t>
+        </w:r>
+        <w:r>
+          <w:rPr>
+            <w:rStyle w:val="Hyperlink"/>
+            <w:noProof/>
+          </w:rPr>
+          <w:t xml:space="preserve"> Database and Source Code</w:t>
         </w:r>
         <w:r>
           <w:rPr>
@@ -6123,7 +6052,78 @@
             <w:noProof/>
             <w:webHidden/>
           </w:rPr>
-          <w:instrText xml:space="preserve"> PAGEREF _Toc229052423 \h </w:instrText>
+          <w:instrText xml:space="preserve"> PAGEREF _Toc229660498 \h </w:instrText>
+        </w:r>
+        <w:r>
+          <w:rPr>
+            <w:noProof/>
+            <w:webHidden/>
+          </w:rPr>
+        </w:r>
+        <w:r>
+          <w:rPr>
+            <w:noProof/>
+            <w:webHidden/>
+          </w:rPr>
+          <w:fldChar w:fldCharType="separate"/>
+        </w:r>
+        <w:r>
+          <w:rPr>
+            <w:noProof/>
+            <w:webHidden/>
+          </w:rPr>
+          <w:t>23</w:t>
+        </w:r>
+        <w:r>
+          <w:rPr>
+            <w:noProof/>
+            <w:webHidden/>
+          </w:rPr>
+          <w:fldChar w:fldCharType="end"/>
+        </w:r>
+      </w:hyperlink>
+    </w:p>
+    <w:p>
+      <w:pPr>
+        <w:pStyle w:val="TOC2"/>
+        <w:rPr>
+          <w:rFonts w:asciiTheme="minorHAnsi" w:eastAsiaTheme="minorEastAsia" w:hAnsiTheme="minorHAnsi"/>
+          <w:noProof/>
+          <w:kern w:val="2"/>
+          <w:sz w:val="22"/>
+          <w:szCs w:val="22"/>
+          <w:lang w:eastAsia="ko-KR"/>
+          <w14:ligatures w14:val="standardContextual"/>
+        </w:rPr>
+      </w:pPr>
+      <w:hyperlink w:anchor="_Toc229660499" w:history="1">
+        <w:r>
+          <w:rPr>
+            <w:rStyle w:val="Hyperlink"/>
+            <w:noProof/>
+          </w:rPr>
+          <w:t>7.2 Testing</w:t>
+        </w:r>
+        <w:r>
+          <w:rPr>
+            <w:noProof/>
+            <w:webHidden/>
+          </w:rPr>
+          <w:tab/>
+        </w:r>
+        <w:r>
+          <w:rPr>
+            <w:noProof/>
+            <w:webHidden/>
+          </w:rPr>
+          <w:fldChar w:fldCharType="begin"/>
+        </w:r>
+        <w:r>
+          <w:rPr>
+            <w:noProof/>
+            <w:webHidden/>
+          </w:rPr>
+          <w:instrText xml:space="preserve"> PAGEREF _Toc229660499 \h </w:instrText>
         </w:r>
         <w:r>
           <w:rPr>
@@ -6182,7 +6182,7 @@
           <w:szCs w:val="26"/>
         </w:rPr>
       </w:pPr>
-      <w:bookmarkStart w:id="1" w:name="_Toc229052382"/>
+      <w:bookmarkStart w:id="1" w:name="_Toc229660458"/>
       <w:r>
         <w:rPr>
           <w:lang w:val="en-US"/>
@@ -6375,7 +6375,7 @@
         </w:numPr>
         <w:jc w:val="center"/>
       </w:pPr>
-      <w:bookmarkStart w:id="2" w:name="_Toc229052383"/>
+      <w:bookmarkStart w:id="2" w:name="_Toc229660459"/>
       <w:r>
         <w:rPr>
           <w:lang w:val="en-US"/>
@@ -6618,7 +6618,7 @@
       <w:pPr>
         <w:pStyle w:val="Heading1"/>
       </w:pPr>
-      <w:bookmarkStart w:id="3" w:name="_Toc229052384"/>
+      <w:bookmarkStart w:id="3" w:name="_Toc229660460"/>
       <w:r>
         <w:rPr>
           <w:bCs/>
@@ -6633,7 +6633,7 @@
       <w:pPr>
         <w:pStyle w:val="Heading2"/>
       </w:pPr>
-      <w:bookmarkStart w:id="4" w:name="_Toc229052385"/>
+      <w:bookmarkStart w:id="4" w:name="_Toc229660461"/>
       <w:r>
         <w:rPr>
           <w:lang w:val="en-US"/>
@@ -6661,7 +6661,7 @@
       <w:r>
         <w:br w:type="page"/>
       </w:r>
-      <w:bookmarkStart w:id="5" w:name="_Toc229052386"/>
+      <w:bookmarkStart w:id="5" w:name="_Toc229660462"/>
       <w:r>
         <w:rPr>
           <w:lang w:val="en-US"/>
@@ -6689,7 +6689,7 @@
       <w:pPr>
         <w:pStyle w:val="Heading2"/>
       </w:pPr>
-      <w:bookmarkStart w:id="6" w:name="_Toc229052387"/>
+      <w:bookmarkStart w:id="6" w:name="_Toc229660463"/>
       <w:r>
         <w:rPr>
           <w:lang w:val="en-US"/>
@@ -6841,7 +6841,7 @@
           <w:lang w:val="en-US"/>
         </w:rPr>
       </w:pPr>
-      <w:bookmarkStart w:id="7" w:name="_Toc229052389"/>
+      <w:bookmarkStart w:id="7" w:name="_Toc229660464"/>
       <w:r>
         <w:rPr>
           <w:lang w:val="en-US"/>
@@ -6855,7 +6855,7 @@
       <w:pPr>
         <w:pStyle w:val="Heading2"/>
       </w:pPr>
-      <w:bookmarkStart w:id="8" w:name="_Toc229052390"/>
+      <w:bookmarkStart w:id="8" w:name="_Toc229660465"/>
       <w:r>
         <w:rPr>
           <w:lang w:val="en-US"/>
@@ -7091,7 +7091,7 @@
           <w:lang w:val="en-US"/>
         </w:rPr>
       </w:pPr>
-      <w:bookmarkStart w:id="9" w:name="_Toc229052391"/>
+      <w:bookmarkStart w:id="9" w:name="_Toc229660466"/>
       <w:r>
         <w:rPr>
           <w:lang w:val="en-US"/>
@@ -7120,7 +7120,7 @@
           <w:lang w:val="en-US"/>
         </w:rPr>
       </w:pPr>
-      <w:bookmarkStart w:id="10" w:name="_Toc229052392"/>
+      <w:bookmarkStart w:id="10" w:name="_Toc229660467"/>
       <w:r>
         <w:rPr>
           <w:lang w:val="en-US"/>
@@ -7278,7 +7278,7 @@
           <w:lang w:val="en-US"/>
         </w:rPr>
       </w:pPr>
-      <w:bookmarkStart w:id="11" w:name="_Toc229052393"/>
+      <w:bookmarkStart w:id="11" w:name="_Toc229660468"/>
       <w:r>
         <w:rPr>
           <w:lang w:val="en-US"/>
@@ -7449,7 +7449,7 @@
           <w:szCs w:val="32"/>
         </w:rPr>
       </w:pPr>
-      <w:bookmarkStart w:id="12" w:name="_Toc229052394"/>
+      <w:bookmarkStart w:id="12" w:name="_Toc229660469"/>
       <w:r>
         <w:rPr>
           <w:lang w:val="en-US"/>
@@ -7490,7 +7490,7 @@
       <w:pPr>
         <w:pStyle w:val="Heading2"/>
       </w:pPr>
-      <w:bookmarkStart w:id="13" w:name="_Toc229052395"/>
+      <w:bookmarkStart w:id="13" w:name="_Toc229660470"/>
       <w:r>
         <w:t>Monitoring, Reporting, and Controlling Mechanisms</w:t>
       </w:r>
@@ -7526,7 +7526,7 @@
           <w:szCs w:val="32"/>
         </w:rPr>
       </w:pPr>
-      <w:bookmarkStart w:id="14" w:name="_Toc229052396"/>
+      <w:bookmarkStart w:id="14" w:name="_Toc229660471"/>
       <w:r>
         <w:rPr>
           <w:lang w:val="en-US"/>
@@ -7567,7 +7567,7 @@
       <w:r>
         <w:t xml:space="preserve"> </w:t>
       </w:r>
-      <w:bookmarkStart w:id="15" w:name="_Toc229052397"/>
+      <w:bookmarkStart w:id="15" w:name="_Toc229660472"/>
       <w:r>
         <w:t>Evidence of Configuration Management</w:t>
       </w:r>
@@ -7605,7 +7605,7 @@
       <w:pPr>
         <w:pStyle w:val="Heading2"/>
       </w:pPr>
-      <w:bookmarkStart w:id="16" w:name="_Toc229052398"/>
+      <w:bookmarkStart w:id="16" w:name="_Toc229660473"/>
       <w:r>
         <w:t>Impact of the project on individuals and organizations</w:t>
       </w:r>
@@ -7635,7 +7635,7 @@
       <w:pPr>
         <w:pStyle w:val="Heading1"/>
       </w:pPr>
-      <w:bookmarkStart w:id="17" w:name="_Toc229052399"/>
+      <w:bookmarkStart w:id="17" w:name="_Toc229660474"/>
       <w:r>
         <w:rPr>
           <w:lang w:val="en-US"/>
@@ -7649,7 +7649,7 @@
       <w:pPr>
         <w:pStyle w:val="Heading2"/>
       </w:pPr>
-      <w:bookmarkStart w:id="18" w:name="_Toc229052400"/>
+      <w:bookmarkStart w:id="18" w:name="_Toc229660475"/>
       <w:r>
         <w:t xml:space="preserve">Stakeholders for the </w:t>
       </w:r>
@@ -7765,7 +7765,7 @@
           <w:lang w:val="en-US"/>
         </w:rPr>
       </w:pPr>
-      <w:bookmarkStart w:id="19" w:name="_Toc229052401"/>
+      <w:bookmarkStart w:id="19" w:name="_Toc229660476"/>
       <w:r>
         <w:rPr>
           <w:lang w:val="en-US"/>
@@ -7778,7 +7778,7 @@
       <w:pPr>
         <w:pStyle w:val="Heading3"/>
       </w:pPr>
-      <w:bookmarkStart w:id="20" w:name="_Toc229052402"/>
+      <w:bookmarkStart w:id="20" w:name="_Toc229660477"/>
       <w:r>
         <w:t>Graphical Use Case Modelling</w:t>
       </w:r>
@@ -7885,7 +7885,7 @@
       <w:pPr>
         <w:pStyle w:val="Heading3"/>
       </w:pPr>
-      <w:bookmarkStart w:id="22" w:name="_Toc229052403"/>
+      <w:bookmarkStart w:id="22" w:name="_Toc229660478"/>
       <w:r>
         <w:t>Textual Description for each Use Case</w:t>
       </w:r>
@@ -8739,7 +8739,7 @@
       <w:pPr>
         <w:pStyle w:val="Heading2"/>
       </w:pPr>
-      <w:bookmarkStart w:id="23" w:name="_Toc229052404"/>
+      <w:bookmarkStart w:id="23" w:name="_Toc229660479"/>
       <w:r>
         <w:rPr>
           <w:lang w:val="en-US"/>
@@ -8952,7 +8952,7 @@
       <w:pPr>
         <w:pStyle w:val="Heading2"/>
       </w:pPr>
-      <w:bookmarkStart w:id="24" w:name="_Toc229052405"/>
+      <w:bookmarkStart w:id="24" w:name="_Toc229660480"/>
       <w:r>
         <w:rPr>
           <w:lang w:val="en-US"/>
@@ -9099,7 +9099,7 @@
       <w:pPr>
         <w:pStyle w:val="Heading1"/>
       </w:pPr>
-      <w:bookmarkStart w:id="25" w:name="_Toc229052406"/>
+      <w:bookmarkStart w:id="25" w:name="_Toc229660481"/>
       <w:r>
         <w:rPr>
           <w:lang w:val="en-US"/>
@@ -9112,7 +9112,7 @@
       <w:pPr>
         <w:pStyle w:val="Heading2"/>
       </w:pPr>
-      <w:bookmarkStart w:id="26" w:name="_Toc229052407"/>
+      <w:bookmarkStart w:id="26" w:name="_Toc229660482"/>
       <w:r>
         <w:t xml:space="preserve">Architectural </w:t>
       </w:r>
@@ -9154,7 +9154,7 @@
       <w:pPr>
         <w:pStyle w:val="Heading2"/>
       </w:pPr>
-      <w:bookmarkStart w:id="27" w:name="_Toc229052408"/>
+      <w:bookmarkStart w:id="27" w:name="_Toc229660483"/>
       <w:r>
         <w:t xml:space="preserve">Architectural </w:t>
       </w:r>
@@ -9404,7 +9404,7 @@
       <w:pPr>
         <w:pStyle w:val="Heading2"/>
       </w:pPr>
-      <w:bookmarkStart w:id="29" w:name="_Toc229052409"/>
+      <w:bookmarkStart w:id="29" w:name="_Toc229660484"/>
       <w:r>
         <w:t xml:space="preserve">Technology, </w:t>
       </w:r>
@@ -9634,7 +9634,7 @@
       <w:pPr>
         <w:pStyle w:val="Heading2"/>
       </w:pPr>
-      <w:bookmarkStart w:id="30" w:name="_Toc229052410"/>
+      <w:bookmarkStart w:id="30" w:name="_Toc229660485"/>
       <w:r>
         <w:t xml:space="preserve">Rationale for </w:t>
       </w:r>
@@ -9833,7 +9833,7 @@
       <w:pPr>
         <w:pStyle w:val="Heading1"/>
       </w:pPr>
-      <w:bookmarkStart w:id="31" w:name="_Toc229052411"/>
+      <w:bookmarkStart w:id="31" w:name="_Toc229660486"/>
       <w:r>
         <w:rPr>
           <w:lang w:val="en-US"/>
@@ -9846,7 +9846,7 @@
       <w:pPr>
         <w:pStyle w:val="Heading2"/>
       </w:pPr>
-      <w:bookmarkStart w:id="32" w:name="_Toc229052412"/>
+      <w:bookmarkStart w:id="32" w:name="_Toc229660487"/>
       <w:r>
         <w:t xml:space="preserve">Database </w:t>
       </w:r>
@@ -10101,7 +10101,7 @@
       <w:pPr>
         <w:pStyle w:val="Heading2"/>
       </w:pPr>
-      <w:bookmarkStart w:id="33" w:name="_Toc229052413"/>
+      <w:bookmarkStart w:id="33" w:name="_Toc229660488"/>
       <w:r>
         <w:t xml:space="preserve">Static model - </w:t>
       </w:r>
@@ -10784,7 +10784,7 @@
       <w:pPr>
         <w:pStyle w:val="Heading2"/>
       </w:pPr>
-      <w:bookmarkStart w:id="34" w:name="_Toc229052414"/>
+      <w:bookmarkStart w:id="34" w:name="_Toc229660489"/>
       <w:r>
         <w:t xml:space="preserve">Dynamic </w:t>
       </w:r>
@@ -10976,7 +10976,7 @@
       <w:pPr>
         <w:pStyle w:val="Heading2"/>
       </w:pPr>
-      <w:bookmarkStart w:id="35" w:name="_Toc229052415"/>
+      <w:bookmarkStart w:id="35" w:name="_Toc229660490"/>
       <w:r>
         <w:t>Rationale for</w:t>
       </w:r>
@@ -11133,7 +11133,7 @@
       <w:pPr>
         <w:pStyle w:val="Heading2"/>
       </w:pPr>
-      <w:bookmarkStart w:id="36" w:name="_Toc229052416"/>
+      <w:bookmarkStart w:id="36" w:name="_Toc229660491"/>
       <w:r>
         <w:t xml:space="preserve">Traceability from </w:t>
       </w:r>
@@ -11518,7 +11518,7 @@
       <w:pPr>
         <w:pStyle w:val="Heading1"/>
       </w:pPr>
-      <w:bookmarkStart w:id="37" w:name="_Toc229052417"/>
+      <w:bookmarkStart w:id="37" w:name="_Toc229660492"/>
       <w:r>
         <w:rPr>
           <w:lang w:val="en-US"/>
@@ -11531,7 +11531,7 @@
       <w:pPr>
         <w:pStyle w:val="Heading2"/>
       </w:pPr>
-      <w:bookmarkStart w:id="38" w:name="_Toc229052418"/>
+      <w:bookmarkStart w:id="38" w:name="_Toc229660493"/>
       <w:r>
         <w:lastRenderedPageBreak/>
         <w:t>Requirements/</w:t>
@@ -14176,7 +14176,7 @@
       <w:pPr>
         <w:pStyle w:val="Heading2"/>
       </w:pPr>
-      <w:bookmarkStart w:id="39" w:name="_Toc229052419"/>
+      <w:bookmarkStart w:id="39" w:name="_Toc229660494"/>
       <w:r>
         <w:t xml:space="preserve">Traceability of </w:t>
       </w:r>
@@ -14660,7 +14660,7 @@
       <w:pPr>
         <w:pStyle w:val="Heading2"/>
       </w:pPr>
-      <w:bookmarkStart w:id="41" w:name="_Toc229052420"/>
+      <w:bookmarkStart w:id="41" w:name="_Toc229660495"/>
       <w:r>
         <w:t xml:space="preserve">Techniques </w:t>
       </w:r>
@@ -14911,7 +14911,7 @@
       <w:pPr>
         <w:pStyle w:val="Heading2"/>
       </w:pPr>
-      <w:bookmarkStart w:id="42" w:name="_Toc229052421"/>
+      <w:bookmarkStart w:id="42" w:name="_Toc229660496"/>
       <w:r>
         <w:t xml:space="preserve">Assessment of </w:t>
       </w:r>
@@ -15274,19 +15274,19 @@
           <w:lang w:eastAsia="ko-KR"/>
         </w:rPr>
       </w:pPr>
-      <w:bookmarkStart w:id="43" w:name="_Toc229052422"/>
+      <w:bookmarkStart w:id="43" w:name="_Toc229660497"/>
       <w:r>
         <w:rPr>
           <w:lang w:val="en-US"/>
         </w:rPr>
         <w:lastRenderedPageBreak/>
-        <w:t>t</w:t>
+        <w:t>DEMO</w:t>
       </w:r>
       <w:bookmarkEnd w:id="43"/>
     </w:p>
     <w:p>
       <w:pPr>
-        <w:pStyle w:val="Heading1"/>
+        <w:pStyle w:val="Heading2"/>
         <w:rPr>
           <w:rFonts w:hAnsi="Symbol"/>
           <w:sz w:val="26"/>
@@ -15294,11 +15294,57 @@
           <w:lang w:eastAsia="ko-KR"/>
         </w:rPr>
       </w:pPr>
+      <w:bookmarkStart w:id="44" w:name="_Toc229660498"/>
+      <w:r>
+        <w:rPr>
+          <w:lang w:val="en-US"/>
+        </w:rPr>
+        <w:t>Database and Source Code</w:t>
+      </w:r>
+      <w:bookmarkEnd w:id="44"/>
+    </w:p>
+    <w:p>
+      <w:pPr>
+        <w:pStyle w:val="Nidungvnbn"/>
+      </w:pPr>
+      <w:proofErr w:type="spellStart"/>
+      <w:r>
+        <w:t>Github</w:t>
+      </w:r>
+      <w:proofErr w:type="spellEnd"/>
+      <w:r>
+        <w:t xml:space="preserve"> Repository URL: </w:t>
+      </w:r>
+      <w:hyperlink r:id="rId21" w:history="1">
+        <w:r>
+          <w:rPr>
+            <w:rStyle w:val="Hyperlink"/>
+          </w:rPr>
+          <w:t>https://github.com/LyTinHoa/Computer-Shop-Management-Software</w:t>
+        </w:r>
+      </w:hyperlink>
+    </w:p>
+    <w:p>
+      <w:pPr>
+        <w:pStyle w:val="Heading2"/>
+      </w:pPr>
+      <w:bookmarkStart w:id="45" w:name="_Toc229660499"/>
+      <w:r>
+        <w:rPr>
+          <w:lang w:val="en-US"/>
+        </w:rPr>
+        <w:t>Testing</w:t>
+      </w:r>
+      <w:bookmarkEnd w:id="45"/>
+    </w:p>
+    <w:p>
+      <w:pPr>
+        <w:pStyle w:val="Nidungvnbn"/>
+      </w:pPr>
       <w:r>
         <w:br w:type="page"/>
       </w:r>
     </w:p>
-    <w:bookmarkStart w:id="44" w:name="_Toc229052423" w:displacedByCustomXml="next"/>
     <w:sdt>
       <w:sdtPr>
         <w:rPr>
@@ -15311,7 +15357,6 @@
         <w:bibliography/>
       </w:sdtPr>
       <w:sdtContent>
-        <w:bookmarkEnd w:id="44" w:displacedByCustomXml="prev"/>
         <w:p>
           <w:pPr>
             <w:pStyle w:val="Heading1"/>
@@ -15705,7 +15750,7 @@
   <w:abstractNum w:abstractNumId="1" w15:restartNumberingAfterBreak="0">
     <w:nsid w:val="121724AE"/>
     <w:multiLevelType w:val="multilevel"/>
-    <w:tmpl w:val="1F9E6F6C"/>
+    <w:tmpl w:val="39D60EA0"/>
     <w:lvl w:ilvl="0">
       <w:start w:val="1"/>
       <w:numFmt w:val="decimal"/>
@@ -15718,6 +15763,8 @@
       </w:pPr>
       <w:rPr>
         <w:rFonts w:hint="default"/>
+        <w:sz w:val="32"/>
+        <w:szCs w:val="32"/>
       </w:rPr>
     </w:lvl>
     <w:lvl w:ilvl="1">

</xml_diff>

<commit_message>
Docs: add unit testing in reports. Add: unit testing project
</commit_message>
<xml_diff>
--- a/reports/524H0015_524H0012_524H0134.docx
+++ b/reports/524H0015_524H0012_524H0134.docx
@@ -1,6 +1,6 @@
 
 <file path=word/document.xml><?xml version="1.0" encoding="utf-8"?>
-<w:document xmlns:wpc="http://schemas.microsoft.com/office/word/2010/wordprocessingCanvas" xmlns:cx="http://schemas.microsoft.com/office/drawing/2014/chartex" xmlns:cx1="http://schemas.microsoft.com/office/drawing/2015/9/8/chartex" xmlns:cx2="http://schemas.microsoft.com/office/drawing/2015/10/21/chartex" xmlns:cx3="http://schemas.microsoft.com/office/drawing/2016/5/9/chartex" xmlns:cx4="http://schemas.microsoft.com/office/drawing/2016/5/10/chartex" xmlns:cx5="http://schemas.microsoft.com/office/drawing/2016/5/11/chartex" xmlns:cx6="http://schemas.microsoft.com/office/drawing/2016/5/12/chartex" xmlns:cx7="http://schemas.microsoft.com/office/drawing/2016/5/13/chartex" xmlns:cx8="http://schemas.microsoft.com/office/drawing/2016/5/14/chartex" xmlns:mc="http://schemas.openxmlformats.org/markup-compatibility/2006" xmlns:aink="http://schemas.microsoft.com/office/drawing/2016/ink" xmlns:am3d="http://schemas.microsoft.com/office/drawing/2017/model3d" xmlns:o="urn:schemas-microsoft-com:office:office" xmlns:oel="http://schemas.microsoft.com/office/2019/extlst" xmlns:r="http://schemas.openxmlformats.org/officeDocument/2006/relationships" xmlns:m="http://schemas.openxmlformats.org/officeDocument/2006/math" xmlns:v="urn:schemas-microsoft-com:vml" xmlns:wp14="http://schemas.microsoft.com/office/word/2010/wordprocessingDrawing" xmlns:wp="http://schemas.openxmlformats.org/drawingml/2006/wordprocessingDrawing" xmlns:w10="urn:schemas-microsoft-com:office:word" xmlns:w="http://schemas.openxmlformats.org/wordprocessingml/2006/main" xmlns:w14="http://schemas.microsoft.com/office/word/2010/wordml" xmlns:w15="http://schemas.microsoft.com/office/word/2012/wordml" xmlns:w16cex="http://schemas.microsoft.com/office/word/2018/wordml/cex" xmlns:w16cid="http://schemas.microsoft.com/office/word/2016/wordml/cid" xmlns:w16="http://schemas.microsoft.com/office/word/2018/wordml" xmlns:w16du="http://schemas.microsoft.com/office/word/2023/wordml/word16du" xmlns:w16sdtdh="http://schemas.microsoft.com/office/word/2020/wordml/sdtdatahash" xmlns:w16se="http://schemas.microsoft.com/office/word/2015/wordml/symex" xmlns:wpg="http://schemas.microsoft.com/office/word/2010/wordprocessingGroup" xmlns:wpi="http://schemas.microsoft.com/office/word/2010/wordprocessingInk" xmlns:wne="http://schemas.microsoft.com/office/word/2006/wordml" xmlns:wps="http://schemas.microsoft.com/office/word/2010/wordprocessingShape" mc:Ignorable="w14 w15 w16se w16cid w16 w16cex w16sdtdh wp14">
+<w:document xmlns:wpc="http://schemas.microsoft.com/office/word/2010/wordprocessingCanvas" xmlns:cx="http://schemas.microsoft.com/office/drawing/2014/chartex" xmlns:cx1="http://schemas.microsoft.com/office/drawing/2015/9/8/chartex" xmlns:cx2="http://schemas.microsoft.com/office/drawing/2015/10/21/chartex" xmlns:cx3="http://schemas.microsoft.com/office/drawing/2016/5/9/chartex" xmlns:cx4="http://schemas.microsoft.com/office/drawing/2016/5/10/chartex" xmlns:cx5="http://schemas.microsoft.com/office/drawing/2016/5/11/chartex" xmlns:cx6="http://schemas.microsoft.com/office/drawing/2016/5/12/chartex" xmlns:cx7="http://schemas.microsoft.com/office/drawing/2016/5/13/chartex" xmlns:cx8="http://schemas.microsoft.com/office/drawing/2016/5/14/chartex" xmlns:mc="http://schemas.openxmlformats.org/markup-compatibility/2006" xmlns:aink="http://schemas.microsoft.com/office/drawing/2016/ink" xmlns:am3d="http://schemas.microsoft.com/office/drawing/2017/model3d" xmlns:o="urn:schemas-microsoft-com:office:office" xmlns:oel="http://schemas.microsoft.com/office/2019/extlst" xmlns:r="http://schemas.openxmlformats.org/officeDocument/2006/relationships" xmlns:m="http://schemas.openxmlformats.org/officeDocument/2006/math" xmlns:v="urn:schemas-microsoft-com:vml" xmlns:wp14="http://schemas.microsoft.com/office/word/2010/wordprocessingDrawing" xmlns:wp="http://schemas.openxmlformats.org/drawingml/2006/wordprocessingDrawing" xmlns:w10="urn:schemas-microsoft-com:office:word" xmlns:w="http://schemas.openxmlformats.org/wordprocessingml/2006/main" xmlns:w14="http://schemas.microsoft.com/office/word/2010/wordml" xmlns:w15="http://schemas.microsoft.com/office/word/2012/wordml" xmlns:w16cex="http://schemas.microsoft.com/office/word/2018/wordml/cex" xmlns:w16cid="http://schemas.microsoft.com/office/word/2016/wordml/cid" xmlns:w16="http://schemas.microsoft.com/office/word/2018/wordml" xmlns:w16du="http://schemas.microsoft.com/office/word/2023/wordml/word16du" xmlns:w16sdtdh="http://schemas.microsoft.com/office/word/2020/wordml/sdtdatahash" xmlns:w16sdtfl="http://schemas.microsoft.com/office/word/2024/wordml/sdtformatlock" xmlns:w16se="http://schemas.microsoft.com/office/word/2015/wordml/symex" xmlns:wpg="http://schemas.microsoft.com/office/word/2010/wordprocessingGroup" xmlns:wpi="http://schemas.microsoft.com/office/word/2010/wordprocessingInk" xmlns:wne="http://schemas.microsoft.com/office/word/2006/wordml" xmlns:wps="http://schemas.microsoft.com/office/word/2010/wordprocessingShape" mc:Ignorable="w14 w15 w16se w16cid w16 w16cex w16sdtdh w16sdtfl w16du wp14">
   <w:body>
     <w:p>
       <w:pPr>
@@ -978,19 +978,8 @@
           <w:szCs w:val="28"/>
           <w:lang w:val="en-US"/>
         </w:rPr>
-        <w:t xml:space="preserve">Nguyen Ngoc </w:t>
-      </w:r>
-      <w:proofErr w:type="spellStart"/>
-      <w:r>
-        <w:rPr>
-          <w:b/>
-          <w:sz w:val="28"/>
-          <w:szCs w:val="28"/>
-          <w:lang w:val="en-US"/>
-        </w:rPr>
-        <w:t>Phien</w:t>
-      </w:r>
-      <w:proofErr w:type="spellEnd"/>
+        <w:t>Nguyen Ngoc Phien</w:t>
+      </w:r>
       <w:r>
         <w:rPr>
           <w:b/>
@@ -1108,25 +1097,7 @@
           <w:sz w:val="26"/>
           <w:szCs w:val="26"/>
         </w:rPr>
-        <w:t xml:space="preserve">We would like to express our deepest appreciation to our instructor, Ph.D. Nguyen Ngoc </w:t>
-      </w:r>
-      <w:proofErr w:type="spellStart"/>
-      <w:r>
-        <w:rPr>
-          <w:color w:val="000000"/>
-          <w:sz w:val="26"/>
-          <w:szCs w:val="26"/>
-        </w:rPr>
-        <w:t>Phien</w:t>
-      </w:r>
-      <w:proofErr w:type="spellEnd"/>
-      <w:r>
-        <w:rPr>
-          <w:color w:val="000000"/>
-          <w:sz w:val="26"/>
-          <w:szCs w:val="26"/>
-        </w:rPr>
-        <w:t>, for his continuous support and invaluable guidance throughout the development of this Final Term Report on Software Engineering. His comprehensive lectures and rigorous academic standards provided us with the foundational knowledge required to successfully implement complex concepts, including the Model-View-Controller architectural pattern, relational database design, and C# WinForms application development.</w:t>
+        <w:t>We would like to express our deepest appreciation to our instructor, Ph.D. Nguyen Ngoc Phien, for his continuous support and invaluable guidance throughout the development of this Final Term Report on Software Engineering. His comprehensive lectures and rigorous academic standards provided us with the foundational knowledge required to successfully implement complex concepts, including the Model-View-Controller architectural pattern, relational database design, and C# WinForms application development.</w:t>
       </w:r>
     </w:p>
     <w:p>
@@ -2144,18 +2115,8 @@
           <w:sz w:val="26"/>
           <w:szCs w:val="26"/>
         </w:rPr>
-        <w:t xml:space="preserve">Ph.D. Nguyen Ngoc </w:t>
-      </w:r>
-      <w:proofErr w:type="spellStart"/>
-      <w:r>
-        <w:rPr>
-          <w:color w:val="000000"/>
-          <w:sz w:val="26"/>
-          <w:szCs w:val="26"/>
-        </w:rPr>
-        <w:t>Phien</w:t>
-      </w:r>
-      <w:proofErr w:type="spellEnd"/>
+        <w:t>Ph.D. Nguyen Ngoc Phien</w:t>
+      </w:r>
       <w:r>
         <w:rPr>
           <w:sz w:val="26"/>
@@ -6890,25 +6851,7 @@
           <w:szCs w:val="26"/>
           <w:lang w:eastAsia="ko-KR"/>
         </w:rPr>
-        <w:t xml:space="preserve"> </w:t>
-      </w:r>
-      <w:proofErr w:type="spellStart"/>
-      <w:r>
-        <w:rPr>
-          <w:sz w:val="26"/>
-          <w:szCs w:val="26"/>
-          <w:lang w:eastAsia="ko-KR"/>
-        </w:rPr>
-        <w:t>Trần</w:t>
-      </w:r>
-      <w:proofErr w:type="spellEnd"/>
-      <w:r>
-        <w:rPr>
-          <w:sz w:val="26"/>
-          <w:szCs w:val="26"/>
-          <w:lang w:eastAsia="ko-KR"/>
-        </w:rPr>
-        <w:t xml:space="preserve"> Quang Duy – Responsible for overall project coordination and database design. </w:t>
+        <w:t xml:space="preserve"> Trần Quang Duy – Responsible for overall project coordination and database design. </w:t>
       </w:r>
     </w:p>
     <w:p>
@@ -6937,43 +6880,7 @@
           <w:szCs w:val="26"/>
           <w:lang w:eastAsia="ko-KR"/>
         </w:rPr>
-        <w:t xml:space="preserve"> Lý </w:t>
-      </w:r>
-      <w:proofErr w:type="spellStart"/>
-      <w:r>
-        <w:rPr>
-          <w:sz w:val="26"/>
-          <w:szCs w:val="26"/>
-          <w:lang w:eastAsia="ko-KR"/>
-        </w:rPr>
-        <w:t>Tín</w:t>
-      </w:r>
-      <w:proofErr w:type="spellEnd"/>
-      <w:r>
-        <w:rPr>
-          <w:sz w:val="26"/>
-          <w:szCs w:val="26"/>
-          <w:lang w:eastAsia="ko-KR"/>
-        </w:rPr>
-        <w:t xml:space="preserve"> </w:t>
-      </w:r>
-      <w:proofErr w:type="spellStart"/>
-      <w:r>
-        <w:rPr>
-          <w:sz w:val="26"/>
-          <w:szCs w:val="26"/>
-          <w:lang w:eastAsia="ko-KR"/>
-        </w:rPr>
-        <w:t>Hòa</w:t>
-      </w:r>
-      <w:proofErr w:type="spellEnd"/>
-      <w:r>
-        <w:rPr>
-          <w:sz w:val="26"/>
-          <w:szCs w:val="26"/>
-          <w:lang w:eastAsia="ko-KR"/>
-        </w:rPr>
-        <w:t xml:space="preserve"> – Focused on controller logic and implementing business rules. </w:t>
+        <w:t xml:space="preserve"> Lý Tín Hòa – Focused on controller logic and implementing business rules. </w:t>
       </w:r>
     </w:p>
     <w:p>
@@ -7002,25 +6909,7 @@
           <w:szCs w:val="26"/>
           <w:lang w:eastAsia="ko-KR"/>
         </w:rPr>
-        <w:t xml:space="preserve"> Hà </w:t>
-      </w:r>
-      <w:proofErr w:type="spellStart"/>
-      <w:r>
-        <w:rPr>
-          <w:sz w:val="26"/>
-          <w:szCs w:val="26"/>
-          <w:lang w:eastAsia="ko-KR"/>
-        </w:rPr>
-        <w:t>Dư</w:t>
-      </w:r>
-      <w:proofErr w:type="spellEnd"/>
-      <w:r>
-        <w:rPr>
-          <w:sz w:val="26"/>
-          <w:szCs w:val="26"/>
-          <w:lang w:eastAsia="ko-KR"/>
-        </w:rPr>
-        <w:t xml:space="preserve"> Tuấn – Focused on UI/UX design and frontend implementation. </w:t>
+        <w:t xml:space="preserve"> Hà Dư Tuấn – Focused on UI/UX design and frontend implementation. </w:t>
       </w:r>
     </w:p>
     <w:p>
@@ -7051,23 +6940,13 @@
         </w:rPr>
         <w:t xml:space="preserve"> </w:t>
       </w:r>
-      <w:proofErr w:type="spellStart"/>
       <w:r>
         <w:rPr>
           <w:sz w:val="26"/>
           <w:szCs w:val="26"/>
           <w:lang w:eastAsia="ko-KR"/>
         </w:rPr>
-        <w:t>Trần</w:t>
-      </w:r>
-      <w:proofErr w:type="spellEnd"/>
-      <w:r>
-        <w:rPr>
-          <w:sz w:val="26"/>
-          <w:szCs w:val="26"/>
-          <w:lang w:eastAsia="ko-KR"/>
-        </w:rPr>
-        <w:t xml:space="preserve"> Quang Duy</w:t>
+        <w:t>Trần Quang Duy</w:t>
       </w:r>
       <w:r>
         <w:rPr>
@@ -7540,15 +7419,7 @@
         <w:pStyle w:val="Nidungvnbn"/>
       </w:pPr>
       <w:r>
-        <w:t xml:space="preserve">The software development process adheres to strict C# Coding Conventions, utilizing </w:t>
-      </w:r>
-      <w:proofErr w:type="spellStart"/>
-      <w:r>
-        <w:t>PascalCase</w:t>
-      </w:r>
-      <w:proofErr w:type="spellEnd"/>
-      <w:r>
-        <w:t xml:space="preserve"> for method names and camelCase for variables. Furthermore, the project documentation complies with IEEE standards for technical writing.</w:t>
+        <w:t>The software development process adheres to strict C# Coding Conventions, utilizing PascalCase for method names and camelCase for variables. Furthermore, the project documentation complies with IEEE standards for technical writing.</w:t>
       </w:r>
     </w:p>
     <w:p>
@@ -9964,23 +9835,7 @@
           <w:i w:val="0"/>
           <w:iCs w:val="0"/>
         </w:rPr>
-        <w:t xml:space="preserve">Invoices &amp; </w:t>
-      </w:r>
-      <w:proofErr w:type="spellStart"/>
-      <w:r>
-        <w:rPr>
-          <w:i w:val="0"/>
-          <w:iCs w:val="0"/>
-        </w:rPr>
-        <w:t>InvoiceDetails</w:t>
-      </w:r>
-      <w:proofErr w:type="spellEnd"/>
-      <w:r>
-        <w:rPr>
-          <w:i w:val="0"/>
-          <w:iCs w:val="0"/>
-        </w:rPr>
-        <w:t xml:space="preserve">: </w:t>
+        <w:t xml:space="preserve">Invoices &amp; InvoiceDetails: </w:t>
       </w:r>
       <w:r>
         <w:rPr>
@@ -10214,23 +10069,13 @@
           <w:iCs w:val="0"/>
         </w:rPr>
       </w:pPr>
-      <w:proofErr w:type="spellStart"/>
       <w:r>
         <w:rPr>
           <w:rFonts w:hAnsi="Times New Roman" w:cs="Times New Roman"/>
           <w:i w:val="0"/>
           <w:iCs w:val="0"/>
         </w:rPr>
-        <w:t>HardwareSpec</w:t>
-      </w:r>
-      <w:proofErr w:type="spellEnd"/>
-      <w:r>
-        <w:rPr>
-          <w:rFonts w:hAnsi="Times New Roman" w:cs="Times New Roman"/>
-          <w:i w:val="0"/>
-          <w:iCs w:val="0"/>
-        </w:rPr>
-        <w:t xml:space="preserve">: </w:t>
+        <w:t xml:space="preserve">HardwareSpec: </w:t>
       </w:r>
       <w:r>
         <w:rPr>
@@ -10262,25 +10107,7 @@
           <w:i w:val="0"/>
           <w:iCs w:val="0"/>
         </w:rPr>
-        <w:t xml:space="preserve">Invoice &amp; </w:t>
-      </w:r>
-      <w:proofErr w:type="spellStart"/>
-      <w:r>
-        <w:rPr>
-          <w:rFonts w:hAnsi="Times New Roman" w:cs="Times New Roman"/>
-          <w:i w:val="0"/>
-          <w:iCs w:val="0"/>
-        </w:rPr>
-        <w:t>InvoiceDetail</w:t>
-      </w:r>
-      <w:proofErr w:type="spellEnd"/>
-      <w:r>
-        <w:rPr>
-          <w:rFonts w:hAnsi="Times New Roman" w:cs="Times New Roman"/>
-          <w:i w:val="0"/>
-          <w:iCs w:val="0"/>
-        </w:rPr>
-        <w:t xml:space="preserve">: </w:t>
+        <w:t xml:space="preserve">Invoice &amp; InvoiceDetail: </w:t>
       </w:r>
       <w:r>
         <w:rPr>
@@ -10290,29 +10117,7 @@
           <w:i w:val="0"/>
           <w:iCs w:val="0"/>
         </w:rPr>
-        <w:t xml:space="preserve">These classes record transaction data; a Composition relationship enforces that an </w:t>
-      </w:r>
-      <w:proofErr w:type="spellStart"/>
-      <w:r>
-        <w:rPr>
-          <w:rFonts w:hAnsi="Times New Roman" w:cs="Times New Roman"/>
-          <w:b w:val="0"/>
-          <w:bCs w:val="0"/>
-          <w:i w:val="0"/>
-          <w:iCs w:val="0"/>
-        </w:rPr>
-        <w:t>InvoiceDetail</w:t>
-      </w:r>
-      <w:proofErr w:type="spellEnd"/>
-      <w:r>
-        <w:rPr>
-          <w:rFonts w:hAnsi="Times New Roman" w:cs="Times New Roman"/>
-          <w:b w:val="0"/>
-          <w:bCs w:val="0"/>
-          <w:i w:val="0"/>
-          <w:iCs w:val="0"/>
-        </w:rPr>
-        <w:t xml:space="preserve"> cannot exist independently of its parent Invoice.</w:t>
+        <w:t>These classes record transaction data; a Composition relationship enforces that an InvoiceDetail cannot exist independently of its parent Invoice.</w:t>
       </w:r>
       <w:r>
         <w:rPr>
@@ -10354,23 +10159,13 @@
           <w:iCs w:val="0"/>
         </w:rPr>
       </w:pPr>
-      <w:proofErr w:type="spellStart"/>
       <w:r>
         <w:rPr>
           <w:rFonts w:hAnsi="Times New Roman" w:cs="Times New Roman"/>
           <w:i w:val="0"/>
           <w:iCs w:val="0"/>
         </w:rPr>
-        <w:t>AccountController</w:t>
-      </w:r>
-      <w:proofErr w:type="spellEnd"/>
-      <w:r>
-        <w:rPr>
-          <w:rFonts w:hAnsi="Times New Roman" w:cs="Times New Roman"/>
-          <w:i w:val="0"/>
-          <w:iCs w:val="0"/>
-        </w:rPr>
-        <w:t xml:space="preserve">: </w:t>
+        <w:t xml:space="preserve">AccountController: </w:t>
       </w:r>
       <w:r>
         <w:rPr>
@@ -10404,23 +10199,13 @@
           <w:iCs w:val="0"/>
         </w:rPr>
       </w:pPr>
-      <w:proofErr w:type="spellStart"/>
       <w:r>
         <w:rPr>
           <w:rFonts w:hAnsi="Times New Roman" w:cs="Times New Roman"/>
           <w:i w:val="0"/>
           <w:iCs w:val="0"/>
         </w:rPr>
-        <w:t>SalesController</w:t>
-      </w:r>
-      <w:proofErr w:type="spellEnd"/>
-      <w:r>
-        <w:rPr>
-          <w:rFonts w:hAnsi="Times New Roman" w:cs="Times New Roman"/>
-          <w:i w:val="0"/>
-          <w:iCs w:val="0"/>
-        </w:rPr>
-        <w:t xml:space="preserve">: </w:t>
+        <w:t xml:space="preserve">SalesController: </w:t>
       </w:r>
       <w:r>
         <w:rPr>
@@ -10454,23 +10239,13 @@
           <w:iCs w:val="0"/>
         </w:rPr>
       </w:pPr>
-      <w:proofErr w:type="spellStart"/>
       <w:r>
         <w:rPr>
           <w:rFonts w:hAnsi="Times New Roman" w:cs="Times New Roman"/>
           <w:i w:val="0"/>
           <w:iCs w:val="0"/>
         </w:rPr>
-        <w:t>InventoryController</w:t>
-      </w:r>
-      <w:proofErr w:type="spellEnd"/>
-      <w:r>
-        <w:rPr>
-          <w:rFonts w:hAnsi="Times New Roman" w:cs="Times New Roman"/>
-          <w:i w:val="0"/>
-          <w:iCs w:val="0"/>
-        </w:rPr>
-        <w:t xml:space="preserve">: </w:t>
+        <w:t xml:space="preserve">InventoryController: </w:t>
       </w:r>
       <w:r>
         <w:rPr>
@@ -10504,23 +10279,13 @@
           <w:iCs w:val="0"/>
         </w:rPr>
       </w:pPr>
-      <w:proofErr w:type="spellStart"/>
       <w:r>
         <w:rPr>
           <w:rFonts w:hAnsi="Times New Roman" w:cs="Times New Roman"/>
           <w:i w:val="0"/>
           <w:iCs w:val="0"/>
         </w:rPr>
-        <w:t>ReportController</w:t>
-      </w:r>
-      <w:proofErr w:type="spellEnd"/>
-      <w:r>
-        <w:rPr>
-          <w:rFonts w:hAnsi="Times New Roman" w:cs="Times New Roman"/>
-          <w:i w:val="0"/>
-          <w:iCs w:val="0"/>
-        </w:rPr>
-        <w:t xml:space="preserve">: </w:t>
+        <w:t xml:space="preserve">ReportController: </w:t>
       </w:r>
       <w:r>
         <w:rPr>
@@ -10582,95 +10347,7 @@
           <w:i w:val="0"/>
           <w:iCs w:val="0"/>
         </w:rPr>
-        <w:t xml:space="preserve">The View layer utilizes Windows Forms (e.g., </w:t>
-      </w:r>
-      <w:proofErr w:type="spellStart"/>
-      <w:r>
-        <w:rPr>
-          <w:rFonts w:hAnsi="Times New Roman" w:cs="Times New Roman"/>
-          <w:b w:val="0"/>
-          <w:bCs w:val="0"/>
-          <w:i w:val="0"/>
-          <w:iCs w:val="0"/>
-        </w:rPr>
-        <w:t>frmLogin</w:t>
-      </w:r>
-      <w:proofErr w:type="spellEnd"/>
-      <w:r>
-        <w:rPr>
-          <w:rFonts w:hAnsi="Times New Roman" w:cs="Times New Roman"/>
-          <w:b w:val="0"/>
-          <w:bCs w:val="0"/>
-          <w:i w:val="0"/>
-          <w:iCs w:val="0"/>
-        </w:rPr>
-        <w:t xml:space="preserve">, </w:t>
-      </w:r>
-      <w:proofErr w:type="spellStart"/>
-      <w:r>
-        <w:rPr>
-          <w:rFonts w:hAnsi="Times New Roman" w:cs="Times New Roman"/>
-          <w:b w:val="0"/>
-          <w:bCs w:val="0"/>
-          <w:i w:val="0"/>
-          <w:iCs w:val="0"/>
-        </w:rPr>
-        <w:t>frmSales</w:t>
-      </w:r>
-      <w:proofErr w:type="spellEnd"/>
-      <w:r>
-        <w:rPr>
-          <w:rFonts w:hAnsi="Times New Roman" w:cs="Times New Roman"/>
-          <w:b w:val="0"/>
-          <w:bCs w:val="0"/>
-          <w:i w:val="0"/>
-          <w:iCs w:val="0"/>
-        </w:rPr>
-        <w:t xml:space="preserve">, </w:t>
-      </w:r>
-      <w:proofErr w:type="spellStart"/>
-      <w:r>
-        <w:rPr>
-          <w:rFonts w:hAnsi="Times New Roman" w:cs="Times New Roman"/>
-          <w:b w:val="0"/>
-          <w:bCs w:val="0"/>
-          <w:i w:val="0"/>
-          <w:iCs w:val="0"/>
-        </w:rPr>
-        <w:t>frmInventory</w:t>
-      </w:r>
-      <w:proofErr w:type="spellEnd"/>
-      <w:r>
-        <w:rPr>
-          <w:rFonts w:hAnsi="Times New Roman" w:cs="Times New Roman"/>
-          <w:b w:val="0"/>
-          <w:bCs w:val="0"/>
-          <w:i w:val="0"/>
-          <w:iCs w:val="0"/>
-        </w:rPr>
-        <w:t xml:space="preserve">, </w:t>
-      </w:r>
-      <w:proofErr w:type="spellStart"/>
-      <w:r>
-        <w:rPr>
-          <w:rFonts w:hAnsi="Times New Roman" w:cs="Times New Roman"/>
-          <w:b w:val="0"/>
-          <w:bCs w:val="0"/>
-          <w:i w:val="0"/>
-          <w:iCs w:val="0"/>
-        </w:rPr>
-        <w:t>frmReports</w:t>
-      </w:r>
-      <w:proofErr w:type="spellEnd"/>
-      <w:r>
-        <w:rPr>
-          <w:rFonts w:hAnsi="Times New Roman" w:cs="Times New Roman"/>
-          <w:b w:val="0"/>
-          <w:bCs w:val="0"/>
-          <w:i w:val="0"/>
-          <w:iCs w:val="0"/>
-        </w:rPr>
-        <w:t xml:space="preserve">) to capture user input and display data retrieved from the Controllers. </w:t>
+        <w:t xml:space="preserve">The View layer utilizes Windows Forms (e.g., frmLogin, frmSales, frmInventory, frmReports) to capture user input and display data retrieved from the Controllers. </w:t>
       </w:r>
     </w:p>
     <w:p>
@@ -10824,7 +10501,6 @@
       <w:r>
         <w:t xml:space="preserve">To clearly illustrate the system's runtime behavior, the "Generate Sales Invoice" sequence is modeled. This sequence maps out how the </w:t>
       </w:r>
-      <w:proofErr w:type="spellStart"/>
       <w:r>
         <w:rPr>
           <w:rStyle w:val="HTMLCode"/>
@@ -10834,11 +10510,9 @@
         </w:rPr>
         <w:t>SalesView</w:t>
       </w:r>
-      <w:proofErr w:type="spellEnd"/>
       <w:r>
         <w:t xml:space="preserve"> sends data to the </w:t>
       </w:r>
-      <w:proofErr w:type="spellStart"/>
       <w:r>
         <w:rPr>
           <w:rStyle w:val="HTMLCode"/>
@@ -10848,7 +10522,6 @@
         </w:rPr>
         <w:t>SalesController</w:t>
       </w:r>
-      <w:proofErr w:type="spellEnd"/>
       <w:r>
         <w:t xml:space="preserve">, which then interacts with the </w:t>
       </w:r>
@@ -11040,27 +10713,7 @@
           <w:i w:val="0"/>
           <w:iCs w:val="0"/>
         </w:rPr>
-        <w:t xml:space="preserve">Implementing the System User inheritance logic at the code level guarantees that only authorized Actors can access sensitive Controllers (such as the </w:t>
-      </w:r>
-      <w:proofErr w:type="spellStart"/>
-      <w:r>
-        <w:rPr>
-          <w:b w:val="0"/>
-          <w:bCs w:val="0"/>
-          <w:i w:val="0"/>
-          <w:iCs w:val="0"/>
-        </w:rPr>
-        <w:t>ReportController</w:t>
-      </w:r>
-      <w:proofErr w:type="spellEnd"/>
-      <w:r>
-        <w:rPr>
-          <w:b w:val="0"/>
-          <w:bCs w:val="0"/>
-          <w:i w:val="0"/>
-          <w:iCs w:val="0"/>
-        </w:rPr>
-        <w:t>).</w:t>
+        <w:t>Implementing the System User inheritance logic at the code level guarantees that only authorized Actors can access sensitive Controllers (such as the ReportController).</w:t>
       </w:r>
     </w:p>
     <w:p>
@@ -11207,9 +10860,24 @@
           <w:i w:val="0"/>
           <w:iCs w:val="0"/>
         </w:rPr>
-        <w:t xml:space="preserve">Managed directly by the </w:t>
-      </w:r>
-      <w:proofErr w:type="spellStart"/>
+        <w:t>Managed directly by the AccountController.</w:t>
+      </w:r>
+    </w:p>
+    <w:p>
+      <w:pPr>
+        <w:pStyle w:val="Statements"/>
+        <w:rPr>
+          <w:i w:val="0"/>
+          <w:iCs w:val="0"/>
+        </w:rPr>
+      </w:pPr>
+      <w:r>
+        <w:rPr>
+          <w:i w:val="0"/>
+          <w:iCs w:val="0"/>
+        </w:rPr>
+        <w:t xml:space="preserve">FR2 (Sales Processing): </w:t>
+      </w:r>
       <w:r>
         <w:rPr>
           <w:b w:val="0"/>
@@ -11217,9 +10885,24 @@
           <w:i w:val="0"/>
           <w:iCs w:val="0"/>
         </w:rPr>
-        <w:t>AccountController</w:t>
-      </w:r>
-      <w:proofErr w:type="spellEnd"/>
+        <w:t>Managed by the SalesController and Invoice entity.</w:t>
+      </w:r>
+    </w:p>
+    <w:p>
+      <w:pPr>
+        <w:pStyle w:val="Statements"/>
+        <w:rPr>
+          <w:i w:val="0"/>
+          <w:iCs w:val="0"/>
+        </w:rPr>
+      </w:pPr>
+      <w:r>
+        <w:rPr>
+          <w:i w:val="0"/>
+          <w:iCs w:val="0"/>
+        </w:rPr>
+        <w:t xml:space="preserve">FR3 (Inventory Management): </w:t>
+      </w:r>
       <w:r>
         <w:rPr>
           <w:b w:val="0"/>
@@ -11227,7 +10910,7 @@
           <w:i w:val="0"/>
           <w:iCs w:val="0"/>
         </w:rPr>
-        <w:t>.</w:t>
+        <w:t>Managed by the InventoryController and Product entity.</w:t>
       </w:r>
     </w:p>
     <w:p>
@@ -11243,7 +10926,7 @@
           <w:i w:val="0"/>
           <w:iCs w:val="0"/>
         </w:rPr>
-        <w:t xml:space="preserve">FR2 (Sales Processing): </w:t>
+        <w:t xml:space="preserve">FR4 (Customer Management): </w:t>
       </w:r>
       <w:r>
         <w:rPr>
@@ -11252,9 +10935,24 @@
           <w:i w:val="0"/>
           <w:iCs w:val="0"/>
         </w:rPr>
-        <w:t xml:space="preserve">Managed by the </w:t>
-      </w:r>
-      <w:proofErr w:type="spellStart"/>
+        <w:t>Managed by the CustomerController.</w:t>
+      </w:r>
+    </w:p>
+    <w:p>
+      <w:pPr>
+        <w:pStyle w:val="Statements"/>
+        <w:rPr>
+          <w:i w:val="0"/>
+          <w:iCs w:val="0"/>
+        </w:rPr>
+      </w:pPr>
+      <w:r>
+        <w:rPr>
+          <w:i w:val="0"/>
+          <w:iCs w:val="0"/>
+        </w:rPr>
+        <w:t xml:space="preserve">FR5 (Employee Administration): </w:t>
+      </w:r>
       <w:r>
         <w:rPr>
           <w:b w:val="0"/>
@@ -11262,9 +10960,24 @@
           <w:i w:val="0"/>
           <w:iCs w:val="0"/>
         </w:rPr>
-        <w:t>SalesController</w:t>
-      </w:r>
-      <w:proofErr w:type="spellEnd"/>
+        <w:t>Managed by the AccountController and Staff entity.</w:t>
+      </w:r>
+    </w:p>
+    <w:p>
+      <w:pPr>
+        <w:pStyle w:val="Statements"/>
+        <w:rPr>
+          <w:i w:val="0"/>
+          <w:iCs w:val="0"/>
+        </w:rPr>
+      </w:pPr>
+      <w:r>
+        <w:rPr>
+          <w:i w:val="0"/>
+          <w:iCs w:val="0"/>
+        </w:rPr>
+        <w:t xml:space="preserve">FR6 (Automated Synchronization): </w:t>
+      </w:r>
       <w:r>
         <w:rPr>
           <w:b w:val="0"/>
@@ -11272,7 +10985,7 @@
           <w:i w:val="0"/>
           <w:iCs w:val="0"/>
         </w:rPr>
-        <w:t xml:space="preserve"> and Invoice entity.</w:t>
+        <w:t>Implemented as a secure method within the SalesController.</w:t>
       </w:r>
     </w:p>
     <w:p>
@@ -11288,7 +11001,7 @@
           <w:i w:val="0"/>
           <w:iCs w:val="0"/>
         </w:rPr>
-        <w:t xml:space="preserve">FR3 (Inventory Management): </w:t>
+        <w:t xml:space="preserve">FR7 (Reporting): </w:t>
       </w:r>
       <w:r>
         <w:rPr>
@@ -11297,207 +11010,7 @@
           <w:i w:val="0"/>
           <w:iCs w:val="0"/>
         </w:rPr>
-        <w:t xml:space="preserve">Managed by the </w:t>
-      </w:r>
-      <w:proofErr w:type="spellStart"/>
-      <w:r>
-        <w:rPr>
-          <w:b w:val="0"/>
-          <w:bCs w:val="0"/>
-          <w:i w:val="0"/>
-          <w:iCs w:val="0"/>
-        </w:rPr>
-        <w:t>InventoryController</w:t>
-      </w:r>
-      <w:proofErr w:type="spellEnd"/>
-      <w:r>
-        <w:rPr>
-          <w:b w:val="0"/>
-          <w:bCs w:val="0"/>
-          <w:i w:val="0"/>
-          <w:iCs w:val="0"/>
-        </w:rPr>
-        <w:t xml:space="preserve"> and Product entity.</w:t>
-      </w:r>
-    </w:p>
-    <w:p>
-      <w:pPr>
-        <w:pStyle w:val="Statements"/>
-        <w:rPr>
-          <w:i w:val="0"/>
-          <w:iCs w:val="0"/>
-        </w:rPr>
-      </w:pPr>
-      <w:r>
-        <w:rPr>
-          <w:i w:val="0"/>
-          <w:iCs w:val="0"/>
-        </w:rPr>
-        <w:t xml:space="preserve">FR4 (Customer Management): </w:t>
-      </w:r>
-      <w:r>
-        <w:rPr>
-          <w:b w:val="0"/>
-          <w:bCs w:val="0"/>
-          <w:i w:val="0"/>
-          <w:iCs w:val="0"/>
-        </w:rPr>
-        <w:t xml:space="preserve">Managed by the </w:t>
-      </w:r>
-      <w:proofErr w:type="spellStart"/>
-      <w:r>
-        <w:rPr>
-          <w:b w:val="0"/>
-          <w:bCs w:val="0"/>
-          <w:i w:val="0"/>
-          <w:iCs w:val="0"/>
-        </w:rPr>
-        <w:t>CustomerController</w:t>
-      </w:r>
-      <w:proofErr w:type="spellEnd"/>
-      <w:r>
-        <w:rPr>
-          <w:b w:val="0"/>
-          <w:bCs w:val="0"/>
-          <w:i w:val="0"/>
-          <w:iCs w:val="0"/>
-        </w:rPr>
-        <w:t>.</w:t>
-      </w:r>
-    </w:p>
-    <w:p>
-      <w:pPr>
-        <w:pStyle w:val="Statements"/>
-        <w:rPr>
-          <w:i w:val="0"/>
-          <w:iCs w:val="0"/>
-        </w:rPr>
-      </w:pPr>
-      <w:r>
-        <w:rPr>
-          <w:i w:val="0"/>
-          <w:iCs w:val="0"/>
-        </w:rPr>
-        <w:t xml:space="preserve">FR5 (Employee Administration): </w:t>
-      </w:r>
-      <w:r>
-        <w:rPr>
-          <w:b w:val="0"/>
-          <w:bCs w:val="0"/>
-          <w:i w:val="0"/>
-          <w:iCs w:val="0"/>
-        </w:rPr>
-        <w:t xml:space="preserve">Managed by the </w:t>
-      </w:r>
-      <w:proofErr w:type="spellStart"/>
-      <w:r>
-        <w:rPr>
-          <w:b w:val="0"/>
-          <w:bCs w:val="0"/>
-          <w:i w:val="0"/>
-          <w:iCs w:val="0"/>
-        </w:rPr>
-        <w:t>AccountController</w:t>
-      </w:r>
-      <w:proofErr w:type="spellEnd"/>
-      <w:r>
-        <w:rPr>
-          <w:b w:val="0"/>
-          <w:bCs w:val="0"/>
-          <w:i w:val="0"/>
-          <w:iCs w:val="0"/>
-        </w:rPr>
-        <w:t xml:space="preserve"> and Staff entity.</w:t>
-      </w:r>
-    </w:p>
-    <w:p>
-      <w:pPr>
-        <w:pStyle w:val="Statements"/>
-        <w:rPr>
-          <w:i w:val="0"/>
-          <w:iCs w:val="0"/>
-        </w:rPr>
-      </w:pPr>
-      <w:r>
-        <w:rPr>
-          <w:i w:val="0"/>
-          <w:iCs w:val="0"/>
-        </w:rPr>
-        <w:t xml:space="preserve">FR6 (Automated Synchronization): </w:t>
-      </w:r>
-      <w:r>
-        <w:rPr>
-          <w:b w:val="0"/>
-          <w:bCs w:val="0"/>
-          <w:i w:val="0"/>
-          <w:iCs w:val="0"/>
-        </w:rPr>
-        <w:t xml:space="preserve">Implemented as a secure method within the </w:t>
-      </w:r>
-      <w:proofErr w:type="spellStart"/>
-      <w:r>
-        <w:rPr>
-          <w:b w:val="0"/>
-          <w:bCs w:val="0"/>
-          <w:i w:val="0"/>
-          <w:iCs w:val="0"/>
-        </w:rPr>
-        <w:t>SalesController</w:t>
-      </w:r>
-      <w:proofErr w:type="spellEnd"/>
-      <w:r>
-        <w:rPr>
-          <w:b w:val="0"/>
-          <w:bCs w:val="0"/>
-          <w:i w:val="0"/>
-          <w:iCs w:val="0"/>
-        </w:rPr>
-        <w:t>.</w:t>
-      </w:r>
-    </w:p>
-    <w:p>
-      <w:pPr>
-        <w:pStyle w:val="Statements"/>
-        <w:rPr>
-          <w:i w:val="0"/>
-          <w:iCs w:val="0"/>
-        </w:rPr>
-      </w:pPr>
-      <w:r>
-        <w:rPr>
-          <w:i w:val="0"/>
-          <w:iCs w:val="0"/>
-        </w:rPr>
-        <w:t xml:space="preserve">FR7 (Reporting): </w:t>
-      </w:r>
-      <w:r>
-        <w:rPr>
-          <w:b w:val="0"/>
-          <w:bCs w:val="0"/>
-          <w:i w:val="0"/>
-          <w:iCs w:val="0"/>
-        </w:rPr>
-        <w:t xml:space="preserve">Managed exclusively by the </w:t>
-      </w:r>
-      <w:proofErr w:type="spellStart"/>
-      <w:r>
-        <w:rPr>
-          <w:b w:val="0"/>
-          <w:bCs w:val="0"/>
-          <w:i w:val="0"/>
-          <w:iCs w:val="0"/>
-        </w:rPr>
-        <w:t>ReportController</w:t>
-      </w:r>
-      <w:proofErr w:type="spellEnd"/>
-      <w:r>
-        <w:rPr>
-          <w:b w:val="0"/>
-          <w:bCs w:val="0"/>
-          <w:i w:val="0"/>
-          <w:iCs w:val="0"/>
-        </w:rPr>
-        <w:t>.</w:t>
+        <w:t>Managed exclusively by the ReportController.</w:t>
       </w:r>
     </w:p>
     <w:p>
@@ -12830,17 +12343,8 @@
                 <w:rFonts w:ascii="Arial" w:hAnsi="Arial" w:cs="Arial"/>
                 <w:color w:val="1F1F1F"/>
               </w:rPr>
-              <w:t xml:space="preserve">Customer </w:t>
+              <w:t>Customer Mgmt</w:t>
             </w:r>
-            <w:proofErr w:type="spellStart"/>
-            <w:r>
-              <w:rPr>
-                <w:rFonts w:ascii="Arial" w:hAnsi="Arial" w:cs="Arial"/>
-                <w:color w:val="1F1F1F"/>
-              </w:rPr>
-              <w:t>Mgmt</w:t>
-            </w:r>
-            <w:proofErr w:type="spellEnd"/>
           </w:p>
         </w:tc>
         <w:tc>
@@ -13030,17 +12534,8 @@
                 <w:rFonts w:ascii="Arial" w:hAnsi="Arial" w:cs="Arial"/>
                 <w:color w:val="1F1F1F"/>
               </w:rPr>
-              <w:t xml:space="preserve">Customer </w:t>
+              <w:t>Customer Mgmt</w:t>
             </w:r>
-            <w:proofErr w:type="spellStart"/>
-            <w:r>
-              <w:rPr>
-                <w:rFonts w:ascii="Arial" w:hAnsi="Arial" w:cs="Arial"/>
-                <w:color w:val="1F1F1F"/>
-              </w:rPr>
-              <w:t>Mgmt</w:t>
-            </w:r>
-            <w:proofErr w:type="spellEnd"/>
           </w:p>
         </w:tc>
         <w:tc>
@@ -13469,23 +12964,7 @@
                 <w:rFonts w:ascii="Arial" w:hAnsi="Arial" w:cs="Arial"/>
                 <w:color w:val="1F1F1F"/>
               </w:rPr>
-              <w:t xml:space="preserve">2. Attempt to access Employee </w:t>
-            </w:r>
-            <w:proofErr w:type="spellStart"/>
-            <w:r>
-              <w:rPr>
-                <w:rFonts w:ascii="Arial" w:hAnsi="Arial" w:cs="Arial"/>
-                <w:color w:val="1F1F1F"/>
-              </w:rPr>
-              <w:t>Mgmt</w:t>
-            </w:r>
-            <w:proofErr w:type="spellEnd"/>
-            <w:r>
-              <w:rPr>
-                <w:rFonts w:ascii="Arial" w:hAnsi="Arial" w:cs="Arial"/>
-                <w:color w:val="1F1F1F"/>
-              </w:rPr>
-              <w:t xml:space="preserve"> module.</w:t>
+              <w:t>2. Attempt to access Employee Mgmt module.</w:t>
             </w:r>
           </w:p>
         </w:tc>
@@ -13628,17 +13107,8 @@
                 <w:rFonts w:ascii="Arial" w:hAnsi="Arial" w:cs="Arial"/>
                 <w:color w:val="1F1F1F"/>
               </w:rPr>
-              <w:t xml:space="preserve">Inventory </w:t>
+              <w:t>Inventory Mgmt</w:t>
             </w:r>
-            <w:proofErr w:type="spellStart"/>
-            <w:r>
-              <w:rPr>
-                <w:rFonts w:ascii="Arial" w:hAnsi="Arial" w:cs="Arial"/>
-                <w:color w:val="1F1F1F"/>
-              </w:rPr>
-              <w:t>Mgmt</w:t>
-            </w:r>
-            <w:proofErr w:type="spellEnd"/>
           </w:p>
         </w:tc>
         <w:tc>
@@ -14830,67 +14300,7 @@
           <w:i w:val="0"/>
           <w:iCs w:val="0"/>
         </w:rPr>
-        <w:t xml:space="preserve">The </w:t>
-      </w:r>
-      <w:proofErr w:type="spellStart"/>
-      <w:r>
-        <w:rPr>
-          <w:b w:val="0"/>
-          <w:bCs w:val="0"/>
-          <w:i w:val="0"/>
-          <w:iCs w:val="0"/>
-        </w:rPr>
-        <w:t>MSTest</w:t>
-      </w:r>
-      <w:proofErr w:type="spellEnd"/>
-      <w:r>
-        <w:rPr>
-          <w:b w:val="0"/>
-          <w:bCs w:val="0"/>
-          <w:i w:val="0"/>
-          <w:iCs w:val="0"/>
-        </w:rPr>
-        <w:t xml:space="preserve"> framework in Visual Studio was used to write Unit Tests specifically targeting the logic inside </w:t>
-      </w:r>
-      <w:proofErr w:type="spellStart"/>
-      <w:r>
-        <w:rPr>
-          <w:b w:val="0"/>
-          <w:bCs w:val="0"/>
-          <w:i w:val="0"/>
-          <w:iCs w:val="0"/>
-        </w:rPr>
-        <w:t>SalesController.calculateFinalTotal</w:t>
-      </w:r>
-      <w:proofErr w:type="spellEnd"/>
-      <w:r>
-        <w:rPr>
-          <w:b w:val="0"/>
-          <w:bCs w:val="0"/>
-          <w:i w:val="0"/>
-          <w:iCs w:val="0"/>
-        </w:rPr>
-        <w:t xml:space="preserve">() and </w:t>
-      </w:r>
-      <w:proofErr w:type="spellStart"/>
-      <w:r>
-        <w:rPr>
-          <w:b w:val="0"/>
-          <w:bCs w:val="0"/>
-          <w:i w:val="0"/>
-          <w:iCs w:val="0"/>
-        </w:rPr>
-        <w:t>AccountController.authenticate</w:t>
-      </w:r>
-      <w:proofErr w:type="spellEnd"/>
-      <w:r>
-        <w:rPr>
-          <w:b w:val="0"/>
-          <w:bCs w:val="0"/>
-          <w:i w:val="0"/>
-          <w:iCs w:val="0"/>
-        </w:rPr>
-        <w:t>().</w:t>
+        <w:t>The MSTest framework in Visual Studio was used to write Unit Tests specifically targeting the logic inside SalesController.calculateFinalTotal() and AccountController.authenticate().</w:t>
       </w:r>
     </w:p>
     <w:p>
@@ -15307,13 +14717,8 @@
       <w:pPr>
         <w:pStyle w:val="Nidungvnbn"/>
       </w:pPr>
-      <w:proofErr w:type="spellStart"/>
-      <w:r>
-        <w:t>Github</w:t>
-      </w:r>
-      <w:proofErr w:type="spellEnd"/>
-      <w:r>
-        <w:t xml:space="preserve"> Repository URL: </w:t>
+      <w:r>
+        <w:t xml:space="preserve">Github Repository URL: </w:t>
       </w:r>
       <w:hyperlink r:id="rId21" w:history="1">
         <w:r>
@@ -15327,47 +14732,1300 @@
     <w:p>
       <w:pPr>
         <w:pStyle w:val="Heading2"/>
-      </w:pPr>
-      <w:bookmarkStart w:id="45" w:name="_Toc229660499"/>
-      <w:r>
         <w:rPr>
           <w:lang w:val="en-US"/>
         </w:rPr>
-        <w:t>Testing</w:t>
-      </w:r>
-      <w:bookmarkEnd w:id="45"/>
+      </w:pPr>
+      <w:r>
+        <w:rPr>
+          <w:lang w:val="en-US"/>
+        </w:rPr>
+        <w:t>Testing and Quality Assurance</w:t>
+      </w:r>
     </w:p>
     <w:p>
       <w:pPr>
         <w:pStyle w:val="Nidungvnbn"/>
       </w:pPr>
       <w:r>
-        <w:br w:type="page"/>
+        <w:t>Due to the critical nature of point-of-sale data and inventory management, our testing strategy was divided into two distinct phases: System/UI Testing (Black-Box) to ensure user input is sanitized, and Unit Testing (White-Box) to ensure core backend calculations are accurate.</w:t>
+      </w:r>
+    </w:p>
+    <w:p>
+      <w:pPr>
+        <w:pStyle w:val="Heading3"/>
+        <w:rPr>
+          <w:noProof/>
+        </w:rPr>
+      </w:pPr>
+      <w:r>
+        <w:rPr>
+          <w:noProof/>
+        </w:rPr>
+        <w:t>System and Integration Testing (Black-Box)</w:t>
+      </w:r>
+    </w:p>
+    <w:p>
+      <w:pPr>
+        <w:pStyle w:val="Nidungvnbn"/>
+      </w:pPr>
+      <w:r>
+        <w:t>To ensure system stability, we implemented strict hardware-level keystroke interception and dynamic UI feedback. Below is a subset of the critical test cases executed to verify data integrity before it reaches the database.</w:t>
+      </w:r>
+    </w:p>
+    <w:tbl>
+      <w:tblPr>
+        <w:tblStyle w:val="TableGrid"/>
+        <w:tblW w:w="8889" w:type="dxa"/>
+        <w:tblLook w:val="04A0" w:firstRow="1" w:lastRow="0" w:firstColumn="1" w:lastColumn="0" w:noHBand="0" w:noVBand="1"/>
+      </w:tblPr>
+      <w:tblGrid>
+        <w:gridCol w:w="1080"/>
+        <w:gridCol w:w="1391"/>
+        <w:gridCol w:w="1757"/>
+        <w:gridCol w:w="2038"/>
+        <w:gridCol w:w="1673"/>
+        <w:gridCol w:w="950"/>
+      </w:tblGrid>
+      <w:tr>
+        <w:tc>
+          <w:tcPr>
+            <w:tcW w:w="1080" w:type="dxa"/>
+            <w:vAlign w:val="center"/>
+            <w:hideMark/>
+          </w:tcPr>
+          <w:p>
+            <w:pPr>
+              <w:spacing w:before="0" w:after="0"/>
+              <w:jc w:val="center"/>
+              <w:rPr>
+                <w:rFonts w:ascii="Arial" w:eastAsia="Times New Roman" w:hAnsi="Arial" w:cs="Arial"/>
+                <w:color w:val="1F1F1F"/>
+              </w:rPr>
+            </w:pPr>
+            <w:r>
+              <w:rPr>
+                <w:rFonts w:ascii="Arial" w:eastAsia="Times New Roman" w:hAnsi="Arial" w:cs="Arial"/>
+                <w:b/>
+                <w:bCs/>
+                <w:color w:val="1F1F1F"/>
+                <w:bdr w:val="none" w:sz="0" w:space="0" w:color="auto" w:frame="1"/>
+              </w:rPr>
+              <w:t>Test ID</w:t>
+            </w:r>
+          </w:p>
+        </w:tc>
+        <w:tc>
+          <w:tcPr>
+            <w:tcW w:w="0" w:type="auto"/>
+            <w:vAlign w:val="center"/>
+            <w:hideMark/>
+          </w:tcPr>
+          <w:p>
+            <w:pPr>
+              <w:spacing w:before="0" w:after="0"/>
+              <w:jc w:val="center"/>
+              <w:rPr>
+                <w:rFonts w:ascii="Arial" w:eastAsia="Times New Roman" w:hAnsi="Arial" w:cs="Arial"/>
+                <w:color w:val="1F1F1F"/>
+              </w:rPr>
+            </w:pPr>
+            <w:r>
+              <w:rPr>
+                <w:rFonts w:ascii="Arial" w:eastAsia="Times New Roman" w:hAnsi="Arial" w:cs="Arial"/>
+                <w:b/>
+                <w:bCs/>
+                <w:color w:val="1F1F1F"/>
+                <w:bdr w:val="none" w:sz="0" w:space="0" w:color="auto" w:frame="1"/>
+              </w:rPr>
+              <w:t>Module</w:t>
+            </w:r>
+          </w:p>
+        </w:tc>
+        <w:tc>
+          <w:tcPr>
+            <w:tcW w:w="0" w:type="auto"/>
+            <w:vAlign w:val="center"/>
+            <w:hideMark/>
+          </w:tcPr>
+          <w:p>
+            <w:pPr>
+              <w:spacing w:before="0" w:after="0"/>
+              <w:jc w:val="center"/>
+              <w:rPr>
+                <w:rFonts w:ascii="Arial" w:eastAsia="Times New Roman" w:hAnsi="Arial" w:cs="Arial"/>
+                <w:color w:val="1F1F1F"/>
+              </w:rPr>
+            </w:pPr>
+            <w:r>
+              <w:rPr>
+                <w:rFonts w:ascii="Arial" w:eastAsia="Times New Roman" w:hAnsi="Arial" w:cs="Arial"/>
+                <w:b/>
+                <w:bCs/>
+                <w:color w:val="1F1F1F"/>
+                <w:bdr w:val="none" w:sz="0" w:space="0" w:color="auto" w:frame="1"/>
+              </w:rPr>
+              <w:t>Test Description / Action</w:t>
+            </w:r>
+          </w:p>
+        </w:tc>
+        <w:tc>
+          <w:tcPr>
+            <w:tcW w:w="0" w:type="auto"/>
+            <w:vAlign w:val="center"/>
+            <w:hideMark/>
+          </w:tcPr>
+          <w:p>
+            <w:pPr>
+              <w:spacing w:before="0" w:after="0"/>
+              <w:jc w:val="center"/>
+              <w:rPr>
+                <w:rFonts w:ascii="Arial" w:eastAsia="Times New Roman" w:hAnsi="Arial" w:cs="Arial"/>
+                <w:color w:val="1F1F1F"/>
+              </w:rPr>
+            </w:pPr>
+            <w:r>
+              <w:rPr>
+                <w:rFonts w:ascii="Arial" w:eastAsia="Times New Roman" w:hAnsi="Arial" w:cs="Arial"/>
+                <w:b/>
+                <w:bCs/>
+                <w:color w:val="1F1F1F"/>
+                <w:bdr w:val="none" w:sz="0" w:space="0" w:color="auto" w:frame="1"/>
+              </w:rPr>
+              <w:t>Expected Result</w:t>
+            </w:r>
+          </w:p>
+        </w:tc>
+        <w:tc>
+          <w:tcPr>
+            <w:tcW w:w="0" w:type="auto"/>
+            <w:vAlign w:val="center"/>
+            <w:hideMark/>
+          </w:tcPr>
+          <w:p>
+            <w:pPr>
+              <w:spacing w:before="0" w:after="0"/>
+              <w:jc w:val="center"/>
+              <w:rPr>
+                <w:rFonts w:ascii="Arial" w:eastAsia="Times New Roman" w:hAnsi="Arial" w:cs="Arial"/>
+                <w:color w:val="1F1F1F"/>
+              </w:rPr>
+            </w:pPr>
+            <w:r>
+              <w:rPr>
+                <w:rFonts w:ascii="Arial" w:eastAsia="Times New Roman" w:hAnsi="Arial" w:cs="Arial"/>
+                <w:b/>
+                <w:bCs/>
+                <w:color w:val="1F1F1F"/>
+                <w:bdr w:val="none" w:sz="0" w:space="0" w:color="auto" w:frame="1"/>
+              </w:rPr>
+              <w:t>Actual Result</w:t>
+            </w:r>
+          </w:p>
+        </w:tc>
+        <w:tc>
+          <w:tcPr>
+            <w:tcW w:w="416" w:type="dxa"/>
+            <w:vAlign w:val="center"/>
+            <w:hideMark/>
+          </w:tcPr>
+          <w:p>
+            <w:pPr>
+              <w:spacing w:before="0" w:after="0"/>
+              <w:jc w:val="center"/>
+              <w:rPr>
+                <w:rFonts w:ascii="Arial" w:eastAsia="Times New Roman" w:hAnsi="Arial" w:cs="Arial"/>
+                <w:color w:val="1F1F1F"/>
+              </w:rPr>
+            </w:pPr>
+            <w:r>
+              <w:rPr>
+                <w:rFonts w:ascii="Arial" w:eastAsia="Times New Roman" w:hAnsi="Arial" w:cs="Arial"/>
+                <w:b/>
+                <w:bCs/>
+                <w:color w:val="1F1F1F"/>
+                <w:bdr w:val="none" w:sz="0" w:space="0" w:color="auto" w:frame="1"/>
+              </w:rPr>
+              <w:t>Status</w:t>
+            </w:r>
+          </w:p>
+        </w:tc>
+      </w:tr>
+      <w:tr>
+        <w:tc>
+          <w:tcPr>
+            <w:tcW w:w="1080" w:type="dxa"/>
+            <w:vAlign w:val="center"/>
+            <w:hideMark/>
+          </w:tcPr>
+          <w:p>
+            <w:pPr>
+              <w:spacing w:before="0" w:after="0"/>
+              <w:jc w:val="center"/>
+              <w:rPr>
+                <w:rFonts w:ascii="Arial" w:eastAsia="Times New Roman" w:hAnsi="Arial" w:cs="Arial"/>
+                <w:color w:val="1F1F1F"/>
+              </w:rPr>
+            </w:pPr>
+            <w:r>
+              <w:rPr>
+                <w:rFonts w:ascii="Arial" w:eastAsia="Times New Roman" w:hAnsi="Arial" w:cs="Arial"/>
+                <w:b/>
+                <w:bCs/>
+                <w:color w:val="1F1F1F"/>
+                <w:bdr w:val="none" w:sz="0" w:space="0" w:color="auto" w:frame="1"/>
+              </w:rPr>
+              <w:t>TC-01</w:t>
+            </w:r>
+          </w:p>
+        </w:tc>
+        <w:tc>
+          <w:tcPr>
+            <w:tcW w:w="0" w:type="auto"/>
+            <w:vAlign w:val="center"/>
+            <w:hideMark/>
+          </w:tcPr>
+          <w:p>
+            <w:pPr>
+              <w:spacing w:before="0" w:after="0"/>
+              <w:jc w:val="center"/>
+              <w:rPr>
+                <w:rFonts w:ascii="Arial" w:eastAsia="Times New Roman" w:hAnsi="Arial" w:cs="Arial"/>
+                <w:color w:val="1F1F1F"/>
+              </w:rPr>
+            </w:pPr>
+            <w:r>
+              <w:rPr>
+                <w:rFonts w:ascii="Arial" w:eastAsia="Times New Roman" w:hAnsi="Arial" w:cs="Arial"/>
+                <w:color w:val="1F1F1F"/>
+                <w:bdr w:val="none" w:sz="0" w:space="0" w:color="auto" w:frame="1"/>
+              </w:rPr>
+              <w:t>Checkout</w:t>
+            </w:r>
+          </w:p>
+        </w:tc>
+        <w:tc>
+          <w:tcPr>
+            <w:tcW w:w="0" w:type="auto"/>
+            <w:vAlign w:val="center"/>
+            <w:hideMark/>
+          </w:tcPr>
+          <w:p>
+            <w:pPr>
+              <w:spacing w:before="0" w:after="0"/>
+              <w:jc w:val="center"/>
+              <w:rPr>
+                <w:rFonts w:ascii="Arial" w:eastAsia="Times New Roman" w:hAnsi="Arial" w:cs="Arial"/>
+                <w:color w:val="1F1F1F"/>
+              </w:rPr>
+            </w:pPr>
+            <w:r>
+              <w:rPr>
+                <w:rFonts w:ascii="Arial" w:eastAsia="Times New Roman" w:hAnsi="Arial" w:cs="Arial"/>
+                <w:color w:val="1F1F1F"/>
+                <w:bdr w:val="none" w:sz="0" w:space="0" w:color="auto" w:frame="1"/>
+              </w:rPr>
+              <w:t>Enter alphabetical characters into the "Phone Number" field.</w:t>
+            </w:r>
+          </w:p>
+        </w:tc>
+        <w:tc>
+          <w:tcPr>
+            <w:tcW w:w="0" w:type="auto"/>
+            <w:vAlign w:val="center"/>
+            <w:hideMark/>
+          </w:tcPr>
+          <w:p>
+            <w:pPr>
+              <w:spacing w:before="0" w:after="0"/>
+              <w:jc w:val="center"/>
+              <w:rPr>
+                <w:rFonts w:ascii="Arial" w:eastAsia="Times New Roman" w:hAnsi="Arial" w:cs="Arial"/>
+                <w:color w:val="1F1F1F"/>
+              </w:rPr>
+            </w:pPr>
+            <w:r>
+              <w:rPr>
+                <w:rFonts w:ascii="Arial" w:eastAsia="Times New Roman" w:hAnsi="Arial" w:cs="Arial"/>
+                <w:color w:val="1F1F1F"/>
+                <w:bdr w:val="none" w:sz="0" w:space="0" w:color="auto" w:frame="1"/>
+              </w:rPr>
+              <w:t>System intercepts keystrokes and rejects non-numeric input.</w:t>
+            </w:r>
+          </w:p>
+        </w:tc>
+        <w:tc>
+          <w:tcPr>
+            <w:tcW w:w="0" w:type="auto"/>
+            <w:vAlign w:val="center"/>
+            <w:hideMark/>
+          </w:tcPr>
+          <w:p>
+            <w:pPr>
+              <w:spacing w:before="0" w:after="0"/>
+              <w:jc w:val="center"/>
+              <w:rPr>
+                <w:rFonts w:ascii="Arial" w:eastAsia="Times New Roman" w:hAnsi="Arial" w:cs="Arial"/>
+                <w:color w:val="1F1F1F"/>
+              </w:rPr>
+            </w:pPr>
+            <w:r>
+              <w:rPr>
+                <w:rFonts w:ascii="Arial" w:eastAsia="Times New Roman" w:hAnsi="Arial" w:cs="Arial"/>
+                <w:color w:val="1F1F1F"/>
+                <w:bdr w:val="none" w:sz="0" w:space="0" w:color="auto" w:frame="1"/>
+              </w:rPr>
+              <w:t>Non-numeric input ignored.</w:t>
+            </w:r>
+          </w:p>
+        </w:tc>
+        <w:tc>
+          <w:tcPr>
+            <w:tcW w:w="416" w:type="dxa"/>
+            <w:vAlign w:val="center"/>
+            <w:hideMark/>
+          </w:tcPr>
+          <w:p>
+            <w:pPr>
+              <w:spacing w:before="0" w:after="0"/>
+              <w:jc w:val="center"/>
+              <w:rPr>
+                <w:rFonts w:ascii="Arial" w:eastAsia="Times New Roman" w:hAnsi="Arial" w:cs="Arial"/>
+                <w:color w:val="1F1F1F"/>
+              </w:rPr>
+            </w:pPr>
+            <w:r>
+              <w:rPr>
+                <w:rFonts w:ascii="Arial" w:eastAsia="Times New Roman" w:hAnsi="Arial" w:cs="Arial"/>
+                <w:b/>
+                <w:bCs/>
+                <w:color w:val="1F1F1F"/>
+                <w:bdr w:val="none" w:sz="0" w:space="0" w:color="auto" w:frame="1"/>
+              </w:rPr>
+              <w:t>PASS</w:t>
+            </w:r>
+          </w:p>
+        </w:tc>
+      </w:tr>
+      <w:tr>
+        <w:tc>
+          <w:tcPr>
+            <w:tcW w:w="1080" w:type="dxa"/>
+            <w:vAlign w:val="center"/>
+            <w:hideMark/>
+          </w:tcPr>
+          <w:p>
+            <w:pPr>
+              <w:spacing w:before="0" w:after="0"/>
+              <w:jc w:val="center"/>
+              <w:rPr>
+                <w:rFonts w:ascii="Arial" w:eastAsia="Times New Roman" w:hAnsi="Arial" w:cs="Arial"/>
+                <w:color w:val="1F1F1F"/>
+              </w:rPr>
+            </w:pPr>
+            <w:r>
+              <w:rPr>
+                <w:rFonts w:ascii="Arial" w:eastAsia="Times New Roman" w:hAnsi="Arial" w:cs="Arial"/>
+                <w:b/>
+                <w:bCs/>
+                <w:color w:val="1F1F1F"/>
+                <w:bdr w:val="none" w:sz="0" w:space="0" w:color="auto" w:frame="1"/>
+              </w:rPr>
+              <w:t>TC-02</w:t>
+            </w:r>
+          </w:p>
+        </w:tc>
+        <w:tc>
+          <w:tcPr>
+            <w:tcW w:w="0" w:type="auto"/>
+            <w:vAlign w:val="center"/>
+            <w:hideMark/>
+          </w:tcPr>
+          <w:p>
+            <w:pPr>
+              <w:spacing w:before="0" w:after="0"/>
+              <w:jc w:val="center"/>
+              <w:rPr>
+                <w:rFonts w:ascii="Arial" w:eastAsia="Times New Roman" w:hAnsi="Arial" w:cs="Arial"/>
+                <w:color w:val="1F1F1F"/>
+              </w:rPr>
+            </w:pPr>
+            <w:r>
+              <w:rPr>
+                <w:rFonts w:ascii="Arial" w:eastAsia="Times New Roman" w:hAnsi="Arial" w:cs="Arial"/>
+                <w:color w:val="1F1F1F"/>
+                <w:bdr w:val="none" w:sz="0" w:space="0" w:color="auto" w:frame="1"/>
+              </w:rPr>
+              <w:t>Checkout</w:t>
+            </w:r>
+          </w:p>
+        </w:tc>
+        <w:tc>
+          <w:tcPr>
+            <w:tcW w:w="0" w:type="auto"/>
+            <w:vAlign w:val="center"/>
+            <w:hideMark/>
+          </w:tcPr>
+          <w:p>
+            <w:pPr>
+              <w:spacing w:before="0" w:after="0"/>
+              <w:jc w:val="center"/>
+              <w:rPr>
+                <w:rFonts w:ascii="Arial" w:eastAsia="Times New Roman" w:hAnsi="Arial" w:cs="Arial"/>
+                <w:color w:val="1F1F1F"/>
+              </w:rPr>
+            </w:pPr>
+            <w:r>
+              <w:rPr>
+                <w:rFonts w:ascii="Arial" w:eastAsia="Times New Roman" w:hAnsi="Arial" w:cs="Arial"/>
+                <w:color w:val="1F1F1F"/>
+                <w:bdr w:val="none" w:sz="0" w:space="0" w:color="auto" w:frame="1"/>
+              </w:rPr>
+              <w:t>Type a phone number exceeding 11 digits.</w:t>
+            </w:r>
+          </w:p>
+        </w:tc>
+        <w:tc>
+          <w:tcPr>
+            <w:tcW w:w="0" w:type="auto"/>
+            <w:vAlign w:val="center"/>
+            <w:hideMark/>
+          </w:tcPr>
+          <w:p>
+            <w:pPr>
+              <w:spacing w:before="0" w:after="0"/>
+              <w:jc w:val="center"/>
+              <w:rPr>
+                <w:rFonts w:ascii="Arial" w:eastAsia="Times New Roman" w:hAnsi="Arial" w:cs="Arial"/>
+                <w:color w:val="1F1F1F"/>
+              </w:rPr>
+            </w:pPr>
+            <w:r>
+              <w:rPr>
+                <w:rFonts w:ascii="Arial" w:eastAsia="Times New Roman" w:hAnsi="Arial" w:cs="Arial"/>
+                <w:color w:val="1F1F1F"/>
+                <w:bdr w:val="none" w:sz="0" w:space="0" w:color="auto" w:frame="1"/>
+              </w:rPr>
+              <w:t>Field mechanically caps input at exactly 11 digits.</w:t>
+            </w:r>
+          </w:p>
+        </w:tc>
+        <w:tc>
+          <w:tcPr>
+            <w:tcW w:w="0" w:type="auto"/>
+            <w:vAlign w:val="center"/>
+            <w:hideMark/>
+          </w:tcPr>
+          <w:p>
+            <w:pPr>
+              <w:spacing w:before="0" w:after="0"/>
+              <w:jc w:val="center"/>
+              <w:rPr>
+                <w:rFonts w:ascii="Arial" w:eastAsia="Times New Roman" w:hAnsi="Arial" w:cs="Arial"/>
+                <w:color w:val="1F1F1F"/>
+              </w:rPr>
+            </w:pPr>
+            <w:r>
+              <w:rPr>
+                <w:rFonts w:ascii="Arial" w:eastAsia="Times New Roman" w:hAnsi="Arial" w:cs="Arial"/>
+                <w:color w:val="1F1F1F"/>
+                <w:bdr w:val="none" w:sz="0" w:space="0" w:color="auto" w:frame="1"/>
+              </w:rPr>
+              <w:t>Input stops at 11 digits.</w:t>
+            </w:r>
+          </w:p>
+        </w:tc>
+        <w:tc>
+          <w:tcPr>
+            <w:tcW w:w="416" w:type="dxa"/>
+            <w:vAlign w:val="center"/>
+            <w:hideMark/>
+          </w:tcPr>
+          <w:p>
+            <w:pPr>
+              <w:spacing w:before="0" w:after="0"/>
+              <w:jc w:val="center"/>
+              <w:rPr>
+                <w:rFonts w:ascii="Arial" w:eastAsia="Times New Roman" w:hAnsi="Arial" w:cs="Arial"/>
+                <w:color w:val="1F1F1F"/>
+              </w:rPr>
+            </w:pPr>
+            <w:r>
+              <w:rPr>
+                <w:rFonts w:ascii="Arial" w:eastAsia="Times New Roman" w:hAnsi="Arial" w:cs="Arial"/>
+                <w:b/>
+                <w:bCs/>
+                <w:color w:val="1F1F1F"/>
+                <w:bdr w:val="none" w:sz="0" w:space="0" w:color="auto" w:frame="1"/>
+              </w:rPr>
+              <w:t>PASS</w:t>
+            </w:r>
+          </w:p>
+        </w:tc>
+      </w:tr>
+      <w:tr>
+        <w:tc>
+          <w:tcPr>
+            <w:tcW w:w="1080" w:type="dxa"/>
+            <w:vAlign w:val="center"/>
+            <w:hideMark/>
+          </w:tcPr>
+          <w:p>
+            <w:pPr>
+              <w:spacing w:before="0" w:after="0"/>
+              <w:jc w:val="center"/>
+              <w:rPr>
+                <w:rFonts w:ascii="Arial" w:eastAsia="Times New Roman" w:hAnsi="Arial" w:cs="Arial"/>
+                <w:color w:val="1F1F1F"/>
+              </w:rPr>
+            </w:pPr>
+            <w:r>
+              <w:rPr>
+                <w:rFonts w:ascii="Arial" w:eastAsia="Times New Roman" w:hAnsi="Arial" w:cs="Arial"/>
+                <w:b/>
+                <w:bCs/>
+                <w:color w:val="1F1F1F"/>
+                <w:bdr w:val="none" w:sz="0" w:space="0" w:color="auto" w:frame="1"/>
+              </w:rPr>
+              <w:t>TC-03</w:t>
+            </w:r>
+          </w:p>
+        </w:tc>
+        <w:tc>
+          <w:tcPr>
+            <w:tcW w:w="0" w:type="auto"/>
+            <w:vAlign w:val="center"/>
+            <w:hideMark/>
+          </w:tcPr>
+          <w:p>
+            <w:pPr>
+              <w:spacing w:before="0" w:after="0"/>
+              <w:jc w:val="center"/>
+              <w:rPr>
+                <w:rFonts w:ascii="Arial" w:eastAsia="Times New Roman" w:hAnsi="Arial" w:cs="Arial"/>
+                <w:color w:val="1F1F1F"/>
+              </w:rPr>
+            </w:pPr>
+            <w:r>
+              <w:rPr>
+                <w:rFonts w:ascii="Arial" w:eastAsia="Times New Roman" w:hAnsi="Arial" w:cs="Arial"/>
+                <w:color w:val="1F1F1F"/>
+                <w:bdr w:val="none" w:sz="0" w:space="0" w:color="auto" w:frame="1"/>
+              </w:rPr>
+              <w:t>Customers</w:t>
+            </w:r>
+          </w:p>
+        </w:tc>
+        <w:tc>
+          <w:tcPr>
+            <w:tcW w:w="0" w:type="auto"/>
+            <w:vAlign w:val="center"/>
+            <w:hideMark/>
+          </w:tcPr>
+          <w:p>
+            <w:pPr>
+              <w:spacing w:before="0" w:after="0"/>
+              <w:jc w:val="center"/>
+              <w:rPr>
+                <w:rFonts w:ascii="Arial" w:eastAsia="Times New Roman" w:hAnsi="Arial" w:cs="Arial"/>
+                <w:color w:val="1F1F1F"/>
+              </w:rPr>
+            </w:pPr>
+            <w:r>
+              <w:rPr>
+                <w:rFonts w:ascii="Arial" w:eastAsia="Times New Roman" w:hAnsi="Arial" w:cs="Arial"/>
+                <w:color w:val="1F1F1F"/>
+                <w:bdr w:val="none" w:sz="0" w:space="0" w:color="auto" w:frame="1"/>
+              </w:rPr>
+              <w:t>Enter a recognized 10-digit phone number into the Auto-Lookup engine.</w:t>
+            </w:r>
+          </w:p>
+        </w:tc>
+        <w:tc>
+          <w:tcPr>
+            <w:tcW w:w="0" w:type="auto"/>
+            <w:vAlign w:val="center"/>
+            <w:hideMark/>
+          </w:tcPr>
+          <w:p>
+            <w:pPr>
+              <w:spacing w:before="0" w:after="0"/>
+              <w:jc w:val="center"/>
+              <w:rPr>
+                <w:rFonts w:ascii="Arial" w:eastAsia="Times New Roman" w:hAnsi="Arial" w:cs="Arial"/>
+                <w:color w:val="1F1F1F"/>
+              </w:rPr>
+            </w:pPr>
+            <w:r>
+              <w:rPr>
+                <w:rFonts w:ascii="Arial" w:eastAsia="Times New Roman" w:hAnsi="Arial" w:cs="Arial"/>
+                <w:color w:val="1F1F1F"/>
+                <w:bdr w:val="none" w:sz="0" w:space="0" w:color="auto" w:frame="1"/>
+              </w:rPr>
+              <w:t>System queries database silently and auto-fills Full Name and Email; UI badge turns green ("Customer Found").</w:t>
+            </w:r>
+          </w:p>
+        </w:tc>
+        <w:tc>
+          <w:tcPr>
+            <w:tcW w:w="0" w:type="auto"/>
+            <w:vAlign w:val="center"/>
+            <w:hideMark/>
+          </w:tcPr>
+          <w:p>
+            <w:pPr>
+              <w:spacing w:before="0" w:after="0"/>
+              <w:jc w:val="center"/>
+              <w:rPr>
+                <w:rFonts w:ascii="Arial" w:eastAsia="Times New Roman" w:hAnsi="Arial" w:cs="Arial"/>
+                <w:color w:val="1F1F1F"/>
+              </w:rPr>
+            </w:pPr>
+            <w:r>
+              <w:rPr>
+                <w:rFonts w:ascii="Arial" w:eastAsia="Times New Roman" w:hAnsi="Arial" w:cs="Arial"/>
+                <w:color w:val="1F1F1F"/>
+                <w:bdr w:val="none" w:sz="0" w:space="0" w:color="auto" w:frame="1"/>
+              </w:rPr>
+              <w:t>Data auto-filled successfully.</w:t>
+            </w:r>
+          </w:p>
+        </w:tc>
+        <w:tc>
+          <w:tcPr>
+            <w:tcW w:w="416" w:type="dxa"/>
+            <w:vAlign w:val="center"/>
+            <w:hideMark/>
+          </w:tcPr>
+          <w:p>
+            <w:pPr>
+              <w:spacing w:before="0" w:after="0"/>
+              <w:jc w:val="center"/>
+              <w:rPr>
+                <w:rFonts w:ascii="Arial" w:eastAsia="Times New Roman" w:hAnsi="Arial" w:cs="Arial"/>
+                <w:color w:val="1F1F1F"/>
+              </w:rPr>
+            </w:pPr>
+            <w:r>
+              <w:rPr>
+                <w:rFonts w:ascii="Arial" w:eastAsia="Times New Roman" w:hAnsi="Arial" w:cs="Arial"/>
+                <w:b/>
+                <w:bCs/>
+                <w:color w:val="1F1F1F"/>
+                <w:bdr w:val="none" w:sz="0" w:space="0" w:color="auto" w:frame="1"/>
+              </w:rPr>
+              <w:t>PASS</w:t>
+            </w:r>
+          </w:p>
+        </w:tc>
+      </w:tr>
+      <w:tr>
+        <w:tc>
+          <w:tcPr>
+            <w:tcW w:w="1080" w:type="dxa"/>
+            <w:vAlign w:val="center"/>
+            <w:hideMark/>
+          </w:tcPr>
+          <w:p>
+            <w:pPr>
+              <w:spacing w:before="0" w:after="0"/>
+              <w:jc w:val="center"/>
+              <w:rPr>
+                <w:rFonts w:ascii="Arial" w:eastAsia="Times New Roman" w:hAnsi="Arial" w:cs="Arial"/>
+                <w:color w:val="1F1F1F"/>
+              </w:rPr>
+            </w:pPr>
+            <w:r>
+              <w:rPr>
+                <w:rFonts w:ascii="Arial" w:eastAsia="Times New Roman" w:hAnsi="Arial" w:cs="Arial"/>
+                <w:b/>
+                <w:bCs/>
+                <w:color w:val="1F1F1F"/>
+                <w:bdr w:val="none" w:sz="0" w:space="0" w:color="auto" w:frame="1"/>
+              </w:rPr>
+              <w:t>TC-04</w:t>
+            </w:r>
+          </w:p>
+        </w:tc>
+        <w:tc>
+          <w:tcPr>
+            <w:tcW w:w="0" w:type="auto"/>
+            <w:vAlign w:val="center"/>
+            <w:hideMark/>
+          </w:tcPr>
+          <w:p>
+            <w:pPr>
+              <w:spacing w:before="0" w:after="0"/>
+              <w:jc w:val="center"/>
+              <w:rPr>
+                <w:rFonts w:ascii="Arial" w:eastAsia="Times New Roman" w:hAnsi="Arial" w:cs="Arial"/>
+                <w:color w:val="1F1F1F"/>
+              </w:rPr>
+            </w:pPr>
+            <w:r>
+              <w:rPr>
+                <w:rFonts w:ascii="Arial" w:eastAsia="Times New Roman" w:hAnsi="Arial" w:cs="Arial"/>
+                <w:color w:val="1F1F1F"/>
+                <w:bdr w:val="none" w:sz="0" w:space="0" w:color="auto" w:frame="1"/>
+              </w:rPr>
+              <w:t>Dashboard</w:t>
+            </w:r>
+          </w:p>
+        </w:tc>
+        <w:tc>
+          <w:tcPr>
+            <w:tcW w:w="0" w:type="auto"/>
+            <w:vAlign w:val="center"/>
+            <w:hideMark/>
+          </w:tcPr>
+          <w:p>
+            <w:pPr>
+              <w:spacing w:before="0" w:after="0"/>
+              <w:jc w:val="center"/>
+              <w:rPr>
+                <w:rFonts w:ascii="Arial" w:eastAsia="Times New Roman" w:hAnsi="Arial" w:cs="Arial"/>
+                <w:color w:val="1F1F1F"/>
+              </w:rPr>
+            </w:pPr>
+            <w:r>
+              <w:rPr>
+                <w:rFonts w:ascii="Arial" w:eastAsia="Times New Roman" w:hAnsi="Arial" w:cs="Arial"/>
+                <w:color w:val="1F1F1F"/>
+                <w:bdr w:val="none" w:sz="0" w:space="0" w:color="auto" w:frame="1"/>
+              </w:rPr>
+              <w:t xml:space="preserve">Log in using </w:t>
+            </w:r>
+            <w:r>
+              <w:rPr>
+                <w:rFonts w:ascii="Arial" w:eastAsia="Times New Roman" w:hAnsi="Arial" w:cs="Arial"/>
+                <w:color w:val="1F1F1F"/>
+                <w:bdr w:val="none" w:sz="0" w:space="0" w:color="auto" w:frame="1"/>
+              </w:rPr>
+              <w:lastRenderedPageBreak/>
+              <w:t>an account with the "Inventory" role.</w:t>
+            </w:r>
+          </w:p>
+        </w:tc>
+        <w:tc>
+          <w:tcPr>
+            <w:tcW w:w="0" w:type="auto"/>
+            <w:vAlign w:val="center"/>
+            <w:hideMark/>
+          </w:tcPr>
+          <w:p>
+            <w:pPr>
+              <w:spacing w:before="0" w:after="0"/>
+              <w:jc w:val="center"/>
+              <w:rPr>
+                <w:rFonts w:ascii="Arial" w:eastAsia="Times New Roman" w:hAnsi="Arial" w:cs="Arial"/>
+                <w:color w:val="1F1F1F"/>
+              </w:rPr>
+            </w:pPr>
+            <w:r>
+              <w:rPr>
+                <w:rFonts w:ascii="Arial" w:eastAsia="Times New Roman" w:hAnsi="Arial" w:cs="Arial"/>
+                <w:color w:val="1F1F1F"/>
+                <w:bdr w:val="none" w:sz="0" w:space="0" w:color="auto" w:frame="1"/>
+              </w:rPr>
+              <w:lastRenderedPageBreak/>
+              <w:t xml:space="preserve">The "Point of </w:t>
+            </w:r>
+            <w:r>
+              <w:rPr>
+                <w:rFonts w:ascii="Arial" w:eastAsia="Times New Roman" w:hAnsi="Arial" w:cs="Arial"/>
+                <w:color w:val="1F1F1F"/>
+                <w:bdr w:val="none" w:sz="0" w:space="0" w:color="auto" w:frame="1"/>
+              </w:rPr>
+              <w:lastRenderedPageBreak/>
+              <w:t>Sale" and "Customer" navigation buttons are completely hidden from the user interface.</w:t>
+            </w:r>
+          </w:p>
+        </w:tc>
+        <w:tc>
+          <w:tcPr>
+            <w:tcW w:w="0" w:type="auto"/>
+            <w:vAlign w:val="center"/>
+            <w:hideMark/>
+          </w:tcPr>
+          <w:p>
+            <w:pPr>
+              <w:spacing w:before="0" w:after="0"/>
+              <w:jc w:val="center"/>
+              <w:rPr>
+                <w:rFonts w:ascii="Arial" w:eastAsia="Times New Roman" w:hAnsi="Arial" w:cs="Arial"/>
+                <w:color w:val="1F1F1F"/>
+              </w:rPr>
+            </w:pPr>
+            <w:r>
+              <w:rPr>
+                <w:rFonts w:ascii="Arial" w:eastAsia="Times New Roman" w:hAnsi="Arial" w:cs="Arial"/>
+                <w:color w:val="1F1F1F"/>
+                <w:bdr w:val="none" w:sz="0" w:space="0" w:color="auto" w:frame="1"/>
+              </w:rPr>
+              <w:lastRenderedPageBreak/>
+              <w:t xml:space="preserve">UI adapted to </w:t>
+            </w:r>
+            <w:r>
+              <w:rPr>
+                <w:rFonts w:ascii="Arial" w:eastAsia="Times New Roman" w:hAnsi="Arial" w:cs="Arial"/>
+                <w:color w:val="1F1F1F"/>
+                <w:bdr w:val="none" w:sz="0" w:space="0" w:color="auto" w:frame="1"/>
+              </w:rPr>
+              <w:lastRenderedPageBreak/>
+              <w:t>role correctly.</w:t>
+            </w:r>
+          </w:p>
+        </w:tc>
+        <w:tc>
+          <w:tcPr>
+            <w:tcW w:w="416" w:type="dxa"/>
+            <w:vAlign w:val="center"/>
+            <w:hideMark/>
+          </w:tcPr>
+          <w:p>
+            <w:pPr>
+              <w:spacing w:before="0" w:after="0"/>
+              <w:jc w:val="center"/>
+              <w:rPr>
+                <w:rFonts w:ascii="Arial" w:eastAsia="Times New Roman" w:hAnsi="Arial" w:cs="Arial"/>
+                <w:color w:val="1F1F1F"/>
+              </w:rPr>
+            </w:pPr>
+            <w:r>
+              <w:rPr>
+                <w:rFonts w:ascii="Arial" w:eastAsia="Times New Roman" w:hAnsi="Arial" w:cs="Arial"/>
+                <w:b/>
+                <w:bCs/>
+                <w:color w:val="1F1F1F"/>
+                <w:bdr w:val="none" w:sz="0" w:space="0" w:color="auto" w:frame="1"/>
+              </w:rPr>
+              <w:lastRenderedPageBreak/>
+              <w:t>PASS</w:t>
+            </w:r>
+          </w:p>
+        </w:tc>
+      </w:tr>
+      <w:tr>
+        <w:tc>
+          <w:tcPr>
+            <w:tcW w:w="1080" w:type="dxa"/>
+            <w:vAlign w:val="center"/>
+            <w:hideMark/>
+          </w:tcPr>
+          <w:p>
+            <w:pPr>
+              <w:spacing w:before="0" w:after="0"/>
+              <w:jc w:val="center"/>
+              <w:rPr>
+                <w:rFonts w:ascii="Arial" w:eastAsia="Times New Roman" w:hAnsi="Arial" w:cs="Arial"/>
+                <w:color w:val="1F1F1F"/>
+              </w:rPr>
+            </w:pPr>
+            <w:r>
+              <w:rPr>
+                <w:rFonts w:ascii="Arial" w:eastAsia="Times New Roman" w:hAnsi="Arial" w:cs="Arial"/>
+                <w:b/>
+                <w:bCs/>
+                <w:color w:val="1F1F1F"/>
+                <w:bdr w:val="none" w:sz="0" w:space="0" w:color="auto" w:frame="1"/>
+              </w:rPr>
+              <w:t>TC-05</w:t>
+            </w:r>
+          </w:p>
+        </w:tc>
+        <w:tc>
+          <w:tcPr>
+            <w:tcW w:w="0" w:type="auto"/>
+            <w:vAlign w:val="center"/>
+            <w:hideMark/>
+          </w:tcPr>
+          <w:p>
+            <w:pPr>
+              <w:spacing w:before="0" w:after="0"/>
+              <w:jc w:val="center"/>
+              <w:rPr>
+                <w:rFonts w:ascii="Arial" w:eastAsia="Times New Roman" w:hAnsi="Arial" w:cs="Arial"/>
+                <w:color w:val="1F1F1F"/>
+              </w:rPr>
+            </w:pPr>
+            <w:r>
+              <w:rPr>
+                <w:rFonts w:ascii="Arial" w:eastAsia="Times New Roman" w:hAnsi="Arial" w:cs="Arial"/>
+                <w:color w:val="1F1F1F"/>
+                <w:bdr w:val="none" w:sz="0" w:space="0" w:color="auto" w:frame="1"/>
+              </w:rPr>
+              <w:t>Reports</w:t>
+            </w:r>
+          </w:p>
+        </w:tc>
+        <w:tc>
+          <w:tcPr>
+            <w:tcW w:w="0" w:type="auto"/>
+            <w:vAlign w:val="center"/>
+            <w:hideMark/>
+          </w:tcPr>
+          <w:p>
+            <w:pPr>
+              <w:spacing w:before="0" w:after="0"/>
+              <w:jc w:val="center"/>
+              <w:rPr>
+                <w:rFonts w:ascii="Arial" w:eastAsia="Times New Roman" w:hAnsi="Arial" w:cs="Arial"/>
+                <w:color w:val="1F1F1F"/>
+              </w:rPr>
+            </w:pPr>
+            <w:r>
+              <w:rPr>
+                <w:rFonts w:ascii="Arial" w:eastAsia="Times New Roman" w:hAnsi="Arial" w:cs="Arial"/>
+                <w:color w:val="1F1F1F"/>
+                <w:bdr w:val="none" w:sz="0" w:space="0" w:color="auto" w:frame="1"/>
+              </w:rPr>
+              <w:t>Select "Daily Sales" and attempt to pick a future date or an End Date.</w:t>
+            </w:r>
+          </w:p>
+        </w:tc>
+        <w:tc>
+          <w:tcPr>
+            <w:tcW w:w="0" w:type="auto"/>
+            <w:vAlign w:val="center"/>
+            <w:hideMark/>
+          </w:tcPr>
+          <w:p>
+            <w:pPr>
+              <w:spacing w:before="0" w:after="0"/>
+              <w:jc w:val="center"/>
+              <w:rPr>
+                <w:rFonts w:ascii="Arial" w:eastAsia="Times New Roman" w:hAnsi="Arial" w:cs="Arial"/>
+                <w:color w:val="1F1F1F"/>
+              </w:rPr>
+            </w:pPr>
+            <w:r>
+              <w:rPr>
+                <w:rFonts w:ascii="Arial" w:eastAsia="Times New Roman" w:hAnsi="Arial" w:cs="Arial"/>
+                <w:color w:val="1F1F1F"/>
+                <w:bdr w:val="none" w:sz="0" w:space="0" w:color="auto" w:frame="1"/>
+              </w:rPr>
+              <w:t>The End Date picker is hidden, and the system dynamically forces the SQL query to isolate the single selected day.</w:t>
+            </w:r>
+          </w:p>
+        </w:tc>
+        <w:tc>
+          <w:tcPr>
+            <w:tcW w:w="0" w:type="auto"/>
+            <w:vAlign w:val="center"/>
+            <w:hideMark/>
+          </w:tcPr>
+          <w:p>
+            <w:pPr>
+              <w:spacing w:before="0" w:after="0"/>
+              <w:jc w:val="center"/>
+              <w:rPr>
+                <w:rFonts w:ascii="Arial" w:eastAsia="Times New Roman" w:hAnsi="Arial" w:cs="Arial"/>
+                <w:color w:val="1F1F1F"/>
+              </w:rPr>
+            </w:pPr>
+            <w:r>
+              <w:rPr>
+                <w:rFonts w:ascii="Arial" w:eastAsia="Times New Roman" w:hAnsi="Arial" w:cs="Arial"/>
+                <w:color w:val="1F1F1F"/>
+                <w:bdr w:val="none" w:sz="0" w:space="0" w:color="auto" w:frame="1"/>
+              </w:rPr>
+              <w:t>Future dates blocked; query succeeds.</w:t>
+            </w:r>
+          </w:p>
+        </w:tc>
+        <w:tc>
+          <w:tcPr>
+            <w:tcW w:w="416" w:type="dxa"/>
+            <w:vAlign w:val="center"/>
+            <w:hideMark/>
+          </w:tcPr>
+          <w:p>
+            <w:pPr>
+              <w:spacing w:before="0" w:after="0"/>
+              <w:jc w:val="center"/>
+              <w:rPr>
+                <w:rFonts w:ascii="Arial" w:eastAsia="Times New Roman" w:hAnsi="Arial" w:cs="Arial"/>
+                <w:color w:val="1F1F1F"/>
+              </w:rPr>
+            </w:pPr>
+            <w:r>
+              <w:rPr>
+                <w:rFonts w:ascii="Arial" w:eastAsia="Times New Roman" w:hAnsi="Arial" w:cs="Arial"/>
+                <w:b/>
+                <w:bCs/>
+                <w:color w:val="1F1F1F"/>
+                <w:bdr w:val="none" w:sz="0" w:space="0" w:color="auto" w:frame="1"/>
+              </w:rPr>
+              <w:t>PASS</w:t>
+            </w:r>
+          </w:p>
+        </w:tc>
+      </w:tr>
+      <w:tr>
+        <w:tc>
+          <w:tcPr>
+            <w:tcW w:w="1080" w:type="dxa"/>
+            <w:vAlign w:val="center"/>
+            <w:hideMark/>
+          </w:tcPr>
+          <w:p>
+            <w:pPr>
+              <w:spacing w:before="0" w:after="0"/>
+              <w:jc w:val="center"/>
+              <w:rPr>
+                <w:rFonts w:ascii="Arial" w:eastAsia="Times New Roman" w:hAnsi="Arial" w:cs="Arial"/>
+                <w:color w:val="1F1F1F"/>
+              </w:rPr>
+            </w:pPr>
+            <w:r>
+              <w:rPr>
+                <w:rFonts w:ascii="Arial" w:eastAsia="Times New Roman" w:hAnsi="Arial" w:cs="Arial"/>
+                <w:b/>
+                <w:bCs/>
+                <w:color w:val="1F1F1F"/>
+                <w:bdr w:val="none" w:sz="0" w:space="0" w:color="auto" w:frame="1"/>
+              </w:rPr>
+              <w:t>TC-06</w:t>
+            </w:r>
+          </w:p>
+        </w:tc>
+        <w:tc>
+          <w:tcPr>
+            <w:tcW w:w="0" w:type="auto"/>
+            <w:vAlign w:val="center"/>
+            <w:hideMark/>
+          </w:tcPr>
+          <w:p>
+            <w:pPr>
+              <w:spacing w:before="0" w:after="0"/>
+              <w:jc w:val="center"/>
+              <w:rPr>
+                <w:rFonts w:ascii="Arial" w:eastAsia="Times New Roman" w:hAnsi="Arial" w:cs="Arial"/>
+                <w:color w:val="1F1F1F"/>
+              </w:rPr>
+            </w:pPr>
+            <w:r>
+              <w:rPr>
+                <w:rFonts w:ascii="Arial" w:eastAsia="Times New Roman" w:hAnsi="Arial" w:cs="Arial"/>
+                <w:color w:val="1F1F1F"/>
+                <w:bdr w:val="none" w:sz="0" w:space="0" w:color="auto" w:frame="1"/>
+              </w:rPr>
+              <w:t>Dashboard</w:t>
+            </w:r>
+          </w:p>
+        </w:tc>
+        <w:tc>
+          <w:tcPr>
+            <w:tcW w:w="0" w:type="auto"/>
+            <w:vAlign w:val="center"/>
+            <w:hideMark/>
+          </w:tcPr>
+          <w:p>
+            <w:pPr>
+              <w:spacing w:before="0" w:after="0"/>
+              <w:jc w:val="center"/>
+              <w:rPr>
+                <w:rFonts w:ascii="Arial" w:eastAsia="Times New Roman" w:hAnsi="Arial" w:cs="Arial"/>
+                <w:color w:val="1F1F1F"/>
+              </w:rPr>
+            </w:pPr>
+            <w:r>
+              <w:rPr>
+                <w:rFonts w:ascii="Arial" w:eastAsia="Times New Roman" w:hAnsi="Arial" w:cs="Arial"/>
+                <w:color w:val="1F1F1F"/>
+                <w:bdr w:val="none" w:sz="0" w:space="0" w:color="auto" w:frame="1"/>
+              </w:rPr>
+              <w:t>Minimize a maximized module and click "Back" to the dashboard.</w:t>
+            </w:r>
+          </w:p>
+        </w:tc>
+        <w:tc>
+          <w:tcPr>
+            <w:tcW w:w="0" w:type="auto"/>
+            <w:vAlign w:val="center"/>
+            <w:hideMark/>
+          </w:tcPr>
+          <w:p>
+            <w:pPr>
+              <w:spacing w:before="0" w:after="0"/>
+              <w:jc w:val="center"/>
+              <w:rPr>
+                <w:rFonts w:ascii="Arial" w:eastAsia="Times New Roman" w:hAnsi="Arial" w:cs="Arial"/>
+                <w:color w:val="1F1F1F"/>
+              </w:rPr>
+            </w:pPr>
+            <w:r>
+              <w:rPr>
+                <w:rFonts w:ascii="Arial" w:eastAsia="Times New Roman" w:hAnsi="Arial" w:cs="Arial"/>
+                <w:color w:val="1F1F1F"/>
+                <w:bdr w:val="none" w:sz="0" w:space="0" w:color="auto" w:frame="1"/>
+              </w:rPr>
+              <w:t xml:space="preserve">Layout math calculates the exact </w:t>
+            </w:r>
+            <w:r>
+              <w:rPr>
+                <w:rFonts w:ascii="Arial" w:eastAsia="Times New Roman" w:hAnsi="Arial" w:cs="Arial"/>
+                <w:color w:val="444746"/>
+                <w:sz w:val="20"/>
+                <w:szCs w:val="20"/>
+                <w:bdr w:val="none" w:sz="0" w:space="0" w:color="auto" w:frame="1"/>
+              </w:rPr>
+              <w:t>RestoreBounds</w:t>
+            </w:r>
+            <w:r>
+              <w:rPr>
+                <w:rFonts w:ascii="Arial" w:eastAsia="Times New Roman" w:hAnsi="Arial" w:cs="Arial"/>
+                <w:color w:val="1F1F1F"/>
+                <w:bdr w:val="none" w:sz="0" w:space="0" w:color="auto" w:frame="1"/>
+              </w:rPr>
+              <w:t>, preventing the Windows DWM layout squish glitch.</w:t>
+            </w:r>
+          </w:p>
+        </w:tc>
+        <w:tc>
+          <w:tcPr>
+            <w:tcW w:w="0" w:type="auto"/>
+            <w:vAlign w:val="center"/>
+            <w:hideMark/>
+          </w:tcPr>
+          <w:p>
+            <w:pPr>
+              <w:spacing w:before="0" w:after="0"/>
+              <w:jc w:val="center"/>
+              <w:rPr>
+                <w:rFonts w:ascii="Arial" w:eastAsia="Times New Roman" w:hAnsi="Arial" w:cs="Arial"/>
+                <w:color w:val="1F1F1F"/>
+              </w:rPr>
+            </w:pPr>
+            <w:r>
+              <w:rPr>
+                <w:rFonts w:ascii="Arial" w:eastAsia="Times New Roman" w:hAnsi="Arial" w:cs="Arial"/>
+                <w:color w:val="1F1F1F"/>
+                <w:bdr w:val="none" w:sz="0" w:space="0" w:color="auto" w:frame="1"/>
+              </w:rPr>
+              <w:t>UI scales and renders flawlessly.</w:t>
+            </w:r>
+          </w:p>
+        </w:tc>
+        <w:tc>
+          <w:tcPr>
+            <w:tcW w:w="416" w:type="dxa"/>
+            <w:vAlign w:val="center"/>
+            <w:hideMark/>
+          </w:tcPr>
+          <w:p>
+            <w:pPr>
+              <w:spacing w:before="0" w:after="0"/>
+              <w:jc w:val="center"/>
+              <w:rPr>
+                <w:rFonts w:ascii="Arial" w:eastAsia="Times New Roman" w:hAnsi="Arial" w:cs="Arial"/>
+                <w:color w:val="1F1F1F"/>
+              </w:rPr>
+            </w:pPr>
+            <w:r>
+              <w:rPr>
+                <w:rFonts w:ascii="Arial" w:eastAsia="Times New Roman" w:hAnsi="Arial" w:cs="Arial"/>
+                <w:b/>
+                <w:bCs/>
+                <w:color w:val="1F1F1F"/>
+                <w:bdr w:val="none" w:sz="0" w:space="0" w:color="auto" w:frame="1"/>
+              </w:rPr>
+              <w:t>PASS</w:t>
+            </w:r>
+          </w:p>
+        </w:tc>
+      </w:tr>
+    </w:tbl>
+    <w:p>
+      <w:pPr>
+        <w:pStyle w:val="Nidungvnbn"/>
+        <w:ind w:firstLine="0"/>
+      </w:pPr>
+    </w:p>
+    <w:p>
+      <w:pPr>
+        <w:pStyle w:val="Heading3"/>
+      </w:pPr>
+      <w:r>
+        <w:t>Unit Testing (White-Box)</w:t>
       </w:r>
     </w:p>
     <w:sdt>
       <w:sdtPr>
-        <w:rPr>
-          <w:b w:val="0"/>
-          <w:sz w:val="24"/>
-          <w:szCs w:val="24"/>
-          <w:lang w:val="en-US"/>
-        </w:rPr>
         <w:id w:val="-573587230"/>
         <w:bibliography/>
       </w:sdtPr>
+      <w:sdtEndPr>
+        <w:rPr>
+          <w:sz w:val="24"/>
+          <w:szCs w:val="24"/>
+        </w:rPr>
+      </w:sdtEndPr>
       <w:sdtContent>
         <w:p>
           <w:pPr>
-            <w:pStyle w:val="Heading1"/>
+            <w:pStyle w:val="Nidungvnbn"/>
+          </w:pPr>
+          <w:r>
+            <w:t xml:space="preserve">To satisfy the requirement for programmatic logic verification, the </w:t>
+          </w:r>
+          <w:r>
+            <w:rPr>
+              <w:b/>
+              <w:bCs/>
+            </w:rPr>
+            <w:t>MSTest Framework</w:t>
+          </w:r>
+          <w:r>
+            <w:t xml:space="preserve"> was utilized to test independent controller methods without requiring UI interaction. We targeted the most critical mathematical and security functions of the application.</w:t>
+          </w:r>
+        </w:p>
+        <w:p>
+          <w:pPr>
+            <w:pStyle w:val="Nidungvnbn"/>
             <w:numPr>
               <w:ilvl w:val="0"/>
-              <w:numId w:val="0"/>
+              <w:numId w:val="5"/>
             </w:numPr>
-            <w:tabs>
-              <w:tab w:val="left" w:pos="1102"/>
-            </w:tabs>
           </w:pPr>
+          <w:r>
+            <w:rPr>
+              <w:b/>
+              <w:bCs/>
+            </w:rPr>
+            <w:t>UT-01 (SalesController):</w:t>
+          </w:r>
+          <w:r>
+            <w:t xml:space="preserve"> CalculateFinalTotal_MatchesSumOfItems() – Injects dummy InvoiceDetail objects with predefined quantities and prices to verify the CalculateFinalTotal method returns the exact expected sum.</w:t>
+          </w:r>
+        </w:p>
+        <w:p>
+          <w:pPr>
+            <w:pStyle w:val="Nidungvnbn"/>
+            <w:numPr>
+              <w:ilvl w:val="0"/>
+              <w:numId w:val="5"/>
+            </w:numPr>
+          </w:pPr>
+          <w:r>
+            <w:rPr>
+              <w:b/>
+              <w:bCs/>
+            </w:rPr>
+            <w:t>UT-02 (AccountController):</w:t>
+          </w:r>
+          <w:r>
+            <w:t xml:space="preserve"> Authenticate_InvalidUser_ReturnsError() – Passes a randomized, non-existent username into the authentication engine to verify it accurately returns the -1 status code, preventing unauthorized SQL execution.</w:t>
+          </w:r>
+        </w:p>
+        <w:p>
+          <w:pPr>
+            <w:pStyle w:val="Nidungvnbn"/>
+          </w:pPr>
+          <w:r>
+            <w:lastRenderedPageBreak/>
+            <w:t>By combining strict UI input boundaries with controller-level unit tests, the system maintains a high degree of fault tolerance and data integrity.</w:t>
+          </w:r>
         </w:p>
         <w:p>
           <w:pPr>
@@ -15446,7 +16104,7 @@
 </file>
 
 <file path=word/endnotes.xml><?xml version="1.0" encoding="utf-8"?>
-<w:endnotes xmlns:wpc="http://schemas.microsoft.com/office/word/2010/wordprocessingCanvas" xmlns:cx="http://schemas.microsoft.com/office/drawing/2014/chartex" xmlns:cx1="http://schemas.microsoft.com/office/drawing/2015/9/8/chartex" xmlns:cx2="http://schemas.microsoft.com/office/drawing/2015/10/21/chartex" xmlns:cx3="http://schemas.microsoft.com/office/drawing/2016/5/9/chartex" xmlns:cx4="http://schemas.microsoft.com/office/drawing/2016/5/10/chartex" xmlns:cx5="http://schemas.microsoft.com/office/drawing/2016/5/11/chartex" xmlns:cx6="http://schemas.microsoft.com/office/drawing/2016/5/12/chartex" xmlns:cx7="http://schemas.microsoft.com/office/drawing/2016/5/13/chartex" xmlns:cx8="http://schemas.microsoft.com/office/drawing/2016/5/14/chartex" xmlns:mc="http://schemas.openxmlformats.org/markup-compatibility/2006" xmlns:aink="http://schemas.microsoft.com/office/drawing/2016/ink" xmlns:am3d="http://schemas.microsoft.com/office/drawing/2017/model3d" xmlns:o="urn:schemas-microsoft-com:office:office" xmlns:oel="http://schemas.microsoft.com/office/2019/extlst" xmlns:r="http://schemas.openxmlformats.org/officeDocument/2006/relationships" xmlns:m="http://schemas.openxmlformats.org/officeDocument/2006/math" xmlns:v="urn:schemas-microsoft-com:vml" xmlns:wp14="http://schemas.microsoft.com/office/word/2010/wordprocessingDrawing" xmlns:wp="http://schemas.openxmlformats.org/drawingml/2006/wordprocessingDrawing" xmlns:w10="urn:schemas-microsoft-com:office:word" xmlns:w="http://schemas.openxmlformats.org/wordprocessingml/2006/main" xmlns:w14="http://schemas.microsoft.com/office/word/2010/wordml" xmlns:w15="http://schemas.microsoft.com/office/word/2012/wordml" xmlns:w16cex="http://schemas.microsoft.com/office/word/2018/wordml/cex" xmlns:w16cid="http://schemas.microsoft.com/office/word/2016/wordml/cid" xmlns:w16="http://schemas.microsoft.com/office/word/2018/wordml" xmlns:w16du="http://schemas.microsoft.com/office/word/2023/wordml/word16du" xmlns:w16sdtdh="http://schemas.microsoft.com/office/word/2020/wordml/sdtdatahash" xmlns:w16se="http://schemas.microsoft.com/office/word/2015/wordml/symex" xmlns:wpg="http://schemas.microsoft.com/office/word/2010/wordprocessingGroup" xmlns:wpi="http://schemas.microsoft.com/office/word/2010/wordprocessingInk" xmlns:wne="http://schemas.microsoft.com/office/word/2006/wordml" xmlns:wps="http://schemas.microsoft.com/office/word/2010/wordprocessingShape" mc:Ignorable="w14 w15 w16se w16cid w16 w16cex w16sdtdh wp14">
+<w:endnotes xmlns:wpc="http://schemas.microsoft.com/office/word/2010/wordprocessingCanvas" xmlns:cx="http://schemas.microsoft.com/office/drawing/2014/chartex" xmlns:cx1="http://schemas.microsoft.com/office/drawing/2015/9/8/chartex" xmlns:cx2="http://schemas.microsoft.com/office/drawing/2015/10/21/chartex" xmlns:cx3="http://schemas.microsoft.com/office/drawing/2016/5/9/chartex" xmlns:cx4="http://schemas.microsoft.com/office/drawing/2016/5/10/chartex" xmlns:cx5="http://schemas.microsoft.com/office/drawing/2016/5/11/chartex" xmlns:cx6="http://schemas.microsoft.com/office/drawing/2016/5/12/chartex" xmlns:cx7="http://schemas.microsoft.com/office/drawing/2016/5/13/chartex" xmlns:cx8="http://schemas.microsoft.com/office/drawing/2016/5/14/chartex" xmlns:mc="http://schemas.openxmlformats.org/markup-compatibility/2006" xmlns:aink="http://schemas.microsoft.com/office/drawing/2016/ink" xmlns:am3d="http://schemas.microsoft.com/office/drawing/2017/model3d" xmlns:o="urn:schemas-microsoft-com:office:office" xmlns:oel="http://schemas.microsoft.com/office/2019/extlst" xmlns:r="http://schemas.openxmlformats.org/officeDocument/2006/relationships" xmlns:m="http://schemas.openxmlformats.org/officeDocument/2006/math" xmlns:v="urn:schemas-microsoft-com:vml" xmlns:wp14="http://schemas.microsoft.com/office/word/2010/wordprocessingDrawing" xmlns:wp="http://schemas.openxmlformats.org/drawingml/2006/wordprocessingDrawing" xmlns:w10="urn:schemas-microsoft-com:office:word" xmlns:w="http://schemas.openxmlformats.org/wordprocessingml/2006/main" xmlns:w14="http://schemas.microsoft.com/office/word/2010/wordml" xmlns:w15="http://schemas.microsoft.com/office/word/2012/wordml" xmlns:w16cex="http://schemas.microsoft.com/office/word/2018/wordml/cex" xmlns:w16cid="http://schemas.microsoft.com/office/word/2016/wordml/cid" xmlns:w16="http://schemas.microsoft.com/office/word/2018/wordml" xmlns:w16du="http://schemas.microsoft.com/office/word/2023/wordml/word16du" xmlns:w16sdtdh="http://schemas.microsoft.com/office/word/2020/wordml/sdtdatahash" xmlns:w16sdtfl="http://schemas.microsoft.com/office/word/2024/wordml/sdtformatlock" xmlns:w16se="http://schemas.microsoft.com/office/word/2015/wordml/symex" xmlns:wpg="http://schemas.microsoft.com/office/word/2010/wordprocessingGroup" xmlns:wpi="http://schemas.microsoft.com/office/word/2010/wordprocessingInk" xmlns:wne="http://schemas.microsoft.com/office/word/2006/wordml" xmlns:wps="http://schemas.microsoft.com/office/word/2010/wordprocessingShape" mc:Ignorable="w14 w15 w16se w16cid w16 w16cex w16sdtdh w16sdtfl w16du wp14">
   <w:endnote w:type="separator" w:id="-1">
     <w:p>
       <w:r>
@@ -15468,7 +16126,7 @@
 </file>
 
 <file path=word/footnotes.xml><?xml version="1.0" encoding="utf-8"?>
-<w:footnotes xmlns:wpc="http://schemas.microsoft.com/office/word/2010/wordprocessingCanvas" xmlns:cx="http://schemas.microsoft.com/office/drawing/2014/chartex" xmlns:cx1="http://schemas.microsoft.com/office/drawing/2015/9/8/chartex" xmlns:cx2="http://schemas.microsoft.com/office/drawing/2015/10/21/chartex" xmlns:cx3="http://schemas.microsoft.com/office/drawing/2016/5/9/chartex" xmlns:cx4="http://schemas.microsoft.com/office/drawing/2016/5/10/chartex" xmlns:cx5="http://schemas.microsoft.com/office/drawing/2016/5/11/chartex" xmlns:cx6="http://schemas.microsoft.com/office/drawing/2016/5/12/chartex" xmlns:cx7="http://schemas.microsoft.com/office/drawing/2016/5/13/chartex" xmlns:cx8="http://schemas.microsoft.com/office/drawing/2016/5/14/chartex" xmlns:mc="http://schemas.openxmlformats.org/markup-compatibility/2006" xmlns:aink="http://schemas.microsoft.com/office/drawing/2016/ink" xmlns:am3d="http://schemas.microsoft.com/office/drawing/2017/model3d" xmlns:o="urn:schemas-microsoft-com:office:office" xmlns:oel="http://schemas.microsoft.com/office/2019/extlst" xmlns:r="http://schemas.openxmlformats.org/officeDocument/2006/relationships" xmlns:m="http://schemas.openxmlformats.org/officeDocument/2006/math" xmlns:v="urn:schemas-microsoft-com:vml" xmlns:wp14="http://schemas.microsoft.com/office/word/2010/wordprocessingDrawing" xmlns:wp="http://schemas.openxmlformats.org/drawingml/2006/wordprocessingDrawing" xmlns:w10="urn:schemas-microsoft-com:office:word" xmlns:w="http://schemas.openxmlformats.org/wordprocessingml/2006/main" xmlns:w14="http://schemas.microsoft.com/office/word/2010/wordml" xmlns:w15="http://schemas.microsoft.com/office/word/2012/wordml" xmlns:w16cex="http://schemas.microsoft.com/office/word/2018/wordml/cex" xmlns:w16cid="http://schemas.microsoft.com/office/word/2016/wordml/cid" xmlns:w16="http://schemas.microsoft.com/office/word/2018/wordml" xmlns:w16du="http://schemas.microsoft.com/office/word/2023/wordml/word16du" xmlns:w16sdtdh="http://schemas.microsoft.com/office/word/2020/wordml/sdtdatahash" xmlns:w16se="http://schemas.microsoft.com/office/word/2015/wordml/symex" xmlns:wpg="http://schemas.microsoft.com/office/word/2010/wordprocessingGroup" xmlns:wpi="http://schemas.microsoft.com/office/word/2010/wordprocessingInk" xmlns:wne="http://schemas.microsoft.com/office/word/2006/wordml" xmlns:wps="http://schemas.microsoft.com/office/word/2010/wordprocessingShape" mc:Ignorable="w14 w15 w16se w16cid w16 w16cex w16sdtdh wp14">
+<w:footnotes xmlns:wpc="http://schemas.microsoft.com/office/word/2010/wordprocessingCanvas" xmlns:cx="http://schemas.microsoft.com/office/drawing/2014/chartex" xmlns:cx1="http://schemas.microsoft.com/office/drawing/2015/9/8/chartex" xmlns:cx2="http://schemas.microsoft.com/office/drawing/2015/10/21/chartex" xmlns:cx3="http://schemas.microsoft.com/office/drawing/2016/5/9/chartex" xmlns:cx4="http://schemas.microsoft.com/office/drawing/2016/5/10/chartex" xmlns:cx5="http://schemas.microsoft.com/office/drawing/2016/5/11/chartex" xmlns:cx6="http://schemas.microsoft.com/office/drawing/2016/5/12/chartex" xmlns:cx7="http://schemas.microsoft.com/office/drawing/2016/5/13/chartex" xmlns:cx8="http://schemas.microsoft.com/office/drawing/2016/5/14/chartex" xmlns:mc="http://schemas.openxmlformats.org/markup-compatibility/2006" xmlns:aink="http://schemas.microsoft.com/office/drawing/2016/ink" xmlns:am3d="http://schemas.microsoft.com/office/drawing/2017/model3d" xmlns:o="urn:schemas-microsoft-com:office:office" xmlns:oel="http://schemas.microsoft.com/office/2019/extlst" xmlns:r="http://schemas.openxmlformats.org/officeDocument/2006/relationships" xmlns:m="http://schemas.openxmlformats.org/officeDocument/2006/math" xmlns:v="urn:schemas-microsoft-com:vml" xmlns:wp14="http://schemas.microsoft.com/office/word/2010/wordprocessingDrawing" xmlns:wp="http://schemas.openxmlformats.org/drawingml/2006/wordprocessingDrawing" xmlns:w10="urn:schemas-microsoft-com:office:word" xmlns:w="http://schemas.openxmlformats.org/wordprocessingml/2006/main" xmlns:w14="http://schemas.microsoft.com/office/word/2010/wordml" xmlns:w15="http://schemas.microsoft.com/office/word/2012/wordml" xmlns:w16cex="http://schemas.microsoft.com/office/word/2018/wordml/cex" xmlns:w16cid="http://schemas.microsoft.com/office/word/2016/wordml/cid" xmlns:w16="http://schemas.microsoft.com/office/word/2018/wordml" xmlns:w16du="http://schemas.microsoft.com/office/word/2023/wordml/word16du" xmlns:w16sdtdh="http://schemas.microsoft.com/office/word/2020/wordml/sdtdatahash" xmlns:w16sdtfl="http://schemas.microsoft.com/office/word/2024/wordml/sdtformatlock" xmlns:w16se="http://schemas.microsoft.com/office/word/2015/wordml/symex" xmlns:wpg="http://schemas.microsoft.com/office/word/2010/wordprocessingGroup" xmlns:wpi="http://schemas.microsoft.com/office/word/2010/wordprocessingInk" xmlns:wne="http://schemas.microsoft.com/office/word/2006/wordml" xmlns:wps="http://schemas.microsoft.com/office/word/2010/wordprocessingShape" mc:Ignorable="w14 w15 w16se w16cid w16 w16cex w16sdtdh w16sdtfl w16du wp14">
   <w:footnote w:type="separator" w:id="-1">
     <w:p>
       <w:r>
@@ -15490,7 +16148,7 @@
 </file>
 
 <file path=word/header1.xml><?xml version="1.0" encoding="utf-8"?>
-<w:hdr xmlns:wpc="http://schemas.microsoft.com/office/word/2010/wordprocessingCanvas" xmlns:cx="http://schemas.microsoft.com/office/drawing/2014/chartex" xmlns:cx1="http://schemas.microsoft.com/office/drawing/2015/9/8/chartex" xmlns:cx2="http://schemas.microsoft.com/office/drawing/2015/10/21/chartex" xmlns:cx3="http://schemas.microsoft.com/office/drawing/2016/5/9/chartex" xmlns:cx4="http://schemas.microsoft.com/office/drawing/2016/5/10/chartex" xmlns:cx5="http://schemas.microsoft.com/office/drawing/2016/5/11/chartex" xmlns:cx6="http://schemas.microsoft.com/office/drawing/2016/5/12/chartex" xmlns:cx7="http://schemas.microsoft.com/office/drawing/2016/5/13/chartex" xmlns:cx8="http://schemas.microsoft.com/office/drawing/2016/5/14/chartex" xmlns:mc="http://schemas.openxmlformats.org/markup-compatibility/2006" xmlns:aink="http://schemas.microsoft.com/office/drawing/2016/ink" xmlns:am3d="http://schemas.microsoft.com/office/drawing/2017/model3d" xmlns:o="urn:schemas-microsoft-com:office:office" xmlns:oel="http://schemas.microsoft.com/office/2019/extlst" xmlns:r="http://schemas.openxmlformats.org/officeDocument/2006/relationships" xmlns:m="http://schemas.openxmlformats.org/officeDocument/2006/math" xmlns:v="urn:schemas-microsoft-com:vml" xmlns:wp14="http://schemas.microsoft.com/office/word/2010/wordprocessingDrawing" xmlns:wp="http://schemas.openxmlformats.org/drawingml/2006/wordprocessingDrawing" xmlns:w10="urn:schemas-microsoft-com:office:word" xmlns:w="http://schemas.openxmlformats.org/wordprocessingml/2006/main" xmlns:w14="http://schemas.microsoft.com/office/word/2010/wordml" xmlns:w15="http://schemas.microsoft.com/office/word/2012/wordml" xmlns:w16cex="http://schemas.microsoft.com/office/word/2018/wordml/cex" xmlns:w16cid="http://schemas.microsoft.com/office/word/2016/wordml/cid" xmlns:w16="http://schemas.microsoft.com/office/word/2018/wordml" xmlns:w16du="http://schemas.microsoft.com/office/word/2023/wordml/word16du" xmlns:w16sdtdh="http://schemas.microsoft.com/office/word/2020/wordml/sdtdatahash" xmlns:w16se="http://schemas.microsoft.com/office/word/2015/wordml/symex" xmlns:wpg="http://schemas.microsoft.com/office/word/2010/wordprocessingGroup" xmlns:wpi="http://schemas.microsoft.com/office/word/2010/wordprocessingInk" xmlns:wne="http://schemas.microsoft.com/office/word/2006/wordml" xmlns:wps="http://schemas.microsoft.com/office/word/2010/wordprocessingShape" mc:Ignorable="w14 w15 w16se w16cid w16 w16cex w16sdtdh wp14">
+<w:hdr xmlns:wpc="http://schemas.microsoft.com/office/word/2010/wordprocessingCanvas" xmlns:cx="http://schemas.microsoft.com/office/drawing/2014/chartex" xmlns:cx1="http://schemas.microsoft.com/office/drawing/2015/9/8/chartex" xmlns:cx2="http://schemas.microsoft.com/office/drawing/2015/10/21/chartex" xmlns:cx3="http://schemas.microsoft.com/office/drawing/2016/5/9/chartex" xmlns:cx4="http://schemas.microsoft.com/office/drawing/2016/5/10/chartex" xmlns:cx5="http://schemas.microsoft.com/office/drawing/2016/5/11/chartex" xmlns:cx6="http://schemas.microsoft.com/office/drawing/2016/5/12/chartex" xmlns:cx7="http://schemas.microsoft.com/office/drawing/2016/5/13/chartex" xmlns:cx8="http://schemas.microsoft.com/office/drawing/2016/5/14/chartex" xmlns:mc="http://schemas.openxmlformats.org/markup-compatibility/2006" xmlns:aink="http://schemas.microsoft.com/office/drawing/2016/ink" xmlns:am3d="http://schemas.microsoft.com/office/drawing/2017/model3d" xmlns:o="urn:schemas-microsoft-com:office:office" xmlns:oel="http://schemas.microsoft.com/office/2019/extlst" xmlns:r="http://schemas.openxmlformats.org/officeDocument/2006/relationships" xmlns:m="http://schemas.openxmlformats.org/officeDocument/2006/math" xmlns:v="urn:schemas-microsoft-com:vml" xmlns:wp14="http://schemas.microsoft.com/office/word/2010/wordprocessingDrawing" xmlns:wp="http://schemas.openxmlformats.org/drawingml/2006/wordprocessingDrawing" xmlns:w10="urn:schemas-microsoft-com:office:word" xmlns:w="http://schemas.openxmlformats.org/wordprocessingml/2006/main" xmlns:w14="http://schemas.microsoft.com/office/word/2010/wordml" xmlns:w15="http://schemas.microsoft.com/office/word/2012/wordml" xmlns:w16cex="http://schemas.microsoft.com/office/word/2018/wordml/cex" xmlns:w16cid="http://schemas.microsoft.com/office/word/2016/wordml/cid" xmlns:w16="http://schemas.microsoft.com/office/word/2018/wordml" xmlns:w16du="http://schemas.microsoft.com/office/word/2023/wordml/word16du" xmlns:w16sdtdh="http://schemas.microsoft.com/office/word/2020/wordml/sdtdatahash" xmlns:w16sdtfl="http://schemas.microsoft.com/office/word/2024/wordml/sdtformatlock" xmlns:w16se="http://schemas.microsoft.com/office/word/2015/wordml/symex" xmlns:wpg="http://schemas.microsoft.com/office/word/2010/wordprocessingGroup" xmlns:wpi="http://schemas.microsoft.com/office/word/2010/wordprocessingInk" xmlns:wne="http://schemas.microsoft.com/office/word/2006/wordml" xmlns:wps="http://schemas.microsoft.com/office/word/2010/wordprocessingShape" mc:Ignorable="w14 w15 w16se w16cid w16 w16cex w16sdtdh w16sdtfl w16du wp14">
   <w:p>
     <w:pPr>
       <w:pStyle w:val="Header"/>
@@ -15509,7 +16167,7 @@
 </file>
 
 <file path=word/header2.xml><?xml version="1.0" encoding="utf-8"?>
-<w:hdr xmlns:wpc="http://schemas.microsoft.com/office/word/2010/wordprocessingCanvas" xmlns:cx="http://schemas.microsoft.com/office/drawing/2014/chartex" xmlns:cx1="http://schemas.microsoft.com/office/drawing/2015/9/8/chartex" xmlns:cx2="http://schemas.microsoft.com/office/drawing/2015/10/21/chartex" xmlns:cx3="http://schemas.microsoft.com/office/drawing/2016/5/9/chartex" xmlns:cx4="http://schemas.microsoft.com/office/drawing/2016/5/10/chartex" xmlns:cx5="http://schemas.microsoft.com/office/drawing/2016/5/11/chartex" xmlns:cx6="http://schemas.microsoft.com/office/drawing/2016/5/12/chartex" xmlns:cx7="http://schemas.microsoft.com/office/drawing/2016/5/13/chartex" xmlns:cx8="http://schemas.microsoft.com/office/drawing/2016/5/14/chartex" xmlns:mc="http://schemas.openxmlformats.org/markup-compatibility/2006" xmlns:aink="http://schemas.microsoft.com/office/drawing/2016/ink" xmlns:am3d="http://schemas.microsoft.com/office/drawing/2017/model3d" xmlns:o="urn:schemas-microsoft-com:office:office" xmlns:oel="http://schemas.microsoft.com/office/2019/extlst" xmlns:r="http://schemas.openxmlformats.org/officeDocument/2006/relationships" xmlns:m="http://schemas.openxmlformats.org/officeDocument/2006/math" xmlns:v="urn:schemas-microsoft-com:vml" xmlns:wp14="http://schemas.microsoft.com/office/word/2010/wordprocessingDrawing" xmlns:wp="http://schemas.openxmlformats.org/drawingml/2006/wordprocessingDrawing" xmlns:w10="urn:schemas-microsoft-com:office:word" xmlns:w="http://schemas.openxmlformats.org/wordprocessingml/2006/main" xmlns:w14="http://schemas.microsoft.com/office/word/2010/wordml" xmlns:w15="http://schemas.microsoft.com/office/word/2012/wordml" xmlns:w16cex="http://schemas.microsoft.com/office/word/2018/wordml/cex" xmlns:w16cid="http://schemas.microsoft.com/office/word/2016/wordml/cid" xmlns:w16="http://schemas.microsoft.com/office/word/2018/wordml" xmlns:w16du="http://schemas.microsoft.com/office/word/2023/wordml/word16du" xmlns:w16sdtdh="http://schemas.microsoft.com/office/word/2020/wordml/sdtdatahash" xmlns:w16se="http://schemas.microsoft.com/office/word/2015/wordml/symex" xmlns:wpg="http://schemas.microsoft.com/office/word/2010/wordprocessingGroup" xmlns:wpi="http://schemas.microsoft.com/office/word/2010/wordprocessingInk" xmlns:wne="http://schemas.microsoft.com/office/word/2006/wordml" xmlns:wps="http://schemas.microsoft.com/office/word/2010/wordprocessingShape" mc:Ignorable="w14 w15 w16se w16cid w16 w16cex w16sdtdh wp14">
+<w:hdr xmlns:wpc="http://schemas.microsoft.com/office/word/2010/wordprocessingCanvas" xmlns:cx="http://schemas.microsoft.com/office/drawing/2014/chartex" xmlns:cx1="http://schemas.microsoft.com/office/drawing/2015/9/8/chartex" xmlns:cx2="http://schemas.microsoft.com/office/drawing/2015/10/21/chartex" xmlns:cx3="http://schemas.microsoft.com/office/drawing/2016/5/9/chartex" xmlns:cx4="http://schemas.microsoft.com/office/drawing/2016/5/10/chartex" xmlns:cx5="http://schemas.microsoft.com/office/drawing/2016/5/11/chartex" xmlns:cx6="http://schemas.microsoft.com/office/drawing/2016/5/12/chartex" xmlns:cx7="http://schemas.microsoft.com/office/drawing/2016/5/13/chartex" xmlns:cx8="http://schemas.microsoft.com/office/drawing/2016/5/14/chartex" xmlns:mc="http://schemas.openxmlformats.org/markup-compatibility/2006" xmlns:aink="http://schemas.microsoft.com/office/drawing/2016/ink" xmlns:am3d="http://schemas.microsoft.com/office/drawing/2017/model3d" xmlns:o="urn:schemas-microsoft-com:office:office" xmlns:oel="http://schemas.microsoft.com/office/2019/extlst" xmlns:r="http://schemas.openxmlformats.org/officeDocument/2006/relationships" xmlns:m="http://schemas.openxmlformats.org/officeDocument/2006/math" xmlns:v="urn:schemas-microsoft-com:vml" xmlns:wp14="http://schemas.microsoft.com/office/word/2010/wordprocessingDrawing" xmlns:wp="http://schemas.openxmlformats.org/drawingml/2006/wordprocessingDrawing" xmlns:w10="urn:schemas-microsoft-com:office:word" xmlns:w="http://schemas.openxmlformats.org/wordprocessingml/2006/main" xmlns:w14="http://schemas.microsoft.com/office/word/2010/wordml" xmlns:w15="http://schemas.microsoft.com/office/word/2012/wordml" xmlns:w16cex="http://schemas.microsoft.com/office/word/2018/wordml/cex" xmlns:w16cid="http://schemas.microsoft.com/office/word/2016/wordml/cid" xmlns:w16="http://schemas.microsoft.com/office/word/2018/wordml" xmlns:w16du="http://schemas.microsoft.com/office/word/2023/wordml/word16du" xmlns:w16sdtdh="http://schemas.microsoft.com/office/word/2020/wordml/sdtdatahash" xmlns:w16sdtfl="http://schemas.microsoft.com/office/word/2024/wordml/sdtformatlock" xmlns:w16se="http://schemas.microsoft.com/office/word/2015/wordml/symex" xmlns:wpg="http://schemas.microsoft.com/office/word/2010/wordprocessingGroup" xmlns:wpi="http://schemas.microsoft.com/office/word/2010/wordprocessingInk" xmlns:wne="http://schemas.microsoft.com/office/word/2006/wordml" xmlns:wps="http://schemas.microsoft.com/office/word/2010/wordprocessingShape" mc:Ignorable="w14 w15 w16se w16cid w16 w16cex w16sdtdh w16sdtfl w16du wp14">
   <w:sdt>
     <w:sdtPr>
       <w:id w:val="-1487547156"/>
@@ -15562,7 +16220,7 @@
 </file>
 
 <file path=word/header3.xml><?xml version="1.0" encoding="utf-8"?>
-<w:hdr xmlns:wpc="http://schemas.microsoft.com/office/word/2010/wordprocessingCanvas" xmlns:cx="http://schemas.microsoft.com/office/drawing/2014/chartex" xmlns:cx1="http://schemas.microsoft.com/office/drawing/2015/9/8/chartex" xmlns:cx2="http://schemas.microsoft.com/office/drawing/2015/10/21/chartex" xmlns:cx3="http://schemas.microsoft.com/office/drawing/2016/5/9/chartex" xmlns:cx4="http://schemas.microsoft.com/office/drawing/2016/5/10/chartex" xmlns:cx5="http://schemas.microsoft.com/office/drawing/2016/5/11/chartex" xmlns:cx6="http://schemas.microsoft.com/office/drawing/2016/5/12/chartex" xmlns:cx7="http://schemas.microsoft.com/office/drawing/2016/5/13/chartex" xmlns:cx8="http://schemas.microsoft.com/office/drawing/2016/5/14/chartex" xmlns:mc="http://schemas.openxmlformats.org/markup-compatibility/2006" xmlns:aink="http://schemas.microsoft.com/office/drawing/2016/ink" xmlns:am3d="http://schemas.microsoft.com/office/drawing/2017/model3d" xmlns:o="urn:schemas-microsoft-com:office:office" xmlns:oel="http://schemas.microsoft.com/office/2019/extlst" xmlns:r="http://schemas.openxmlformats.org/officeDocument/2006/relationships" xmlns:m="http://schemas.openxmlformats.org/officeDocument/2006/math" xmlns:v="urn:schemas-microsoft-com:vml" xmlns:wp14="http://schemas.microsoft.com/office/word/2010/wordprocessingDrawing" xmlns:wp="http://schemas.openxmlformats.org/drawingml/2006/wordprocessingDrawing" xmlns:w10="urn:schemas-microsoft-com:office:word" xmlns:w="http://schemas.openxmlformats.org/wordprocessingml/2006/main" xmlns:w14="http://schemas.microsoft.com/office/word/2010/wordml" xmlns:w15="http://schemas.microsoft.com/office/word/2012/wordml" xmlns:w16cex="http://schemas.microsoft.com/office/word/2018/wordml/cex" xmlns:w16cid="http://schemas.microsoft.com/office/word/2016/wordml/cid" xmlns:w16="http://schemas.microsoft.com/office/word/2018/wordml" xmlns:w16du="http://schemas.microsoft.com/office/word/2023/wordml/word16du" xmlns:w16sdtdh="http://schemas.microsoft.com/office/word/2020/wordml/sdtdatahash" xmlns:w16se="http://schemas.microsoft.com/office/word/2015/wordml/symex" xmlns:wpg="http://schemas.microsoft.com/office/word/2010/wordprocessingGroup" xmlns:wpi="http://schemas.microsoft.com/office/word/2010/wordprocessingInk" xmlns:wne="http://schemas.microsoft.com/office/word/2006/wordml" xmlns:wps="http://schemas.microsoft.com/office/word/2010/wordprocessingShape" mc:Ignorable="w14 w15 w16se w16cid w16 w16cex w16sdtdh wp14">
+<w:hdr xmlns:wpc="http://schemas.microsoft.com/office/word/2010/wordprocessingCanvas" xmlns:cx="http://schemas.microsoft.com/office/drawing/2014/chartex" xmlns:cx1="http://schemas.microsoft.com/office/drawing/2015/9/8/chartex" xmlns:cx2="http://schemas.microsoft.com/office/drawing/2015/10/21/chartex" xmlns:cx3="http://schemas.microsoft.com/office/drawing/2016/5/9/chartex" xmlns:cx4="http://schemas.microsoft.com/office/drawing/2016/5/10/chartex" xmlns:cx5="http://schemas.microsoft.com/office/drawing/2016/5/11/chartex" xmlns:cx6="http://schemas.microsoft.com/office/drawing/2016/5/12/chartex" xmlns:cx7="http://schemas.microsoft.com/office/drawing/2016/5/13/chartex" xmlns:cx8="http://schemas.microsoft.com/office/drawing/2016/5/14/chartex" xmlns:mc="http://schemas.openxmlformats.org/markup-compatibility/2006" xmlns:aink="http://schemas.microsoft.com/office/drawing/2016/ink" xmlns:am3d="http://schemas.microsoft.com/office/drawing/2017/model3d" xmlns:o="urn:schemas-microsoft-com:office:office" xmlns:oel="http://schemas.microsoft.com/office/2019/extlst" xmlns:r="http://schemas.openxmlformats.org/officeDocument/2006/relationships" xmlns:m="http://schemas.openxmlformats.org/officeDocument/2006/math" xmlns:v="urn:schemas-microsoft-com:vml" xmlns:wp14="http://schemas.microsoft.com/office/word/2010/wordprocessingDrawing" xmlns:wp="http://schemas.openxmlformats.org/drawingml/2006/wordprocessingDrawing" xmlns:w10="urn:schemas-microsoft-com:office:word" xmlns:w="http://schemas.openxmlformats.org/wordprocessingml/2006/main" xmlns:w14="http://schemas.microsoft.com/office/word/2010/wordml" xmlns:w15="http://schemas.microsoft.com/office/word/2012/wordml" xmlns:w16cex="http://schemas.microsoft.com/office/word/2018/wordml/cex" xmlns:w16cid="http://schemas.microsoft.com/office/word/2016/wordml/cid" xmlns:w16="http://schemas.microsoft.com/office/word/2018/wordml" xmlns:w16du="http://schemas.microsoft.com/office/word/2023/wordml/word16du" xmlns:w16sdtdh="http://schemas.microsoft.com/office/word/2020/wordml/sdtdatahash" xmlns:w16sdtfl="http://schemas.microsoft.com/office/word/2024/wordml/sdtformatlock" xmlns:w16se="http://schemas.microsoft.com/office/word/2015/wordml/symex" xmlns:wpg="http://schemas.microsoft.com/office/word/2010/wordprocessingGroup" xmlns:wpi="http://schemas.microsoft.com/office/word/2010/wordprocessingInk" xmlns:wne="http://schemas.microsoft.com/office/word/2006/wordml" xmlns:wps="http://schemas.microsoft.com/office/word/2010/wordprocessingShape" mc:Ignorable="w14 w15 w16se w16cid w16 w16cex w16sdtdh w16sdtfl w16du wp14">
   <w:sdt>
     <w:sdtPr>
       <w:id w:val="-2026468923"/>
@@ -15630,7 +16288,7 @@
 </file>
 
 <file path=word/numbering.xml><?xml version="1.0" encoding="utf-8"?>
-<w:numbering xmlns:wpc="http://schemas.microsoft.com/office/word/2010/wordprocessingCanvas" xmlns:cx="http://schemas.microsoft.com/office/drawing/2014/chartex" xmlns:cx1="http://schemas.microsoft.com/office/drawing/2015/9/8/chartex" xmlns:cx2="http://schemas.microsoft.com/office/drawing/2015/10/21/chartex" xmlns:cx3="http://schemas.microsoft.com/office/drawing/2016/5/9/chartex" xmlns:cx4="http://schemas.microsoft.com/office/drawing/2016/5/10/chartex" xmlns:cx5="http://schemas.microsoft.com/office/drawing/2016/5/11/chartex" xmlns:cx6="http://schemas.microsoft.com/office/drawing/2016/5/12/chartex" xmlns:cx7="http://schemas.microsoft.com/office/drawing/2016/5/13/chartex" xmlns:cx8="http://schemas.microsoft.com/office/drawing/2016/5/14/chartex" xmlns:mc="http://schemas.openxmlformats.org/markup-compatibility/2006" xmlns:aink="http://schemas.microsoft.com/office/drawing/2016/ink" xmlns:am3d="http://schemas.microsoft.com/office/drawing/2017/model3d" xmlns:o="urn:schemas-microsoft-com:office:office" xmlns:oel="http://schemas.microsoft.com/office/2019/extlst" xmlns:r="http://schemas.openxmlformats.org/officeDocument/2006/relationships" xmlns:m="http://schemas.openxmlformats.org/officeDocument/2006/math" xmlns:v="urn:schemas-microsoft-com:vml" xmlns:wp14="http://schemas.microsoft.com/office/word/2010/wordprocessingDrawing" xmlns:wp="http://schemas.openxmlformats.org/drawingml/2006/wordprocessingDrawing" xmlns:w10="urn:schemas-microsoft-com:office:word" xmlns:w="http://schemas.openxmlformats.org/wordprocessingml/2006/main" xmlns:w14="http://schemas.microsoft.com/office/word/2010/wordml" xmlns:w15="http://schemas.microsoft.com/office/word/2012/wordml" xmlns:w16cex="http://schemas.microsoft.com/office/word/2018/wordml/cex" xmlns:w16cid="http://schemas.microsoft.com/office/word/2016/wordml/cid" xmlns:w16="http://schemas.microsoft.com/office/word/2018/wordml" xmlns:w16du="http://schemas.microsoft.com/office/word/2023/wordml/word16du" xmlns:w16sdtdh="http://schemas.microsoft.com/office/word/2020/wordml/sdtdatahash" xmlns:w16se="http://schemas.microsoft.com/office/word/2015/wordml/symex" xmlns:wpg="http://schemas.microsoft.com/office/word/2010/wordprocessingGroup" xmlns:wpi="http://schemas.microsoft.com/office/word/2010/wordprocessingInk" xmlns:wne="http://schemas.microsoft.com/office/word/2006/wordml" xmlns:wps="http://schemas.microsoft.com/office/word/2010/wordprocessingShape" mc:Ignorable="w14 w15 w16se w16cid w16 w16cex w16sdtdh wp14">
+<w:numbering xmlns:wpc="http://schemas.microsoft.com/office/word/2010/wordprocessingCanvas" xmlns:cx="http://schemas.microsoft.com/office/drawing/2014/chartex" xmlns:cx1="http://schemas.microsoft.com/office/drawing/2015/9/8/chartex" xmlns:cx2="http://schemas.microsoft.com/office/drawing/2015/10/21/chartex" xmlns:cx3="http://schemas.microsoft.com/office/drawing/2016/5/9/chartex" xmlns:cx4="http://schemas.microsoft.com/office/drawing/2016/5/10/chartex" xmlns:cx5="http://schemas.microsoft.com/office/drawing/2016/5/11/chartex" xmlns:cx6="http://schemas.microsoft.com/office/drawing/2016/5/12/chartex" xmlns:cx7="http://schemas.microsoft.com/office/drawing/2016/5/13/chartex" xmlns:cx8="http://schemas.microsoft.com/office/drawing/2016/5/14/chartex" xmlns:mc="http://schemas.openxmlformats.org/markup-compatibility/2006" xmlns:aink="http://schemas.microsoft.com/office/drawing/2016/ink" xmlns:am3d="http://schemas.microsoft.com/office/drawing/2017/model3d" xmlns:o="urn:schemas-microsoft-com:office:office" xmlns:oel="http://schemas.microsoft.com/office/2019/extlst" xmlns:r="http://schemas.openxmlformats.org/officeDocument/2006/relationships" xmlns:m="http://schemas.openxmlformats.org/officeDocument/2006/math" xmlns:v="urn:schemas-microsoft-com:vml" xmlns:wp14="http://schemas.microsoft.com/office/word/2010/wordprocessingDrawing" xmlns:wp="http://schemas.openxmlformats.org/drawingml/2006/wordprocessingDrawing" xmlns:w10="urn:schemas-microsoft-com:office:word" xmlns:w="http://schemas.openxmlformats.org/wordprocessingml/2006/main" xmlns:w14="http://schemas.microsoft.com/office/word/2010/wordml" xmlns:w15="http://schemas.microsoft.com/office/word/2012/wordml" xmlns:w16cex="http://schemas.microsoft.com/office/word/2018/wordml/cex" xmlns:w16cid="http://schemas.microsoft.com/office/word/2016/wordml/cid" xmlns:w16="http://schemas.microsoft.com/office/word/2018/wordml" xmlns:w16du="http://schemas.microsoft.com/office/word/2023/wordml/word16du" xmlns:w16sdtdh="http://schemas.microsoft.com/office/word/2020/wordml/sdtdatahash" xmlns:w16sdtfl="http://schemas.microsoft.com/office/word/2024/wordml/sdtformatlock" xmlns:w16se="http://schemas.microsoft.com/office/word/2015/wordml/symex" xmlns:wpg="http://schemas.microsoft.com/office/word/2010/wordprocessingGroup" xmlns:wpi="http://schemas.microsoft.com/office/word/2010/wordprocessingInk" xmlns:wne="http://schemas.microsoft.com/office/word/2006/wordml" xmlns:wps="http://schemas.microsoft.com/office/word/2010/wordprocessingShape" mc:Ignorable="w14 w15 w16se w16cid w16 w16cex w16sdtdh w16sdtfl w16du wp14">
   <w:abstractNum w:abstractNumId="0" w15:restartNumberingAfterBreak="0">
     <w:nsid w:val="11412B58"/>
     <w:multiLevelType w:val="hybridMultilevel"/>
@@ -15991,6 +16649,155 @@
     </w:lvl>
   </w:abstractNum>
   <w:abstractNum w:abstractNumId="3" w15:restartNumberingAfterBreak="0">
+    <w:nsid w:val="285B56B6"/>
+    <w:multiLevelType w:val="multilevel"/>
+    <w:tmpl w:val="BDE23AE6"/>
+    <w:lvl w:ilvl="0">
+      <w:start w:val="1"/>
+      <w:numFmt w:val="bullet"/>
+      <w:lvlText w:val=""/>
+      <w:lvlJc w:val="left"/>
+      <w:pPr>
+        <w:tabs>
+          <w:tab w:val="num" w:pos="720"/>
+        </w:tabs>
+        <w:ind w:left="720" w:hanging="360"/>
+      </w:pPr>
+      <w:rPr>
+        <w:rFonts w:ascii="Symbol" w:hAnsi="Symbol" w:hint="default"/>
+        <w:sz w:val="20"/>
+      </w:rPr>
+    </w:lvl>
+    <w:lvl w:ilvl="1" w:tentative="1">
+      <w:start w:val="1"/>
+      <w:numFmt w:val="bullet"/>
+      <w:lvlText w:val="o"/>
+      <w:lvlJc w:val="left"/>
+      <w:pPr>
+        <w:tabs>
+          <w:tab w:val="num" w:pos="1440"/>
+        </w:tabs>
+        <w:ind w:left="1440" w:hanging="360"/>
+      </w:pPr>
+      <w:rPr>
+        <w:rFonts w:ascii="Courier New" w:hAnsi="Courier New" w:hint="default"/>
+        <w:sz w:val="20"/>
+      </w:rPr>
+    </w:lvl>
+    <w:lvl w:ilvl="2" w:tentative="1">
+      <w:start w:val="1"/>
+      <w:numFmt w:val="bullet"/>
+      <w:lvlText w:val=""/>
+      <w:lvlJc w:val="left"/>
+      <w:pPr>
+        <w:tabs>
+          <w:tab w:val="num" w:pos="2160"/>
+        </w:tabs>
+        <w:ind w:left="2160" w:hanging="360"/>
+      </w:pPr>
+      <w:rPr>
+        <w:rFonts w:ascii="Wingdings" w:hAnsi="Wingdings" w:hint="default"/>
+        <w:sz w:val="20"/>
+      </w:rPr>
+    </w:lvl>
+    <w:lvl w:ilvl="3" w:tentative="1">
+      <w:start w:val="1"/>
+      <w:numFmt w:val="bullet"/>
+      <w:lvlText w:val=""/>
+      <w:lvlJc w:val="left"/>
+      <w:pPr>
+        <w:tabs>
+          <w:tab w:val="num" w:pos="2880"/>
+        </w:tabs>
+        <w:ind w:left="2880" w:hanging="360"/>
+      </w:pPr>
+      <w:rPr>
+        <w:rFonts w:ascii="Wingdings" w:hAnsi="Wingdings" w:hint="default"/>
+        <w:sz w:val="20"/>
+      </w:rPr>
+    </w:lvl>
+    <w:lvl w:ilvl="4" w:tentative="1">
+      <w:start w:val="1"/>
+      <w:numFmt w:val="bullet"/>
+      <w:lvlText w:val=""/>
+      <w:lvlJc w:val="left"/>
+      <w:pPr>
+        <w:tabs>
+          <w:tab w:val="num" w:pos="3600"/>
+        </w:tabs>
+        <w:ind w:left="3600" w:hanging="360"/>
+      </w:pPr>
+      <w:rPr>
+        <w:rFonts w:ascii="Wingdings" w:hAnsi="Wingdings" w:hint="default"/>
+        <w:sz w:val="20"/>
+      </w:rPr>
+    </w:lvl>
+    <w:lvl w:ilvl="5" w:tentative="1">
+      <w:start w:val="1"/>
+      <w:numFmt w:val="bullet"/>
+      <w:lvlText w:val=""/>
+      <w:lvlJc w:val="left"/>
+      <w:pPr>
+        <w:tabs>
+          <w:tab w:val="num" w:pos="4320"/>
+        </w:tabs>
+        <w:ind w:left="4320" w:hanging="360"/>
+      </w:pPr>
+      <w:rPr>
+        <w:rFonts w:ascii="Wingdings" w:hAnsi="Wingdings" w:hint="default"/>
+        <w:sz w:val="20"/>
+      </w:rPr>
+    </w:lvl>
+    <w:lvl w:ilvl="6" w:tentative="1">
+      <w:start w:val="1"/>
+      <w:numFmt w:val="bullet"/>
+      <w:lvlText w:val=""/>
+      <w:lvlJc w:val="left"/>
+      <w:pPr>
+        <w:tabs>
+          <w:tab w:val="num" w:pos="5040"/>
+        </w:tabs>
+        <w:ind w:left="5040" w:hanging="360"/>
+      </w:pPr>
+      <w:rPr>
+        <w:rFonts w:ascii="Wingdings" w:hAnsi="Wingdings" w:hint="default"/>
+        <w:sz w:val="20"/>
+      </w:rPr>
+    </w:lvl>
+    <w:lvl w:ilvl="7" w:tentative="1">
+      <w:start w:val="1"/>
+      <w:numFmt w:val="bullet"/>
+      <w:lvlText w:val=""/>
+      <w:lvlJc w:val="left"/>
+      <w:pPr>
+        <w:tabs>
+          <w:tab w:val="num" w:pos="5760"/>
+        </w:tabs>
+        <w:ind w:left="5760" w:hanging="360"/>
+      </w:pPr>
+      <w:rPr>
+        <w:rFonts w:ascii="Wingdings" w:hAnsi="Wingdings" w:hint="default"/>
+        <w:sz w:val="20"/>
+      </w:rPr>
+    </w:lvl>
+    <w:lvl w:ilvl="8" w:tentative="1">
+      <w:start w:val="1"/>
+      <w:numFmt w:val="bullet"/>
+      <w:lvlText w:val=""/>
+      <w:lvlJc w:val="left"/>
+      <w:pPr>
+        <w:tabs>
+          <w:tab w:val="num" w:pos="6480"/>
+        </w:tabs>
+        <w:ind w:left="6480" w:hanging="360"/>
+      </w:pPr>
+      <w:rPr>
+        <w:rFonts w:ascii="Wingdings" w:hAnsi="Wingdings" w:hint="default"/>
+        <w:sz w:val="20"/>
+      </w:rPr>
+    </w:lvl>
+  </w:abstractNum>
+  <w:abstractNum w:abstractNumId="4" w15:restartNumberingAfterBreak="0">
     <w:nsid w:val="43A30089"/>
     <w:multiLevelType w:val="hybridMultilevel"/>
     <w:tmpl w:val="B560DC14"/>
@@ -16086,6 +16893,9 @@
     <w:abstractNumId w:val="2"/>
   </w:num>
   <w:num w:numId="4" w16cid:durableId="2135175793">
+    <w:abstractNumId w:val="4"/>
+  </w:num>
+  <w:num w:numId="5" w16cid:durableId="2048984577">
     <w:abstractNumId w:val="3"/>
   </w:num>
   <w:numIdMacAtCleanup w:val="4"/>
@@ -16093,7 +16903,7 @@
 </file>
 
 <file path=word/styles.xml><?xml version="1.0" encoding="utf-8"?>
-<w:styles xmlns:mc="http://schemas.openxmlformats.org/markup-compatibility/2006" xmlns:r="http://schemas.openxmlformats.org/officeDocument/2006/relationships" xmlns:w="http://schemas.openxmlformats.org/wordprocessingml/2006/main" xmlns:w14="http://schemas.microsoft.com/office/word/2010/wordml" xmlns:w15="http://schemas.microsoft.com/office/word/2012/wordml" xmlns:w16cex="http://schemas.microsoft.com/office/word/2018/wordml/cex" xmlns:w16cid="http://schemas.microsoft.com/office/word/2016/wordml/cid" xmlns:w16="http://schemas.microsoft.com/office/word/2018/wordml" xmlns:w16sdtdh="http://schemas.microsoft.com/office/word/2020/wordml/sdtdatahash" xmlns:w16se="http://schemas.microsoft.com/office/word/2015/wordml/symex" mc:Ignorable="w14 w15 w16se w16cid w16 w16cex w16sdtdh">
+<w:styles xmlns:mc="http://schemas.openxmlformats.org/markup-compatibility/2006" xmlns:r="http://schemas.openxmlformats.org/officeDocument/2006/relationships" xmlns:w="http://schemas.openxmlformats.org/wordprocessingml/2006/main" xmlns:w14="http://schemas.microsoft.com/office/word/2010/wordml" xmlns:w15="http://schemas.microsoft.com/office/word/2012/wordml" xmlns:w16cex="http://schemas.microsoft.com/office/word/2018/wordml/cex" xmlns:w16cid="http://schemas.microsoft.com/office/word/2016/wordml/cid" xmlns:w16="http://schemas.microsoft.com/office/word/2018/wordml" xmlns:w16du="http://schemas.microsoft.com/office/word/2023/wordml/word16du" xmlns:w16sdtdh="http://schemas.microsoft.com/office/word/2020/wordml/sdtdatahash" xmlns:w16sdtfl="http://schemas.microsoft.com/office/word/2024/wordml/sdtformatlock" xmlns:w16se="http://schemas.microsoft.com/office/word/2015/wordml/symex" mc:Ignorable="w14 w15 w16se w16cid w16 w16cex w16sdtdh w16sdtfl w16du">
   <w:docDefaults>
     <w:rPrDefault>
       <w:rPr>
@@ -16724,7 +17534,6 @@
   <w:style w:type="character" w:default="1" w:styleId="DefaultParagraphFont">
     <w:name w:val="Default Paragraph Font"/>
     <w:uiPriority w:val="1"/>
-    <w:semiHidden/>
     <w:unhideWhenUsed/>
   </w:style>
   <w:style w:type="table" w:default="1" w:styleId="TableNormal">

</xml_diff>